<commit_message>
Review fixes: include 1% reduction column in Table 1, fail on missing submission files, serialize make targets
Co-Authored-By: Tatsuki Onishi <bougtoir@gmail.com>
</commit_message>
<xml_diff>
--- a/manuscript/manuscript.docx
+++ b/manuscript/manuscript.docx
@@ -158,17 +158,18 @@
         <w:tblLook w:firstColumn="1" w:firstRow="1" w:lastColumn="0" w:lastRow="0" w:noHBand="0" w:noVBand="1" w:val="04A0"/>
       </w:tblPr>
       <w:tblGrid>
-        <w:gridCol w:w="1440"/>
-        <w:gridCol w:w="1440"/>
-        <w:gridCol w:w="1440"/>
-        <w:gridCol w:w="1440"/>
-        <w:gridCol w:w="1440"/>
-        <w:gridCol w:w="1440"/>
+        <w:gridCol w:w="1234"/>
+        <w:gridCol w:w="1234"/>
+        <w:gridCol w:w="1234"/>
+        <w:gridCol w:w="1234"/>
+        <w:gridCol w:w="1234"/>
+        <w:gridCol w:w="1234"/>
+        <w:gridCol w:w="1234"/>
       </w:tblGrid>
       <w:tr>
         <w:tc>
           <w:tcPr>
-            <w:tcW w:type="dxa" w:w="1440"/>
+            <w:tcW w:type="dxa" w:w="1234"/>
           </w:tcPr>
           <w:p>
             <w:r>
@@ -182,7 +183,7 @@
         </w:tc>
         <w:tc>
           <w:tcPr>
-            <w:tcW w:type="dxa" w:w="1440"/>
+            <w:tcW w:type="dxa" w:w="1234"/>
           </w:tcPr>
           <w:p>
             <w:r>
@@ -196,7 +197,7 @@
         </w:tc>
         <w:tc>
           <w:tcPr>
-            <w:tcW w:type="dxa" w:w="1440"/>
+            <w:tcW w:type="dxa" w:w="1234"/>
           </w:tcPr>
           <w:p>
             <w:r>
@@ -210,7 +211,7 @@
         </w:tc>
         <w:tc>
           <w:tcPr>
-            <w:tcW w:type="dxa" w:w="1440"/>
+            <w:tcW w:type="dxa" w:w="1234"/>
           </w:tcPr>
           <w:p>
             <w:r>
@@ -218,13 +219,27 @@
                 <w:b/>
                 <w:sz w:val="14"/>
               </w:rPr>
+              <w:t>mult_for_1pct_reduction</w:t>
+            </w:r>
+          </w:p>
+        </w:tc>
+        <w:tc>
+          <w:tcPr>
+            <w:tcW w:type="dxa" w:w="1234"/>
+          </w:tcPr>
+          <w:p>
+            <w:r>
+              <w:rPr>
+                <w:b/>
+                <w:sz w:val="14"/>
+              </w:rPr>
               <w:t>mult_for_10pct_reduction</w:t>
             </w:r>
           </w:p>
         </w:tc>
         <w:tc>
           <w:tcPr>
-            <w:tcW w:type="dxa" w:w="1440"/>
+            <w:tcW w:type="dxa" w:w="1234"/>
           </w:tcPr>
           <w:p>
             <w:r>
@@ -238,7 +253,7 @@
         </w:tc>
         <w:tc>
           <w:tcPr>
-            <w:tcW w:type="dxa" w:w="1440"/>
+            <w:tcW w:type="dxa" w:w="1234"/>
           </w:tcPr>
           <w:p>
             <w:r>
@@ -254,7 +269,7 @@
       <w:tr>
         <w:tc>
           <w:tcPr>
-            <w:tcW w:type="dxa" w:w="1440"/>
+            <w:tcW w:type="dxa" w:w="1234"/>
           </w:tcPr>
           <w:p>
             <w:r>
@@ -267,7 +282,7 @@
         </w:tc>
         <w:tc>
           <w:tcPr>
-            <w:tcW w:type="dxa" w:w="1440"/>
+            <w:tcW w:type="dxa" w:w="1234"/>
           </w:tcPr>
           <w:p>
             <w:r>
@@ -280,7 +295,7 @@
         </w:tc>
         <w:tc>
           <w:tcPr>
-            <w:tcW w:type="dxa" w:w="1440"/>
+            <w:tcW w:type="dxa" w:w="1234"/>
           </w:tcPr>
           <w:p>
             <w:r>
@@ -293,7 +308,20 @@
         </w:tc>
         <w:tc>
           <w:tcPr>
-            <w:tcW w:type="dxa" w:w="1440"/>
+            <w:tcW w:type="dxa" w:w="1234"/>
+          </w:tcPr>
+          <w:p>
+            <w:r>
+              <w:rPr>
+                <w:sz w:val="14"/>
+              </w:rPr>
+              <w:t>1.1</w:t>
+            </w:r>
+          </w:p>
+        </w:tc>
+        <w:tc>
+          <w:tcPr>
+            <w:tcW w:type="dxa" w:w="1234"/>
           </w:tcPr>
           <w:p>
             <w:r>
@@ -306,7 +334,7 @@
         </w:tc>
         <w:tc>
           <w:tcPr>
-            <w:tcW w:type="dxa" w:w="1440"/>
+            <w:tcW w:type="dxa" w:w="1234"/>
           </w:tcPr>
           <w:p>
             <w:r>
@@ -319,7 +347,7 @@
         </w:tc>
         <w:tc>
           <w:tcPr>
-            <w:tcW w:type="dxa" w:w="1440"/>
+            <w:tcW w:type="dxa" w:w="1234"/>
           </w:tcPr>
           <w:p>
             <w:r>
@@ -334,7 +362,7 @@
       <w:tr>
         <w:tc>
           <w:tcPr>
-            <w:tcW w:type="dxa" w:w="1440"/>
+            <w:tcW w:type="dxa" w:w="1234"/>
           </w:tcPr>
           <w:p>
             <w:r>
@@ -347,7 +375,7 @@
         </w:tc>
         <w:tc>
           <w:tcPr>
-            <w:tcW w:type="dxa" w:w="1440"/>
+            <w:tcW w:type="dxa" w:w="1234"/>
           </w:tcPr>
           <w:p>
             <w:r>
@@ -360,7 +388,7 @@
         </w:tc>
         <w:tc>
           <w:tcPr>
-            <w:tcW w:type="dxa" w:w="1440"/>
+            <w:tcW w:type="dxa" w:w="1234"/>
           </w:tcPr>
           <w:p>
             <w:r>
@@ -373,7 +401,20 @@
         </w:tc>
         <w:tc>
           <w:tcPr>
-            <w:tcW w:type="dxa" w:w="1440"/>
+            <w:tcW w:type="dxa" w:w="1234"/>
+          </w:tcPr>
+          <w:p>
+            <w:r>
+              <w:rPr>
+                <w:sz w:val="14"/>
+              </w:rPr>
+              <w:t>1.1</w:t>
+            </w:r>
+          </w:p>
+        </w:tc>
+        <w:tc>
+          <w:tcPr>
+            <w:tcW w:type="dxa" w:w="1234"/>
           </w:tcPr>
           <w:p>
             <w:r>
@@ -386,7 +427,7 @@
         </w:tc>
         <w:tc>
           <w:tcPr>
-            <w:tcW w:type="dxa" w:w="1440"/>
+            <w:tcW w:type="dxa" w:w="1234"/>
           </w:tcPr>
           <w:p>
             <w:r>
@@ -399,7 +440,7 @@
         </w:tc>
         <w:tc>
           <w:tcPr>
-            <w:tcW w:type="dxa" w:w="1440"/>
+            <w:tcW w:type="dxa" w:w="1234"/>
           </w:tcPr>
           <w:p>
             <w:r>
@@ -414,7 +455,7 @@
       <w:tr>
         <w:tc>
           <w:tcPr>
-            <w:tcW w:type="dxa" w:w="1440"/>
+            <w:tcW w:type="dxa" w:w="1234"/>
           </w:tcPr>
           <w:p>
             <w:r>
@@ -427,7 +468,7 @@
         </w:tc>
         <w:tc>
           <w:tcPr>
-            <w:tcW w:type="dxa" w:w="1440"/>
+            <w:tcW w:type="dxa" w:w="1234"/>
           </w:tcPr>
           <w:p>
             <w:r>
@@ -440,7 +481,7 @@
         </w:tc>
         <w:tc>
           <w:tcPr>
-            <w:tcW w:type="dxa" w:w="1440"/>
+            <w:tcW w:type="dxa" w:w="1234"/>
           </w:tcPr>
           <w:p>
             <w:r>
@@ -453,7 +494,20 @@
         </w:tc>
         <w:tc>
           <w:tcPr>
-            <w:tcW w:type="dxa" w:w="1440"/>
+            <w:tcW w:type="dxa" w:w="1234"/>
+          </w:tcPr>
+          <w:p>
+            <w:r>
+              <w:rPr>
+                <w:sz w:val="14"/>
+              </w:rPr>
+              <w:t>1.1</w:t>
+            </w:r>
+          </w:p>
+        </w:tc>
+        <w:tc>
+          <w:tcPr>
+            <w:tcW w:type="dxa" w:w="1234"/>
           </w:tcPr>
           <w:p>
             <w:r>
@@ -466,7 +520,7 @@
         </w:tc>
         <w:tc>
           <w:tcPr>
-            <w:tcW w:type="dxa" w:w="1440"/>
+            <w:tcW w:type="dxa" w:w="1234"/>
           </w:tcPr>
           <w:p>
             <w:r>
@@ -479,7 +533,7 @@
         </w:tc>
         <w:tc>
           <w:tcPr>
-            <w:tcW w:type="dxa" w:w="1440"/>
+            <w:tcW w:type="dxa" w:w="1234"/>
           </w:tcPr>
           <w:p>
             <w:r>
@@ -494,7 +548,7 @@
       <w:tr>
         <w:tc>
           <w:tcPr>
-            <w:tcW w:type="dxa" w:w="1440"/>
+            <w:tcW w:type="dxa" w:w="1234"/>
           </w:tcPr>
           <w:p>
             <w:r>
@@ -507,7 +561,7 @@
         </w:tc>
         <w:tc>
           <w:tcPr>
-            <w:tcW w:type="dxa" w:w="1440"/>
+            <w:tcW w:type="dxa" w:w="1234"/>
           </w:tcPr>
           <w:p>
             <w:r>
@@ -520,7 +574,7 @@
         </w:tc>
         <w:tc>
           <w:tcPr>
-            <w:tcW w:type="dxa" w:w="1440"/>
+            <w:tcW w:type="dxa" w:w="1234"/>
           </w:tcPr>
           <w:p>
             <w:r>
@@ -533,7 +587,20 @@
         </w:tc>
         <w:tc>
           <w:tcPr>
-            <w:tcW w:type="dxa" w:w="1440"/>
+            <w:tcW w:type="dxa" w:w="1234"/>
+          </w:tcPr>
+          <w:p>
+            <w:r>
+              <w:rPr>
+                <w:sz w:val="14"/>
+              </w:rPr>
+              <w:t>1.1</w:t>
+            </w:r>
+          </w:p>
+        </w:tc>
+        <w:tc>
+          <w:tcPr>
+            <w:tcW w:type="dxa" w:w="1234"/>
           </w:tcPr>
           <w:p>
             <w:r>
@@ -546,7 +613,7 @@
         </w:tc>
         <w:tc>
           <w:tcPr>
-            <w:tcW w:type="dxa" w:w="1440"/>
+            <w:tcW w:type="dxa" w:w="1234"/>
           </w:tcPr>
           <w:p>
             <w:r>
@@ -559,7 +626,7 @@
         </w:tc>
         <w:tc>
           <w:tcPr>
-            <w:tcW w:type="dxa" w:w="1440"/>
+            <w:tcW w:type="dxa" w:w="1234"/>
           </w:tcPr>
           <w:p>
             <w:r>
@@ -574,7 +641,7 @@
       <w:tr>
         <w:tc>
           <w:tcPr>
-            <w:tcW w:type="dxa" w:w="1440"/>
+            <w:tcW w:type="dxa" w:w="1234"/>
           </w:tcPr>
           <w:p>
             <w:r>
@@ -587,7 +654,7 @@
         </w:tc>
         <w:tc>
           <w:tcPr>
-            <w:tcW w:type="dxa" w:w="1440"/>
+            <w:tcW w:type="dxa" w:w="1234"/>
           </w:tcPr>
           <w:p>
             <w:r>
@@ -600,7 +667,7 @@
         </w:tc>
         <w:tc>
           <w:tcPr>
-            <w:tcW w:type="dxa" w:w="1440"/>
+            <w:tcW w:type="dxa" w:w="1234"/>
           </w:tcPr>
           <w:p>
             <w:r>
@@ -613,7 +680,20 @@
         </w:tc>
         <w:tc>
           <w:tcPr>
-            <w:tcW w:type="dxa" w:w="1440"/>
+            <w:tcW w:type="dxa" w:w="1234"/>
+          </w:tcPr>
+          <w:p>
+            <w:r>
+              <w:rPr>
+                <w:sz w:val="14"/>
+              </w:rPr>
+              <w:t>1.1</w:t>
+            </w:r>
+          </w:p>
+        </w:tc>
+        <w:tc>
+          <w:tcPr>
+            <w:tcW w:type="dxa" w:w="1234"/>
           </w:tcPr>
           <w:p>
             <w:r>
@@ -626,7 +706,7 @@
         </w:tc>
         <w:tc>
           <w:tcPr>
-            <w:tcW w:type="dxa" w:w="1440"/>
+            <w:tcW w:type="dxa" w:w="1234"/>
           </w:tcPr>
           <w:p>
             <w:r>
@@ -639,7 +719,7 @@
         </w:tc>
         <w:tc>
           <w:tcPr>
-            <w:tcW w:type="dxa" w:w="1440"/>
+            <w:tcW w:type="dxa" w:w="1234"/>
           </w:tcPr>
           <w:p>
             <w:r>
@@ -654,7 +734,7 @@
       <w:tr>
         <w:tc>
           <w:tcPr>
-            <w:tcW w:type="dxa" w:w="1440"/>
+            <w:tcW w:type="dxa" w:w="1234"/>
           </w:tcPr>
           <w:p>
             <w:r>
@@ -667,7 +747,7 @@
         </w:tc>
         <w:tc>
           <w:tcPr>
-            <w:tcW w:type="dxa" w:w="1440"/>
+            <w:tcW w:type="dxa" w:w="1234"/>
           </w:tcPr>
           <w:p>
             <w:r>
@@ -680,7 +760,7 @@
         </w:tc>
         <w:tc>
           <w:tcPr>
-            <w:tcW w:type="dxa" w:w="1440"/>
+            <w:tcW w:type="dxa" w:w="1234"/>
           </w:tcPr>
           <w:p>
             <w:r>
@@ -693,7 +773,20 @@
         </w:tc>
         <w:tc>
           <w:tcPr>
-            <w:tcW w:type="dxa" w:w="1440"/>
+            <w:tcW w:type="dxa" w:w="1234"/>
+          </w:tcPr>
+          <w:p>
+            <w:r>
+              <w:rPr>
+                <w:sz w:val="14"/>
+              </w:rPr>
+              <w:t>1.1</w:t>
+            </w:r>
+          </w:p>
+        </w:tc>
+        <w:tc>
+          <w:tcPr>
+            <w:tcW w:type="dxa" w:w="1234"/>
           </w:tcPr>
           <w:p>
             <w:r>
@@ -706,7 +799,7 @@
         </w:tc>
         <w:tc>
           <w:tcPr>
-            <w:tcW w:type="dxa" w:w="1440"/>
+            <w:tcW w:type="dxa" w:w="1234"/>
           </w:tcPr>
           <w:p>
             <w:r>
@@ -719,7 +812,7 @@
         </w:tc>
         <w:tc>
           <w:tcPr>
-            <w:tcW w:type="dxa" w:w="1440"/>
+            <w:tcW w:type="dxa" w:w="1234"/>
           </w:tcPr>
           <w:p>
             <w:r>
@@ -734,7 +827,7 @@
       <w:tr>
         <w:tc>
           <w:tcPr>
-            <w:tcW w:type="dxa" w:w="1440"/>
+            <w:tcW w:type="dxa" w:w="1234"/>
           </w:tcPr>
           <w:p>
             <w:r>
@@ -747,7 +840,7 @@
         </w:tc>
         <w:tc>
           <w:tcPr>
-            <w:tcW w:type="dxa" w:w="1440"/>
+            <w:tcW w:type="dxa" w:w="1234"/>
           </w:tcPr>
           <w:p>
             <w:r>
@@ -760,7 +853,7 @@
         </w:tc>
         <w:tc>
           <w:tcPr>
-            <w:tcW w:type="dxa" w:w="1440"/>
+            <w:tcW w:type="dxa" w:w="1234"/>
           </w:tcPr>
           <w:p>
             <w:r>
@@ -773,7 +866,20 @@
         </w:tc>
         <w:tc>
           <w:tcPr>
-            <w:tcW w:type="dxa" w:w="1440"/>
+            <w:tcW w:type="dxa" w:w="1234"/>
+          </w:tcPr>
+          <w:p>
+            <w:r>
+              <w:rPr>
+                <w:sz w:val="14"/>
+              </w:rPr>
+              <w:t>1.1</w:t>
+            </w:r>
+          </w:p>
+        </w:tc>
+        <w:tc>
+          <w:tcPr>
+            <w:tcW w:type="dxa" w:w="1234"/>
           </w:tcPr>
           <w:p>
             <w:r>
@@ -786,7 +892,7 @@
         </w:tc>
         <w:tc>
           <w:tcPr>
-            <w:tcW w:type="dxa" w:w="1440"/>
+            <w:tcW w:type="dxa" w:w="1234"/>
           </w:tcPr>
           <w:p>
             <w:r>
@@ -799,7 +905,7 @@
         </w:tc>
         <w:tc>
           <w:tcPr>
-            <w:tcW w:type="dxa" w:w="1440"/>
+            <w:tcW w:type="dxa" w:w="1234"/>
           </w:tcPr>
           <w:p>
             <w:r>
@@ -814,7 +920,7 @@
       <w:tr>
         <w:tc>
           <w:tcPr>
-            <w:tcW w:type="dxa" w:w="1440"/>
+            <w:tcW w:type="dxa" w:w="1234"/>
           </w:tcPr>
           <w:p>
             <w:r>
@@ -827,7 +933,7 @@
         </w:tc>
         <w:tc>
           <w:tcPr>
-            <w:tcW w:type="dxa" w:w="1440"/>
+            <w:tcW w:type="dxa" w:w="1234"/>
           </w:tcPr>
           <w:p>
             <w:r>
@@ -840,7 +946,7 @@
         </w:tc>
         <w:tc>
           <w:tcPr>
-            <w:tcW w:type="dxa" w:w="1440"/>
+            <w:tcW w:type="dxa" w:w="1234"/>
           </w:tcPr>
           <w:p>
             <w:r>
@@ -853,7 +959,20 @@
         </w:tc>
         <w:tc>
           <w:tcPr>
-            <w:tcW w:type="dxa" w:w="1440"/>
+            <w:tcW w:type="dxa" w:w="1234"/>
+          </w:tcPr>
+          <w:p>
+            <w:r>
+              <w:rPr>
+                <w:sz w:val="14"/>
+              </w:rPr>
+              <w:t>1.1</w:t>
+            </w:r>
+          </w:p>
+        </w:tc>
+        <w:tc>
+          <w:tcPr>
+            <w:tcW w:type="dxa" w:w="1234"/>
           </w:tcPr>
           <w:p>
             <w:r>
@@ -866,7 +985,7 @@
         </w:tc>
         <w:tc>
           <w:tcPr>
-            <w:tcW w:type="dxa" w:w="1440"/>
+            <w:tcW w:type="dxa" w:w="1234"/>
           </w:tcPr>
           <w:p>
             <w:r>
@@ -879,7 +998,7 @@
         </w:tc>
         <w:tc>
           <w:tcPr>
-            <w:tcW w:type="dxa" w:w="1440"/>
+            <w:tcW w:type="dxa" w:w="1234"/>
           </w:tcPr>
           <w:p>
             <w:r>
@@ -894,7 +1013,7 @@
       <w:tr>
         <w:tc>
           <w:tcPr>
-            <w:tcW w:type="dxa" w:w="1440"/>
+            <w:tcW w:type="dxa" w:w="1234"/>
           </w:tcPr>
           <w:p>
             <w:r>
@@ -907,7 +1026,7 @@
         </w:tc>
         <w:tc>
           <w:tcPr>
-            <w:tcW w:type="dxa" w:w="1440"/>
+            <w:tcW w:type="dxa" w:w="1234"/>
           </w:tcPr>
           <w:p>
             <w:r>
@@ -920,7 +1039,7 @@
         </w:tc>
         <w:tc>
           <w:tcPr>
-            <w:tcW w:type="dxa" w:w="1440"/>
+            <w:tcW w:type="dxa" w:w="1234"/>
           </w:tcPr>
           <w:p>
             <w:r>
@@ -933,7 +1052,20 @@
         </w:tc>
         <w:tc>
           <w:tcPr>
-            <w:tcW w:type="dxa" w:w="1440"/>
+            <w:tcW w:type="dxa" w:w="1234"/>
+          </w:tcPr>
+          <w:p>
+            <w:r>
+              <w:rPr>
+                <w:sz w:val="14"/>
+              </w:rPr>
+              <w:t>1.1</w:t>
+            </w:r>
+          </w:p>
+        </w:tc>
+        <w:tc>
+          <w:tcPr>
+            <w:tcW w:type="dxa" w:w="1234"/>
           </w:tcPr>
           <w:p>
             <w:r>
@@ -946,7 +1078,7 @@
         </w:tc>
         <w:tc>
           <w:tcPr>
-            <w:tcW w:type="dxa" w:w="1440"/>
+            <w:tcW w:type="dxa" w:w="1234"/>
           </w:tcPr>
           <w:p>
             <w:r>
@@ -959,7 +1091,7 @@
         </w:tc>
         <w:tc>
           <w:tcPr>
-            <w:tcW w:type="dxa" w:w="1440"/>
+            <w:tcW w:type="dxa" w:w="1234"/>
           </w:tcPr>
           <w:p>
             <w:r>
@@ -974,7 +1106,7 @@
       <w:tr>
         <w:tc>
           <w:tcPr>
-            <w:tcW w:type="dxa" w:w="1440"/>
+            <w:tcW w:type="dxa" w:w="1234"/>
           </w:tcPr>
           <w:p>
             <w:r>
@@ -987,7 +1119,7 @@
         </w:tc>
         <w:tc>
           <w:tcPr>
-            <w:tcW w:type="dxa" w:w="1440"/>
+            <w:tcW w:type="dxa" w:w="1234"/>
           </w:tcPr>
           <w:p>
             <w:r>
@@ -1000,7 +1132,7 @@
         </w:tc>
         <w:tc>
           <w:tcPr>
-            <w:tcW w:type="dxa" w:w="1440"/>
+            <w:tcW w:type="dxa" w:w="1234"/>
           </w:tcPr>
           <w:p>
             <w:r>
@@ -1013,7 +1145,20 @@
         </w:tc>
         <w:tc>
           <w:tcPr>
-            <w:tcW w:type="dxa" w:w="1440"/>
+            <w:tcW w:type="dxa" w:w="1234"/>
+          </w:tcPr>
+          <w:p>
+            <w:r>
+              <w:rPr>
+                <w:sz w:val="14"/>
+              </w:rPr>
+              <w:t>1.1</w:t>
+            </w:r>
+          </w:p>
+        </w:tc>
+        <w:tc>
+          <w:tcPr>
+            <w:tcW w:type="dxa" w:w="1234"/>
           </w:tcPr>
           <w:p>
             <w:r>
@@ -1026,7 +1171,7 @@
         </w:tc>
         <w:tc>
           <w:tcPr>
-            <w:tcW w:type="dxa" w:w="1440"/>
+            <w:tcW w:type="dxa" w:w="1234"/>
           </w:tcPr>
           <w:p>
             <w:r>
@@ -1039,7 +1184,7 @@
         </w:tc>
         <w:tc>
           <w:tcPr>
-            <w:tcW w:type="dxa" w:w="1440"/>
+            <w:tcW w:type="dxa" w:w="1234"/>
           </w:tcPr>
           <w:p>
             <w:r>
@@ -1054,7 +1199,7 @@
       <w:tr>
         <w:tc>
           <w:tcPr>
-            <w:tcW w:type="dxa" w:w="1440"/>
+            <w:tcW w:type="dxa" w:w="1234"/>
           </w:tcPr>
           <w:p>
             <w:r>
@@ -1067,7 +1212,7 @@
         </w:tc>
         <w:tc>
           <w:tcPr>
-            <w:tcW w:type="dxa" w:w="1440"/>
+            <w:tcW w:type="dxa" w:w="1234"/>
           </w:tcPr>
           <w:p>
             <w:r>
@@ -1080,7 +1225,7 @@
         </w:tc>
         <w:tc>
           <w:tcPr>
-            <w:tcW w:type="dxa" w:w="1440"/>
+            <w:tcW w:type="dxa" w:w="1234"/>
           </w:tcPr>
           <w:p>
             <w:r>
@@ -1093,7 +1238,20 @@
         </w:tc>
         <w:tc>
           <w:tcPr>
-            <w:tcW w:type="dxa" w:w="1440"/>
+            <w:tcW w:type="dxa" w:w="1234"/>
+          </w:tcPr>
+          <w:p>
+            <w:r>
+              <w:rPr>
+                <w:sz w:val="14"/>
+              </w:rPr>
+              <w:t>1.1</w:t>
+            </w:r>
+          </w:p>
+        </w:tc>
+        <w:tc>
+          <w:tcPr>
+            <w:tcW w:type="dxa" w:w="1234"/>
           </w:tcPr>
           <w:p>
             <w:r>
@@ -1106,7 +1264,7 @@
         </w:tc>
         <w:tc>
           <w:tcPr>
-            <w:tcW w:type="dxa" w:w="1440"/>
+            <w:tcW w:type="dxa" w:w="1234"/>
           </w:tcPr>
           <w:p>
             <w:r>
@@ -1119,7 +1277,7 @@
         </w:tc>
         <w:tc>
           <w:tcPr>
-            <w:tcW w:type="dxa" w:w="1440"/>
+            <w:tcW w:type="dxa" w:w="1234"/>
           </w:tcPr>
           <w:p>
             <w:r>
@@ -1134,7 +1292,7 @@
       <w:tr>
         <w:tc>
           <w:tcPr>
-            <w:tcW w:type="dxa" w:w="1440"/>
+            <w:tcW w:type="dxa" w:w="1234"/>
           </w:tcPr>
           <w:p>
             <w:r>
@@ -1147,7 +1305,7 @@
         </w:tc>
         <w:tc>
           <w:tcPr>
-            <w:tcW w:type="dxa" w:w="1440"/>
+            <w:tcW w:type="dxa" w:w="1234"/>
           </w:tcPr>
           <w:p>
             <w:r>
@@ -1160,7 +1318,7 @@
         </w:tc>
         <w:tc>
           <w:tcPr>
-            <w:tcW w:type="dxa" w:w="1440"/>
+            <w:tcW w:type="dxa" w:w="1234"/>
           </w:tcPr>
           <w:p>
             <w:r>
@@ -1173,7 +1331,7 @@
         </w:tc>
         <w:tc>
           <w:tcPr>
-            <w:tcW w:type="dxa" w:w="1440"/>
+            <w:tcW w:type="dxa" w:w="1234"/>
           </w:tcPr>
           <w:p>
             <w:r>
@@ -1186,7 +1344,7 @@
         </w:tc>
         <w:tc>
           <w:tcPr>
-            <w:tcW w:type="dxa" w:w="1440"/>
+            <w:tcW w:type="dxa" w:w="1234"/>
           </w:tcPr>
           <w:p>
             <w:r>
@@ -1199,7 +1357,20 @@
         </w:tc>
         <w:tc>
           <w:tcPr>
-            <w:tcW w:type="dxa" w:w="1440"/>
+            <w:tcW w:type="dxa" w:w="1234"/>
+          </w:tcPr>
+          <w:p>
+            <w:r>
+              <w:rPr>
+                <w:sz w:val="14"/>
+              </w:rPr>
+              <w:t>nan</w:t>
+            </w:r>
+          </w:p>
+        </w:tc>
+        <w:tc>
+          <w:tcPr>
+            <w:tcW w:type="dxa" w:w="1234"/>
           </w:tcPr>
           <w:p>
             <w:r>
@@ -1214,7 +1385,7 @@
       <w:tr>
         <w:tc>
           <w:tcPr>
-            <w:tcW w:type="dxa" w:w="1440"/>
+            <w:tcW w:type="dxa" w:w="1234"/>
           </w:tcPr>
           <w:p>
             <w:r>
@@ -1227,7 +1398,7 @@
         </w:tc>
         <w:tc>
           <w:tcPr>
-            <w:tcW w:type="dxa" w:w="1440"/>
+            <w:tcW w:type="dxa" w:w="1234"/>
           </w:tcPr>
           <w:p>
             <w:r>
@@ -1240,7 +1411,7 @@
         </w:tc>
         <w:tc>
           <w:tcPr>
-            <w:tcW w:type="dxa" w:w="1440"/>
+            <w:tcW w:type="dxa" w:w="1234"/>
           </w:tcPr>
           <w:p>
             <w:r>
@@ -1253,7 +1424,20 @@
         </w:tc>
         <w:tc>
           <w:tcPr>
-            <w:tcW w:type="dxa" w:w="1440"/>
+            <w:tcW w:type="dxa" w:w="1234"/>
+          </w:tcPr>
+          <w:p>
+            <w:r>
+              <w:rPr>
+                <w:sz w:val="14"/>
+              </w:rPr>
+              <w:t>1.1</w:t>
+            </w:r>
+          </w:p>
+        </w:tc>
+        <w:tc>
+          <w:tcPr>
+            <w:tcW w:type="dxa" w:w="1234"/>
           </w:tcPr>
           <w:p>
             <w:r>
@@ -1266,7 +1450,7 @@
         </w:tc>
         <w:tc>
           <w:tcPr>
-            <w:tcW w:type="dxa" w:w="1440"/>
+            <w:tcW w:type="dxa" w:w="1234"/>
           </w:tcPr>
           <w:p>
             <w:r>
@@ -1279,7 +1463,7 @@
         </w:tc>
         <w:tc>
           <w:tcPr>
-            <w:tcW w:type="dxa" w:w="1440"/>
+            <w:tcW w:type="dxa" w:w="1234"/>
           </w:tcPr>
           <w:p>
             <w:r>
@@ -1294,7 +1478,7 @@
       <w:tr>
         <w:tc>
           <w:tcPr>
-            <w:tcW w:type="dxa" w:w="1440"/>
+            <w:tcW w:type="dxa" w:w="1234"/>
           </w:tcPr>
           <w:p>
             <w:r>
@@ -1307,7 +1491,7 @@
         </w:tc>
         <w:tc>
           <w:tcPr>
-            <w:tcW w:type="dxa" w:w="1440"/>
+            <w:tcW w:type="dxa" w:w="1234"/>
           </w:tcPr>
           <w:p>
             <w:r>
@@ -1320,7 +1504,7 @@
         </w:tc>
         <w:tc>
           <w:tcPr>
-            <w:tcW w:type="dxa" w:w="1440"/>
+            <w:tcW w:type="dxa" w:w="1234"/>
           </w:tcPr>
           <w:p>
             <w:r>
@@ -1333,7 +1517,7 @@
         </w:tc>
         <w:tc>
           <w:tcPr>
-            <w:tcW w:type="dxa" w:w="1440"/>
+            <w:tcW w:type="dxa" w:w="1234"/>
           </w:tcPr>
           <w:p>
             <w:r>
@@ -1346,7 +1530,7 @@
         </w:tc>
         <w:tc>
           <w:tcPr>
-            <w:tcW w:type="dxa" w:w="1440"/>
+            <w:tcW w:type="dxa" w:w="1234"/>
           </w:tcPr>
           <w:p>
             <w:r>
@@ -1359,7 +1543,20 @@
         </w:tc>
         <w:tc>
           <w:tcPr>
-            <w:tcW w:type="dxa" w:w="1440"/>
+            <w:tcW w:type="dxa" w:w="1234"/>
+          </w:tcPr>
+          <w:p>
+            <w:r>
+              <w:rPr>
+                <w:sz w:val="14"/>
+              </w:rPr>
+              <w:t>nan</w:t>
+            </w:r>
+          </w:p>
+        </w:tc>
+        <w:tc>
+          <w:tcPr>
+            <w:tcW w:type="dxa" w:w="1234"/>
           </w:tcPr>
           <w:p>
             <w:r>
@@ -1374,7 +1571,7 @@
       <w:tr>
         <w:tc>
           <w:tcPr>
-            <w:tcW w:type="dxa" w:w="1440"/>
+            <w:tcW w:type="dxa" w:w="1234"/>
           </w:tcPr>
           <w:p>
             <w:r>
@@ -1387,7 +1584,7 @@
         </w:tc>
         <w:tc>
           <w:tcPr>
-            <w:tcW w:type="dxa" w:w="1440"/>
+            <w:tcW w:type="dxa" w:w="1234"/>
           </w:tcPr>
           <w:p>
             <w:r>
@@ -1400,7 +1597,7 @@
         </w:tc>
         <w:tc>
           <w:tcPr>
-            <w:tcW w:type="dxa" w:w="1440"/>
+            <w:tcW w:type="dxa" w:w="1234"/>
           </w:tcPr>
           <w:p>
             <w:r>
@@ -1413,7 +1610,7 @@
         </w:tc>
         <w:tc>
           <w:tcPr>
-            <w:tcW w:type="dxa" w:w="1440"/>
+            <w:tcW w:type="dxa" w:w="1234"/>
           </w:tcPr>
           <w:p>
             <w:r>
@@ -1426,7 +1623,7 @@
         </w:tc>
         <w:tc>
           <w:tcPr>
-            <w:tcW w:type="dxa" w:w="1440"/>
+            <w:tcW w:type="dxa" w:w="1234"/>
           </w:tcPr>
           <w:p>
             <w:r>
@@ -1439,7 +1636,20 @@
         </w:tc>
         <w:tc>
           <w:tcPr>
-            <w:tcW w:type="dxa" w:w="1440"/>
+            <w:tcW w:type="dxa" w:w="1234"/>
+          </w:tcPr>
+          <w:p>
+            <w:r>
+              <w:rPr>
+                <w:sz w:val="14"/>
+              </w:rPr>
+              <w:t>nan</w:t>
+            </w:r>
+          </w:p>
+        </w:tc>
+        <w:tc>
+          <w:tcPr>
+            <w:tcW w:type="dxa" w:w="1234"/>
           </w:tcPr>
           <w:p>
             <w:r>
@@ -1454,7 +1664,7 @@
       <w:tr>
         <w:tc>
           <w:tcPr>
-            <w:tcW w:type="dxa" w:w="1440"/>
+            <w:tcW w:type="dxa" w:w="1234"/>
           </w:tcPr>
           <w:p>
             <w:r>
@@ -1467,7 +1677,7 @@
         </w:tc>
         <w:tc>
           <w:tcPr>
-            <w:tcW w:type="dxa" w:w="1440"/>
+            <w:tcW w:type="dxa" w:w="1234"/>
           </w:tcPr>
           <w:p>
             <w:r>
@@ -1480,7 +1690,7 @@
         </w:tc>
         <w:tc>
           <w:tcPr>
-            <w:tcW w:type="dxa" w:w="1440"/>
+            <w:tcW w:type="dxa" w:w="1234"/>
           </w:tcPr>
           <w:p>
             <w:r>
@@ -1493,7 +1703,20 @@
         </w:tc>
         <w:tc>
           <w:tcPr>
-            <w:tcW w:type="dxa" w:w="1440"/>
+            <w:tcW w:type="dxa" w:w="1234"/>
+          </w:tcPr>
+          <w:p>
+            <w:r>
+              <w:rPr>
+                <w:sz w:val="14"/>
+              </w:rPr>
+              <w:t>1.1</w:t>
+            </w:r>
+          </w:p>
+        </w:tc>
+        <w:tc>
+          <w:tcPr>
+            <w:tcW w:type="dxa" w:w="1234"/>
           </w:tcPr>
           <w:p>
             <w:r>
@@ -1506,7 +1729,7 @@
         </w:tc>
         <w:tc>
           <w:tcPr>
-            <w:tcW w:type="dxa" w:w="1440"/>
+            <w:tcW w:type="dxa" w:w="1234"/>
           </w:tcPr>
           <w:p>
             <w:r>
@@ -1519,7 +1742,7 @@
         </w:tc>
         <w:tc>
           <w:tcPr>
-            <w:tcW w:type="dxa" w:w="1440"/>
+            <w:tcW w:type="dxa" w:w="1234"/>
           </w:tcPr>
           <w:p>
             <w:r>
@@ -1534,7 +1757,7 @@
       <w:tr>
         <w:tc>
           <w:tcPr>
-            <w:tcW w:type="dxa" w:w="1440"/>
+            <w:tcW w:type="dxa" w:w="1234"/>
           </w:tcPr>
           <w:p>
             <w:r>
@@ -1547,7 +1770,7 @@
         </w:tc>
         <w:tc>
           <w:tcPr>
-            <w:tcW w:type="dxa" w:w="1440"/>
+            <w:tcW w:type="dxa" w:w="1234"/>
           </w:tcPr>
           <w:p>
             <w:r>
@@ -1560,7 +1783,7 @@
         </w:tc>
         <w:tc>
           <w:tcPr>
-            <w:tcW w:type="dxa" w:w="1440"/>
+            <w:tcW w:type="dxa" w:w="1234"/>
           </w:tcPr>
           <w:p>
             <w:r>
@@ -1573,7 +1796,7 @@
         </w:tc>
         <w:tc>
           <w:tcPr>
-            <w:tcW w:type="dxa" w:w="1440"/>
+            <w:tcW w:type="dxa" w:w="1234"/>
           </w:tcPr>
           <w:p>
             <w:r>
@@ -1586,7 +1809,7 @@
         </w:tc>
         <w:tc>
           <w:tcPr>
-            <w:tcW w:type="dxa" w:w="1440"/>
+            <w:tcW w:type="dxa" w:w="1234"/>
           </w:tcPr>
           <w:p>
             <w:r>
@@ -1599,7 +1822,20 @@
         </w:tc>
         <w:tc>
           <w:tcPr>
-            <w:tcW w:type="dxa" w:w="1440"/>
+            <w:tcW w:type="dxa" w:w="1234"/>
+          </w:tcPr>
+          <w:p>
+            <w:r>
+              <w:rPr>
+                <w:sz w:val="14"/>
+              </w:rPr>
+              <w:t>nan</w:t>
+            </w:r>
+          </w:p>
+        </w:tc>
+        <w:tc>
+          <w:tcPr>
+            <w:tcW w:type="dxa" w:w="1234"/>
           </w:tcPr>
           <w:p>
             <w:r>
@@ -1614,7 +1850,7 @@
       <w:tr>
         <w:tc>
           <w:tcPr>
-            <w:tcW w:type="dxa" w:w="1440"/>
+            <w:tcW w:type="dxa" w:w="1234"/>
           </w:tcPr>
           <w:p>
             <w:r>
@@ -1627,7 +1863,7 @@
         </w:tc>
         <w:tc>
           <w:tcPr>
-            <w:tcW w:type="dxa" w:w="1440"/>
+            <w:tcW w:type="dxa" w:w="1234"/>
           </w:tcPr>
           <w:p>
             <w:r>
@@ -1640,7 +1876,7 @@
         </w:tc>
         <w:tc>
           <w:tcPr>
-            <w:tcW w:type="dxa" w:w="1440"/>
+            <w:tcW w:type="dxa" w:w="1234"/>
           </w:tcPr>
           <w:p>
             <w:r>
@@ -1653,7 +1889,7 @@
         </w:tc>
         <w:tc>
           <w:tcPr>
-            <w:tcW w:type="dxa" w:w="1440"/>
+            <w:tcW w:type="dxa" w:w="1234"/>
           </w:tcPr>
           <w:p>
             <w:r>
@@ -1666,7 +1902,7 @@
         </w:tc>
         <w:tc>
           <w:tcPr>
-            <w:tcW w:type="dxa" w:w="1440"/>
+            <w:tcW w:type="dxa" w:w="1234"/>
           </w:tcPr>
           <w:p>
             <w:r>
@@ -1679,7 +1915,20 @@
         </w:tc>
         <w:tc>
           <w:tcPr>
-            <w:tcW w:type="dxa" w:w="1440"/>
+            <w:tcW w:type="dxa" w:w="1234"/>
+          </w:tcPr>
+          <w:p>
+            <w:r>
+              <w:rPr>
+                <w:sz w:val="14"/>
+              </w:rPr>
+              <w:t>nan</w:t>
+            </w:r>
+          </w:p>
+        </w:tc>
+        <w:tc>
+          <w:tcPr>
+            <w:tcW w:type="dxa" w:w="1234"/>
           </w:tcPr>
           <w:p>
             <w:r>
@@ -1694,7 +1943,7 @@
       <w:tr>
         <w:tc>
           <w:tcPr>
-            <w:tcW w:type="dxa" w:w="1440"/>
+            <w:tcW w:type="dxa" w:w="1234"/>
           </w:tcPr>
           <w:p>
             <w:r>
@@ -1707,7 +1956,7 @@
         </w:tc>
         <w:tc>
           <w:tcPr>
-            <w:tcW w:type="dxa" w:w="1440"/>
+            <w:tcW w:type="dxa" w:w="1234"/>
           </w:tcPr>
           <w:p>
             <w:r>
@@ -1720,7 +1969,7 @@
         </w:tc>
         <w:tc>
           <w:tcPr>
-            <w:tcW w:type="dxa" w:w="1440"/>
+            <w:tcW w:type="dxa" w:w="1234"/>
           </w:tcPr>
           <w:p>
             <w:r>
@@ -1733,7 +1982,7 @@
         </w:tc>
         <w:tc>
           <w:tcPr>
-            <w:tcW w:type="dxa" w:w="1440"/>
+            <w:tcW w:type="dxa" w:w="1234"/>
           </w:tcPr>
           <w:p>
             <w:r>
@@ -1746,7 +1995,7 @@
         </w:tc>
         <w:tc>
           <w:tcPr>
-            <w:tcW w:type="dxa" w:w="1440"/>
+            <w:tcW w:type="dxa" w:w="1234"/>
           </w:tcPr>
           <w:p>
             <w:r>
@@ -1759,7 +2008,20 @@
         </w:tc>
         <w:tc>
           <w:tcPr>
-            <w:tcW w:type="dxa" w:w="1440"/>
+            <w:tcW w:type="dxa" w:w="1234"/>
+          </w:tcPr>
+          <w:p>
+            <w:r>
+              <w:rPr>
+                <w:sz w:val="14"/>
+              </w:rPr>
+              <w:t>nan</w:t>
+            </w:r>
+          </w:p>
+        </w:tc>
+        <w:tc>
+          <w:tcPr>
+            <w:tcW w:type="dxa" w:w="1234"/>
           </w:tcPr>
           <w:p>
             <w:r>
@@ -1774,7 +2036,7 @@
       <w:tr>
         <w:tc>
           <w:tcPr>
-            <w:tcW w:type="dxa" w:w="1440"/>
+            <w:tcW w:type="dxa" w:w="1234"/>
           </w:tcPr>
           <w:p>
             <w:r>
@@ -1787,7 +2049,7 @@
         </w:tc>
         <w:tc>
           <w:tcPr>
-            <w:tcW w:type="dxa" w:w="1440"/>
+            <w:tcW w:type="dxa" w:w="1234"/>
           </w:tcPr>
           <w:p>
             <w:r>
@@ -1800,7 +2062,7 @@
         </w:tc>
         <w:tc>
           <w:tcPr>
-            <w:tcW w:type="dxa" w:w="1440"/>
+            <w:tcW w:type="dxa" w:w="1234"/>
           </w:tcPr>
           <w:p>
             <w:r>
@@ -1813,7 +2075,7 @@
         </w:tc>
         <w:tc>
           <w:tcPr>
-            <w:tcW w:type="dxa" w:w="1440"/>
+            <w:tcW w:type="dxa" w:w="1234"/>
           </w:tcPr>
           <w:p>
             <w:r>
@@ -1826,7 +2088,7 @@
         </w:tc>
         <w:tc>
           <w:tcPr>
-            <w:tcW w:type="dxa" w:w="1440"/>
+            <w:tcW w:type="dxa" w:w="1234"/>
           </w:tcPr>
           <w:p>
             <w:r>
@@ -1839,7 +2101,20 @@
         </w:tc>
         <w:tc>
           <w:tcPr>
-            <w:tcW w:type="dxa" w:w="1440"/>
+            <w:tcW w:type="dxa" w:w="1234"/>
+          </w:tcPr>
+          <w:p>
+            <w:r>
+              <w:rPr>
+                <w:sz w:val="14"/>
+              </w:rPr>
+              <w:t>nan</w:t>
+            </w:r>
+          </w:p>
+        </w:tc>
+        <w:tc>
+          <w:tcPr>
+            <w:tcW w:type="dxa" w:w="1234"/>
           </w:tcPr>
           <w:p>
             <w:r>
@@ -1854,7 +2129,7 @@
       <w:tr>
         <w:tc>
           <w:tcPr>
-            <w:tcW w:type="dxa" w:w="1440"/>
+            <w:tcW w:type="dxa" w:w="1234"/>
           </w:tcPr>
           <w:p>
             <w:r>
@@ -1867,7 +2142,7 @@
         </w:tc>
         <w:tc>
           <w:tcPr>
-            <w:tcW w:type="dxa" w:w="1440"/>
+            <w:tcW w:type="dxa" w:w="1234"/>
           </w:tcPr>
           <w:p>
             <w:r>
@@ -1880,7 +2155,7 @@
         </w:tc>
         <w:tc>
           <w:tcPr>
-            <w:tcW w:type="dxa" w:w="1440"/>
+            <w:tcW w:type="dxa" w:w="1234"/>
           </w:tcPr>
           <w:p>
             <w:r>
@@ -1893,7 +2168,7 @@
         </w:tc>
         <w:tc>
           <w:tcPr>
-            <w:tcW w:type="dxa" w:w="1440"/>
+            <w:tcW w:type="dxa" w:w="1234"/>
           </w:tcPr>
           <w:p>
             <w:r>
@@ -1906,7 +2181,7 @@
         </w:tc>
         <w:tc>
           <w:tcPr>
-            <w:tcW w:type="dxa" w:w="1440"/>
+            <w:tcW w:type="dxa" w:w="1234"/>
           </w:tcPr>
           <w:p>
             <w:r>
@@ -1919,7 +2194,20 @@
         </w:tc>
         <w:tc>
           <w:tcPr>
-            <w:tcW w:type="dxa" w:w="1440"/>
+            <w:tcW w:type="dxa" w:w="1234"/>
+          </w:tcPr>
+          <w:p>
+            <w:r>
+              <w:rPr>
+                <w:sz w:val="14"/>
+              </w:rPr>
+              <w:t>nan</w:t>
+            </w:r>
+          </w:p>
+        </w:tc>
+        <w:tc>
+          <w:tcPr>
+            <w:tcW w:type="dxa" w:w="1234"/>
           </w:tcPr>
           <w:p>
             <w:r>
@@ -1934,7 +2222,7 @@
       <w:tr>
         <w:tc>
           <w:tcPr>
-            <w:tcW w:type="dxa" w:w="1440"/>
+            <w:tcW w:type="dxa" w:w="1234"/>
           </w:tcPr>
           <w:p>
             <w:r>
@@ -1947,7 +2235,7 @@
         </w:tc>
         <w:tc>
           <w:tcPr>
-            <w:tcW w:type="dxa" w:w="1440"/>
+            <w:tcW w:type="dxa" w:w="1234"/>
           </w:tcPr>
           <w:p>
             <w:r>
@@ -1960,7 +2248,7 @@
         </w:tc>
         <w:tc>
           <w:tcPr>
-            <w:tcW w:type="dxa" w:w="1440"/>
+            <w:tcW w:type="dxa" w:w="1234"/>
           </w:tcPr>
           <w:p>
             <w:r>
@@ -1973,7 +2261,7 @@
         </w:tc>
         <w:tc>
           <w:tcPr>
-            <w:tcW w:type="dxa" w:w="1440"/>
+            <w:tcW w:type="dxa" w:w="1234"/>
           </w:tcPr>
           <w:p>
             <w:r>
@@ -1986,7 +2274,7 @@
         </w:tc>
         <w:tc>
           <w:tcPr>
-            <w:tcW w:type="dxa" w:w="1440"/>
+            <w:tcW w:type="dxa" w:w="1234"/>
           </w:tcPr>
           <w:p>
             <w:r>
@@ -1999,7 +2287,20 @@
         </w:tc>
         <w:tc>
           <w:tcPr>
-            <w:tcW w:type="dxa" w:w="1440"/>
+            <w:tcW w:type="dxa" w:w="1234"/>
+          </w:tcPr>
+          <w:p>
+            <w:r>
+              <w:rPr>
+                <w:sz w:val="14"/>
+              </w:rPr>
+              <w:t>nan</w:t>
+            </w:r>
+          </w:p>
+        </w:tc>
+        <w:tc>
+          <w:tcPr>
+            <w:tcW w:type="dxa" w:w="1234"/>
           </w:tcPr>
           <w:p>
             <w:r>
@@ -2014,7 +2315,7 @@
       <w:tr>
         <w:tc>
           <w:tcPr>
-            <w:tcW w:type="dxa" w:w="1440"/>
+            <w:tcW w:type="dxa" w:w="1234"/>
           </w:tcPr>
           <w:p>
             <w:r>
@@ -2027,7 +2328,7 @@
         </w:tc>
         <w:tc>
           <w:tcPr>
-            <w:tcW w:type="dxa" w:w="1440"/>
+            <w:tcW w:type="dxa" w:w="1234"/>
           </w:tcPr>
           <w:p>
             <w:r>
@@ -2040,7 +2341,7 @@
         </w:tc>
         <w:tc>
           <w:tcPr>
-            <w:tcW w:type="dxa" w:w="1440"/>
+            <w:tcW w:type="dxa" w:w="1234"/>
           </w:tcPr>
           <w:p>
             <w:r>
@@ -2053,7 +2354,7 @@
         </w:tc>
         <w:tc>
           <w:tcPr>
-            <w:tcW w:type="dxa" w:w="1440"/>
+            <w:tcW w:type="dxa" w:w="1234"/>
           </w:tcPr>
           <w:p>
             <w:r>
@@ -2066,7 +2367,7 @@
         </w:tc>
         <w:tc>
           <w:tcPr>
-            <w:tcW w:type="dxa" w:w="1440"/>
+            <w:tcW w:type="dxa" w:w="1234"/>
           </w:tcPr>
           <w:p>
             <w:r>
@@ -2079,7 +2380,20 @@
         </w:tc>
         <w:tc>
           <w:tcPr>
-            <w:tcW w:type="dxa" w:w="1440"/>
+            <w:tcW w:type="dxa" w:w="1234"/>
+          </w:tcPr>
+          <w:p>
+            <w:r>
+              <w:rPr>
+                <w:sz w:val="14"/>
+              </w:rPr>
+              <w:t>nan</w:t>
+            </w:r>
+          </w:p>
+        </w:tc>
+        <w:tc>
+          <w:tcPr>
+            <w:tcW w:type="dxa" w:w="1234"/>
           </w:tcPr>
           <w:p>
             <w:r>
@@ -2094,7 +2408,7 @@
       <w:tr>
         <w:tc>
           <w:tcPr>
-            <w:tcW w:type="dxa" w:w="1440"/>
+            <w:tcW w:type="dxa" w:w="1234"/>
           </w:tcPr>
           <w:p>
             <w:r>
@@ -2107,7 +2421,7 @@
         </w:tc>
         <w:tc>
           <w:tcPr>
-            <w:tcW w:type="dxa" w:w="1440"/>
+            <w:tcW w:type="dxa" w:w="1234"/>
           </w:tcPr>
           <w:p>
             <w:r>
@@ -2120,7 +2434,7 @@
         </w:tc>
         <w:tc>
           <w:tcPr>
-            <w:tcW w:type="dxa" w:w="1440"/>
+            <w:tcW w:type="dxa" w:w="1234"/>
           </w:tcPr>
           <w:p>
             <w:r>
@@ -2133,7 +2447,7 @@
         </w:tc>
         <w:tc>
           <w:tcPr>
-            <w:tcW w:type="dxa" w:w="1440"/>
+            <w:tcW w:type="dxa" w:w="1234"/>
           </w:tcPr>
           <w:p>
             <w:r>
@@ -2146,7 +2460,7 @@
         </w:tc>
         <w:tc>
           <w:tcPr>
-            <w:tcW w:type="dxa" w:w="1440"/>
+            <w:tcW w:type="dxa" w:w="1234"/>
           </w:tcPr>
           <w:p>
             <w:r>
@@ -2159,7 +2473,20 @@
         </w:tc>
         <w:tc>
           <w:tcPr>
-            <w:tcW w:type="dxa" w:w="1440"/>
+            <w:tcW w:type="dxa" w:w="1234"/>
+          </w:tcPr>
+          <w:p>
+            <w:r>
+              <w:rPr>
+                <w:sz w:val="14"/>
+              </w:rPr>
+              <w:t>nan</w:t>
+            </w:r>
+          </w:p>
+        </w:tc>
+        <w:tc>
+          <w:tcPr>
+            <w:tcW w:type="dxa" w:w="1234"/>
           </w:tcPr>
           <w:p>
             <w:r>
@@ -2174,7 +2501,7 @@
       <w:tr>
         <w:tc>
           <w:tcPr>
-            <w:tcW w:type="dxa" w:w="1440"/>
+            <w:tcW w:type="dxa" w:w="1234"/>
           </w:tcPr>
           <w:p>
             <w:r>
@@ -2187,7 +2514,7 @@
         </w:tc>
         <w:tc>
           <w:tcPr>
-            <w:tcW w:type="dxa" w:w="1440"/>
+            <w:tcW w:type="dxa" w:w="1234"/>
           </w:tcPr>
           <w:p>
             <w:r>
@@ -2200,7 +2527,7 @@
         </w:tc>
         <w:tc>
           <w:tcPr>
-            <w:tcW w:type="dxa" w:w="1440"/>
+            <w:tcW w:type="dxa" w:w="1234"/>
           </w:tcPr>
           <w:p>
             <w:r>
@@ -2213,7 +2540,7 @@
         </w:tc>
         <w:tc>
           <w:tcPr>
-            <w:tcW w:type="dxa" w:w="1440"/>
+            <w:tcW w:type="dxa" w:w="1234"/>
           </w:tcPr>
           <w:p>
             <w:r>
@@ -2226,7 +2553,7 @@
         </w:tc>
         <w:tc>
           <w:tcPr>
-            <w:tcW w:type="dxa" w:w="1440"/>
+            <w:tcW w:type="dxa" w:w="1234"/>
           </w:tcPr>
           <w:p>
             <w:r>
@@ -2239,7 +2566,20 @@
         </w:tc>
         <w:tc>
           <w:tcPr>
-            <w:tcW w:type="dxa" w:w="1440"/>
+            <w:tcW w:type="dxa" w:w="1234"/>
+          </w:tcPr>
+          <w:p>
+            <w:r>
+              <w:rPr>
+                <w:sz w:val="14"/>
+              </w:rPr>
+              <w:t>nan</w:t>
+            </w:r>
+          </w:p>
+        </w:tc>
+        <w:tc>
+          <w:tcPr>
+            <w:tcW w:type="dxa" w:w="1234"/>
           </w:tcPr>
           <w:p>
             <w:r>
@@ -2254,7 +2594,7 @@
       <w:tr>
         <w:tc>
           <w:tcPr>
-            <w:tcW w:type="dxa" w:w="1440"/>
+            <w:tcW w:type="dxa" w:w="1234"/>
           </w:tcPr>
           <w:p>
             <w:r>
@@ -2267,7 +2607,7 @@
         </w:tc>
         <w:tc>
           <w:tcPr>
-            <w:tcW w:type="dxa" w:w="1440"/>
+            <w:tcW w:type="dxa" w:w="1234"/>
           </w:tcPr>
           <w:p>
             <w:r>
@@ -2280,7 +2620,7 @@
         </w:tc>
         <w:tc>
           <w:tcPr>
-            <w:tcW w:type="dxa" w:w="1440"/>
+            <w:tcW w:type="dxa" w:w="1234"/>
           </w:tcPr>
           <w:p>
             <w:r>
@@ -2293,7 +2633,7 @@
         </w:tc>
         <w:tc>
           <w:tcPr>
-            <w:tcW w:type="dxa" w:w="1440"/>
+            <w:tcW w:type="dxa" w:w="1234"/>
           </w:tcPr>
           <w:p>
             <w:r>
@@ -2306,7 +2646,7 @@
         </w:tc>
         <w:tc>
           <w:tcPr>
-            <w:tcW w:type="dxa" w:w="1440"/>
+            <w:tcW w:type="dxa" w:w="1234"/>
           </w:tcPr>
           <w:p>
             <w:r>
@@ -2319,7 +2659,20 @@
         </w:tc>
         <w:tc>
           <w:tcPr>
-            <w:tcW w:type="dxa" w:w="1440"/>
+            <w:tcW w:type="dxa" w:w="1234"/>
+          </w:tcPr>
+          <w:p>
+            <w:r>
+              <w:rPr>
+                <w:sz w:val="14"/>
+              </w:rPr>
+              <w:t>nan</w:t>
+            </w:r>
+          </w:p>
+        </w:tc>
+        <w:tc>
+          <w:tcPr>
+            <w:tcW w:type="dxa" w:w="1234"/>
           </w:tcPr>
           <w:p>
             <w:r>
@@ -2334,7 +2687,7 @@
       <w:tr>
         <w:tc>
           <w:tcPr>
-            <w:tcW w:type="dxa" w:w="1440"/>
+            <w:tcW w:type="dxa" w:w="1234"/>
           </w:tcPr>
           <w:p>
             <w:r>
@@ -2347,7 +2700,7 @@
         </w:tc>
         <w:tc>
           <w:tcPr>
-            <w:tcW w:type="dxa" w:w="1440"/>
+            <w:tcW w:type="dxa" w:w="1234"/>
           </w:tcPr>
           <w:p>
             <w:r>
@@ -2360,7 +2713,7 @@
         </w:tc>
         <w:tc>
           <w:tcPr>
-            <w:tcW w:type="dxa" w:w="1440"/>
+            <w:tcW w:type="dxa" w:w="1234"/>
           </w:tcPr>
           <w:p>
             <w:r>
@@ -2373,7 +2726,7 @@
         </w:tc>
         <w:tc>
           <w:tcPr>
-            <w:tcW w:type="dxa" w:w="1440"/>
+            <w:tcW w:type="dxa" w:w="1234"/>
           </w:tcPr>
           <w:p>
             <w:r>
@@ -2386,7 +2739,7 @@
         </w:tc>
         <w:tc>
           <w:tcPr>
-            <w:tcW w:type="dxa" w:w="1440"/>
+            <w:tcW w:type="dxa" w:w="1234"/>
           </w:tcPr>
           <w:p>
             <w:r>
@@ -2399,7 +2752,20 @@
         </w:tc>
         <w:tc>
           <w:tcPr>
-            <w:tcW w:type="dxa" w:w="1440"/>
+            <w:tcW w:type="dxa" w:w="1234"/>
+          </w:tcPr>
+          <w:p>
+            <w:r>
+              <w:rPr>
+                <w:sz w:val="14"/>
+              </w:rPr>
+              <w:t>nan</w:t>
+            </w:r>
+          </w:p>
+        </w:tc>
+        <w:tc>
+          <w:tcPr>
+            <w:tcW w:type="dxa" w:w="1234"/>
           </w:tcPr>
           <w:p>
             <w:r>
@@ -2414,7 +2780,7 @@
       <w:tr>
         <w:tc>
           <w:tcPr>
-            <w:tcW w:type="dxa" w:w="1440"/>
+            <w:tcW w:type="dxa" w:w="1234"/>
           </w:tcPr>
           <w:p>
             <w:r>
@@ -2427,7 +2793,7 @@
         </w:tc>
         <w:tc>
           <w:tcPr>
-            <w:tcW w:type="dxa" w:w="1440"/>
+            <w:tcW w:type="dxa" w:w="1234"/>
           </w:tcPr>
           <w:p>
             <w:r>
@@ -2440,7 +2806,7 @@
         </w:tc>
         <w:tc>
           <w:tcPr>
-            <w:tcW w:type="dxa" w:w="1440"/>
+            <w:tcW w:type="dxa" w:w="1234"/>
           </w:tcPr>
           <w:p>
             <w:r>
@@ -2453,7 +2819,7 @@
         </w:tc>
         <w:tc>
           <w:tcPr>
-            <w:tcW w:type="dxa" w:w="1440"/>
+            <w:tcW w:type="dxa" w:w="1234"/>
           </w:tcPr>
           <w:p>
             <w:r>
@@ -2466,7 +2832,7 @@
         </w:tc>
         <w:tc>
           <w:tcPr>
-            <w:tcW w:type="dxa" w:w="1440"/>
+            <w:tcW w:type="dxa" w:w="1234"/>
           </w:tcPr>
           <w:p>
             <w:r>
@@ -2479,7 +2845,20 @@
         </w:tc>
         <w:tc>
           <w:tcPr>
-            <w:tcW w:type="dxa" w:w="1440"/>
+            <w:tcW w:type="dxa" w:w="1234"/>
+          </w:tcPr>
+          <w:p>
+            <w:r>
+              <w:rPr>
+                <w:sz w:val="14"/>
+              </w:rPr>
+              <w:t>nan</w:t>
+            </w:r>
+          </w:p>
+        </w:tc>
+        <w:tc>
+          <w:tcPr>
+            <w:tcW w:type="dxa" w:w="1234"/>
           </w:tcPr>
           <w:p>
             <w:r>
@@ -2494,7 +2873,7 @@
       <w:tr>
         <w:tc>
           <w:tcPr>
-            <w:tcW w:type="dxa" w:w="1440"/>
+            <w:tcW w:type="dxa" w:w="1234"/>
           </w:tcPr>
           <w:p>
             <w:r>
@@ -2507,7 +2886,7 @@
         </w:tc>
         <w:tc>
           <w:tcPr>
-            <w:tcW w:type="dxa" w:w="1440"/>
+            <w:tcW w:type="dxa" w:w="1234"/>
           </w:tcPr>
           <w:p>
             <w:r>
@@ -2520,7 +2899,7 @@
         </w:tc>
         <w:tc>
           <w:tcPr>
-            <w:tcW w:type="dxa" w:w="1440"/>
+            <w:tcW w:type="dxa" w:w="1234"/>
           </w:tcPr>
           <w:p>
             <w:r>
@@ -2533,7 +2912,7 @@
         </w:tc>
         <w:tc>
           <w:tcPr>
-            <w:tcW w:type="dxa" w:w="1440"/>
+            <w:tcW w:type="dxa" w:w="1234"/>
           </w:tcPr>
           <w:p>
             <w:r>
@@ -2546,7 +2925,7 @@
         </w:tc>
         <w:tc>
           <w:tcPr>
-            <w:tcW w:type="dxa" w:w="1440"/>
+            <w:tcW w:type="dxa" w:w="1234"/>
           </w:tcPr>
           <w:p>
             <w:r>
@@ -2559,7 +2938,20 @@
         </w:tc>
         <w:tc>
           <w:tcPr>
-            <w:tcW w:type="dxa" w:w="1440"/>
+            <w:tcW w:type="dxa" w:w="1234"/>
+          </w:tcPr>
+          <w:p>
+            <w:r>
+              <w:rPr>
+                <w:sz w:val="14"/>
+              </w:rPr>
+              <w:t>nan</w:t>
+            </w:r>
+          </w:p>
+        </w:tc>
+        <w:tc>
+          <w:tcPr>
+            <w:tcW w:type="dxa" w:w="1234"/>
           </w:tcPr>
           <w:p>
             <w:r>
@@ -2574,7 +2966,7 @@
       <w:tr>
         <w:tc>
           <w:tcPr>
-            <w:tcW w:type="dxa" w:w="1440"/>
+            <w:tcW w:type="dxa" w:w="1234"/>
           </w:tcPr>
           <w:p>
             <w:r>
@@ -2587,7 +2979,7 @@
         </w:tc>
         <w:tc>
           <w:tcPr>
-            <w:tcW w:type="dxa" w:w="1440"/>
+            <w:tcW w:type="dxa" w:w="1234"/>
           </w:tcPr>
           <w:p>
             <w:r>
@@ -2600,7 +2992,7 @@
         </w:tc>
         <w:tc>
           <w:tcPr>
-            <w:tcW w:type="dxa" w:w="1440"/>
+            <w:tcW w:type="dxa" w:w="1234"/>
           </w:tcPr>
           <w:p>
             <w:r>
@@ -2613,7 +3005,7 @@
         </w:tc>
         <w:tc>
           <w:tcPr>
-            <w:tcW w:type="dxa" w:w="1440"/>
+            <w:tcW w:type="dxa" w:w="1234"/>
           </w:tcPr>
           <w:p>
             <w:r>
@@ -2626,7 +3018,7 @@
         </w:tc>
         <w:tc>
           <w:tcPr>
-            <w:tcW w:type="dxa" w:w="1440"/>
+            <w:tcW w:type="dxa" w:w="1234"/>
           </w:tcPr>
           <w:p>
             <w:r>
@@ -2639,7 +3031,20 @@
         </w:tc>
         <w:tc>
           <w:tcPr>
-            <w:tcW w:type="dxa" w:w="1440"/>
+            <w:tcW w:type="dxa" w:w="1234"/>
+          </w:tcPr>
+          <w:p>
+            <w:r>
+              <w:rPr>
+                <w:sz w:val="14"/>
+              </w:rPr>
+              <w:t>nan</w:t>
+            </w:r>
+          </w:p>
+        </w:tc>
+        <w:tc>
+          <w:tcPr>
+            <w:tcW w:type="dxa" w:w="1234"/>
           </w:tcPr>
           <w:p>
             <w:r>
@@ -2654,7 +3059,7 @@
       <w:tr>
         <w:tc>
           <w:tcPr>
-            <w:tcW w:type="dxa" w:w="1440"/>
+            <w:tcW w:type="dxa" w:w="1234"/>
           </w:tcPr>
           <w:p>
             <w:r>
@@ -2667,7 +3072,7 @@
         </w:tc>
         <w:tc>
           <w:tcPr>
-            <w:tcW w:type="dxa" w:w="1440"/>
+            <w:tcW w:type="dxa" w:w="1234"/>
           </w:tcPr>
           <w:p>
             <w:r>
@@ -2680,7 +3085,7 @@
         </w:tc>
         <w:tc>
           <w:tcPr>
-            <w:tcW w:type="dxa" w:w="1440"/>
+            <w:tcW w:type="dxa" w:w="1234"/>
           </w:tcPr>
           <w:p>
             <w:r>
@@ -2693,7 +3098,7 @@
         </w:tc>
         <w:tc>
           <w:tcPr>
-            <w:tcW w:type="dxa" w:w="1440"/>
+            <w:tcW w:type="dxa" w:w="1234"/>
           </w:tcPr>
           <w:p>
             <w:r>
@@ -2706,7 +3111,7 @@
         </w:tc>
         <w:tc>
           <w:tcPr>
-            <w:tcW w:type="dxa" w:w="1440"/>
+            <w:tcW w:type="dxa" w:w="1234"/>
           </w:tcPr>
           <w:p>
             <w:r>
@@ -2719,7 +3124,20 @@
         </w:tc>
         <w:tc>
           <w:tcPr>
-            <w:tcW w:type="dxa" w:w="1440"/>
+            <w:tcW w:type="dxa" w:w="1234"/>
+          </w:tcPr>
+          <w:p>
+            <w:r>
+              <w:rPr>
+                <w:sz w:val="14"/>
+              </w:rPr>
+              <w:t>nan</w:t>
+            </w:r>
+          </w:p>
+        </w:tc>
+        <w:tc>
+          <w:tcPr>
+            <w:tcW w:type="dxa" w:w="1234"/>
           </w:tcPr>
           <w:p>
             <w:r>
@@ -2734,7 +3152,7 @@
       <w:tr>
         <w:tc>
           <w:tcPr>
-            <w:tcW w:type="dxa" w:w="1440"/>
+            <w:tcW w:type="dxa" w:w="1234"/>
           </w:tcPr>
           <w:p>
             <w:r>
@@ -2747,7 +3165,7 @@
         </w:tc>
         <w:tc>
           <w:tcPr>
-            <w:tcW w:type="dxa" w:w="1440"/>
+            <w:tcW w:type="dxa" w:w="1234"/>
           </w:tcPr>
           <w:p>
             <w:r>
@@ -2760,7 +3178,7 @@
         </w:tc>
         <w:tc>
           <w:tcPr>
-            <w:tcW w:type="dxa" w:w="1440"/>
+            <w:tcW w:type="dxa" w:w="1234"/>
           </w:tcPr>
           <w:p>
             <w:r>
@@ -2773,7 +3191,7 @@
         </w:tc>
         <w:tc>
           <w:tcPr>
-            <w:tcW w:type="dxa" w:w="1440"/>
+            <w:tcW w:type="dxa" w:w="1234"/>
           </w:tcPr>
           <w:p>
             <w:r>
@@ -2786,7 +3204,7 @@
         </w:tc>
         <w:tc>
           <w:tcPr>
-            <w:tcW w:type="dxa" w:w="1440"/>
+            <w:tcW w:type="dxa" w:w="1234"/>
           </w:tcPr>
           <w:p>
             <w:r>
@@ -2799,7 +3217,20 @@
         </w:tc>
         <w:tc>
           <w:tcPr>
-            <w:tcW w:type="dxa" w:w="1440"/>
+            <w:tcW w:type="dxa" w:w="1234"/>
+          </w:tcPr>
+          <w:p>
+            <w:r>
+              <w:rPr>
+                <w:sz w:val="14"/>
+              </w:rPr>
+              <w:t>nan</w:t>
+            </w:r>
+          </w:p>
+        </w:tc>
+        <w:tc>
+          <w:tcPr>
+            <w:tcW w:type="dxa" w:w="1234"/>
           </w:tcPr>
           <w:p>
             <w:r>
@@ -2814,7 +3245,7 @@
       <w:tr>
         <w:tc>
           <w:tcPr>
-            <w:tcW w:type="dxa" w:w="1440"/>
+            <w:tcW w:type="dxa" w:w="1234"/>
           </w:tcPr>
           <w:p>
             <w:r>
@@ -2827,7 +3258,7 @@
         </w:tc>
         <w:tc>
           <w:tcPr>
-            <w:tcW w:type="dxa" w:w="1440"/>
+            <w:tcW w:type="dxa" w:w="1234"/>
           </w:tcPr>
           <w:p>
             <w:r>
@@ -2840,7 +3271,7 @@
         </w:tc>
         <w:tc>
           <w:tcPr>
-            <w:tcW w:type="dxa" w:w="1440"/>
+            <w:tcW w:type="dxa" w:w="1234"/>
           </w:tcPr>
           <w:p>
             <w:r>
@@ -2853,7 +3284,7 @@
         </w:tc>
         <w:tc>
           <w:tcPr>
-            <w:tcW w:type="dxa" w:w="1440"/>
+            <w:tcW w:type="dxa" w:w="1234"/>
           </w:tcPr>
           <w:p>
             <w:r>
@@ -2866,7 +3297,7 @@
         </w:tc>
         <w:tc>
           <w:tcPr>
-            <w:tcW w:type="dxa" w:w="1440"/>
+            <w:tcW w:type="dxa" w:w="1234"/>
           </w:tcPr>
           <w:p>
             <w:r>
@@ -2879,7 +3310,20 @@
         </w:tc>
         <w:tc>
           <w:tcPr>
-            <w:tcW w:type="dxa" w:w="1440"/>
+            <w:tcW w:type="dxa" w:w="1234"/>
+          </w:tcPr>
+          <w:p>
+            <w:r>
+              <w:rPr>
+                <w:sz w:val="14"/>
+              </w:rPr>
+              <w:t>nan</w:t>
+            </w:r>
+          </w:p>
+        </w:tc>
+        <w:tc>
+          <w:tcPr>
+            <w:tcW w:type="dxa" w:w="1234"/>
           </w:tcPr>
           <w:p>
             <w:r>

</xml_diff>

<commit_message>
Clip steps at horizon, truncate exposure at reentry, split encounters across window gaps
decay_lifetime() bookkeeping fixes from review: the step is clipped to the
remaining horizon so a surviving object's lifetime is the requested horizon
exactly; a step that reaches reentry is retaken over the interval ending at
reentry so exposure and extra impulse are not accrued past reentry; and the
encounter-stitching flag is applied only between contiguous exposure
intervals, so two disjoint intervention windows count two encounters.
Regenerated all artifacts (make clean/all/quick, exit 0, QC all pass, 19
tests).

Co-Authored-By: Tatsuki Onishi <bougtoir@gmail.com>
</commit_message>
<xml_diff>
--- a/manuscript/manuscript.docx
+++ b/manuscript/manuscript.docx
@@ -4428,33 +4428,33 @@
               <w:rPr>
                 <w:sz w:val="14"/>
               </w:rPr>
-              <w:t>1827</w:t>
-            </w:r>
-          </w:p>
-        </w:tc>
-        <w:tc>
-          <w:tcPr>
-            <w:tcW w:type="dxa" w:w="960"/>
-          </w:tcPr>
-          <w:p>
-            <w:r>
-              <w:rPr>
-                <w:sz w:val="14"/>
-              </w:rPr>
-              <w:t>-0.1</w:t>
-            </w:r>
-          </w:p>
-        </w:tc>
-        <w:tc>
-          <w:tcPr>
-            <w:tcW w:type="dxa" w:w="960"/>
-          </w:tcPr>
-          <w:p>
-            <w:r>
-              <w:rPr>
-                <w:sz w:val="14"/>
-              </w:rPr>
-              <w:t>0.0053</w:t>
+              <w:t>1826</w:t>
+            </w:r>
+          </w:p>
+        </w:tc>
+        <w:tc>
+          <w:tcPr>
+            <w:tcW w:type="dxa" w:w="960"/>
+          </w:tcPr>
+          <w:p>
+            <w:r>
+              <w:rPr>
+                <w:sz w:val="14"/>
+              </w:rPr>
+              <w:t>0</w:t>
+            </w:r>
+          </w:p>
+        </w:tc>
+        <w:tc>
+          <w:tcPr>
+            <w:tcW w:type="dxa" w:w="960"/>
+          </w:tcPr>
+          <w:p>
+            <w:r>
+              <w:rPr>
+                <w:sz w:val="14"/>
+              </w:rPr>
+              <w:t>0.002375</w:t>
             </w:r>
           </w:p>
         </w:tc>
@@ -4785,33 +4785,33 @@
               <w:rPr>
                 <w:sz w:val="14"/>
               </w:rPr>
-              <w:t>1827</w:t>
-            </w:r>
-          </w:p>
-        </w:tc>
-        <w:tc>
-          <w:tcPr>
-            <w:tcW w:type="dxa" w:w="960"/>
-          </w:tcPr>
-          <w:p>
-            <w:r>
-              <w:rPr>
-                <w:sz w:val="14"/>
-              </w:rPr>
-              <w:t>-0.1</w:t>
-            </w:r>
-          </w:p>
-        </w:tc>
-        <w:tc>
-          <w:tcPr>
-            <w:tcW w:type="dxa" w:w="960"/>
-          </w:tcPr>
-          <w:p>
-            <w:r>
-              <w:rPr>
-                <w:sz w:val="14"/>
-              </w:rPr>
-              <w:t>0.02447</w:t>
+              <w:t>1826</w:t>
+            </w:r>
+          </w:p>
+        </w:tc>
+        <w:tc>
+          <w:tcPr>
+            <w:tcW w:type="dxa" w:w="960"/>
+          </w:tcPr>
+          <w:p>
+            <w:r>
+              <w:rPr>
+                <w:sz w:val="14"/>
+              </w:rPr>
+              <w:t>0</w:t>
+            </w:r>
+          </w:p>
+        </w:tc>
+        <w:tc>
+          <w:tcPr>
+            <w:tcW w:type="dxa" w:w="960"/>
+          </w:tcPr>
+          <w:p>
+            <w:r>
+              <w:rPr>
+                <w:sz w:val="14"/>
+              </w:rPr>
+              <w:t>0.008009</w:t>
             </w:r>
           </w:p>
         </w:tc>
@@ -4930,7 +4930,7 @@
               <w:rPr>
                 <w:sz w:val="14"/>
               </w:rPr>
-              <w:t>0.0002915</w:t>
+              <w:t>0.0003025</w:t>
             </w:r>
           </w:p>
         </w:tc>
@@ -9426,33 +9426,33 @@
               <w:rPr>
                 <w:sz w:val="14"/>
               </w:rPr>
-              <w:t>1827</w:t>
-            </w:r>
-          </w:p>
-        </w:tc>
-        <w:tc>
-          <w:tcPr>
-            <w:tcW w:type="dxa" w:w="960"/>
-          </w:tcPr>
-          <w:p>
-            <w:r>
-              <w:rPr>
-                <w:sz w:val="14"/>
-              </w:rPr>
-              <w:t>-0.1</w:t>
-            </w:r>
-          </w:p>
-        </w:tc>
-        <w:tc>
-          <w:tcPr>
-            <w:tcW w:type="dxa" w:w="960"/>
-          </w:tcPr>
-          <w:p>
-            <w:r>
-              <w:rPr>
-                <w:sz w:val="14"/>
-              </w:rPr>
-              <w:t>0.001474</w:t>
+              <w:t>1826</w:t>
+            </w:r>
+          </w:p>
+        </w:tc>
+        <w:tc>
+          <w:tcPr>
+            <w:tcW w:type="dxa" w:w="960"/>
+          </w:tcPr>
+          <w:p>
+            <w:r>
+              <w:rPr>
+                <w:sz w:val="14"/>
+              </w:rPr>
+              <w:t>0</w:t>
+            </w:r>
+          </w:p>
+        </w:tc>
+        <w:tc>
+          <w:tcPr>
+            <w:tcW w:type="dxa" w:w="960"/>
+          </w:tcPr>
+          <w:p>
+            <w:r>
+              <w:rPr>
+                <w:sz w:val="14"/>
+              </w:rPr>
+              <w:t>-0.0001137</w:t>
             </w:r>
           </w:p>
         </w:tc>
@@ -9571,7 +9571,7 @@
               <w:rPr>
                 <w:sz w:val="14"/>
               </w:rPr>
-              <w:t>-9.921e-05</w:t>
+              <w:t>-9.754e-05</w:t>
             </w:r>
           </w:p>
         </w:tc>
@@ -10497,33 +10497,33 @@
               <w:rPr>
                 <w:sz w:val="14"/>
               </w:rPr>
-              <w:t>1827</w:t>
-            </w:r>
-          </w:p>
-        </w:tc>
-        <w:tc>
-          <w:tcPr>
-            <w:tcW w:type="dxa" w:w="960"/>
-          </w:tcPr>
-          <w:p>
-            <w:r>
-              <w:rPr>
-                <w:sz w:val="14"/>
-              </w:rPr>
-              <w:t>-0.1</w:t>
-            </w:r>
-          </w:p>
-        </w:tc>
-        <w:tc>
-          <w:tcPr>
-            <w:tcW w:type="dxa" w:w="960"/>
-          </w:tcPr>
-          <w:p>
-            <w:r>
-              <w:rPr>
-                <w:sz w:val="14"/>
-              </w:rPr>
-              <w:t>0.0005065</w:t>
+              <w:t>1826</w:t>
+            </w:r>
+          </w:p>
+        </w:tc>
+        <w:tc>
+          <w:tcPr>
+            <w:tcW w:type="dxa" w:w="960"/>
+          </w:tcPr>
+          <w:p>
+            <w:r>
+              <w:rPr>
+                <w:sz w:val="14"/>
+              </w:rPr>
+              <w:t>0</w:t>
+            </w:r>
+          </w:p>
+        </w:tc>
+        <w:tc>
+          <w:tcPr>
+            <w:tcW w:type="dxa" w:w="960"/>
+          </w:tcPr>
+          <w:p>
+            <w:r>
+              <w:rPr>
+                <w:sz w:val="14"/>
+              </w:rPr>
+              <w:t>-6.463e-05</w:t>
             </w:r>
           </w:p>
         </w:tc>
@@ -10642,7 +10642,7 @@
               <w:rPr>
                 <w:sz w:val="14"/>
               </w:rPr>
-              <w:t>0.01972</w:t>
+              <w:t>0.0197</w:t>
             </w:r>
           </w:p>
         </w:tc>
@@ -10854,33 +10854,33 @@
               <w:rPr>
                 <w:sz w:val="14"/>
               </w:rPr>
-              <w:t>1827</w:t>
-            </w:r>
-          </w:p>
-        </w:tc>
-        <w:tc>
-          <w:tcPr>
-            <w:tcW w:type="dxa" w:w="960"/>
-          </w:tcPr>
-          <w:p>
-            <w:r>
-              <w:rPr>
-                <w:sz w:val="14"/>
-              </w:rPr>
-              <w:t>-0.1</w:t>
-            </w:r>
-          </w:p>
-        </w:tc>
-        <w:tc>
-          <w:tcPr>
-            <w:tcW w:type="dxa" w:w="960"/>
-          </w:tcPr>
-          <w:p>
-            <w:r>
-              <w:rPr>
-                <w:sz w:val="14"/>
-              </w:rPr>
-              <w:t>9.628e-05</w:t>
+              <w:t>1826</w:t>
+            </w:r>
+          </w:p>
+        </w:tc>
+        <w:tc>
+          <w:tcPr>
+            <w:tcW w:type="dxa" w:w="960"/>
+          </w:tcPr>
+          <w:p>
+            <w:r>
+              <w:rPr>
+                <w:sz w:val="14"/>
+              </w:rPr>
+              <w:t>0</w:t>
+            </w:r>
+          </w:p>
+        </w:tc>
+        <w:tc>
+          <w:tcPr>
+            <w:tcW w:type="dxa" w:w="960"/>
+          </w:tcPr>
+          <w:p>
+            <w:r>
+              <w:rPr>
+                <w:sz w:val="14"/>
+              </w:rPr>
+              <w:t>5.24e-06</w:t>
             </w:r>
           </w:p>
         </w:tc>
@@ -10999,7 +10999,7 @@
               <w:rPr>
                 <w:sz w:val="14"/>
               </w:rPr>
-              <w:t>4.181e-05</w:t>
+              <w:t>4.183e-05</w:t>
             </w:r>
           </w:p>
         </w:tc>
@@ -12710,7 +12710,7 @@
               <w:rPr>
                 <w:sz w:val="14"/>
               </w:rPr>
-              <w:t>65.14</w:t>
+              <w:t>64.17</w:t>
             </w:r>
           </w:p>
         </w:tc>
@@ -12762,7 +12762,7 @@
               <w:rPr>
                 <w:sz w:val="14"/>
               </w:rPr>
-              <w:t>4.93962</w:t>
+              <w:t>4.8655</w:t>
             </w:r>
           </w:p>
         </w:tc>
@@ -16081,7 +16081,7 @@
               <w:rPr>
                 <w:sz w:val="14"/>
               </w:rPr>
-              <w:t>0.07037</w:t>
+              <w:t>0.1461</w:t>
             </w:r>
           </w:p>
         </w:tc>
@@ -16174,20 +16174,20 @@
               <w:rPr>
                 <w:sz w:val="14"/>
               </w:rPr>
-              <w:t>65.14</w:t>
-            </w:r>
-          </w:p>
-        </w:tc>
-        <w:tc>
-          <w:tcPr>
-            <w:tcW w:type="dxa" w:w="1080"/>
-          </w:tcPr>
-          <w:p>
-            <w:r>
-              <w:rPr>
-                <w:sz w:val="14"/>
-              </w:rPr>
-              <w:t>1.162</w:t>
+              <w:t>64.17</w:t>
+            </w:r>
+          </w:p>
+        </w:tc>
+        <w:tc>
+          <w:tcPr>
+            <w:tcW w:type="dxa" w:w="1080"/>
+          </w:tcPr>
+          <w:p>
+            <w:r>
+              <w:rPr>
+                <w:sz w:val="14"/>
+              </w:rPr>
+              <w:t>1.16</w:t>
             </w:r>
           </w:p>
         </w:tc>
@@ -17010,7 +17010,7 @@
               <w:rPr>
                 <w:sz w:val="14"/>
               </w:rPr>
-              <w:t>0.05861</w:t>
+              <w:t>0.05468</w:t>
             </w:r>
           </w:p>
         </w:tc>
@@ -17023,7 +17023,7 @@
               <w:rPr>
                 <w:sz w:val="14"/>
               </w:rPr>
-              <w:t>0.0537</w:t>
+              <w:t>0.05386</w:t>
             </w:r>
           </w:p>
         </w:tc>
@@ -17077,7 +17077,7 @@
               <w:rPr>
                 <w:sz w:val="14"/>
               </w:rPr>
-              <w:t>0.035</w:t>
+              <w:t>0.03193</w:t>
             </w:r>
           </w:p>
         </w:tc>
@@ -17090,7 +17090,7 @@
               <w:rPr>
                 <w:sz w:val="14"/>
               </w:rPr>
-              <w:t>0.02049</w:t>
+              <w:t>0.01948</w:t>
             </w:r>
           </w:p>
         </w:tc>
@@ -17144,7 +17144,7 @@
               <w:rPr>
                 <w:sz w:val="14"/>
               </w:rPr>
-              <w:t>0.002869</w:t>
+              <w:t>0.002622</w:t>
             </w:r>
           </w:p>
         </w:tc>
@@ -17157,7 +17157,7 @@
               <w:rPr>
                 <w:sz w:val="14"/>
               </w:rPr>
-              <w:t>0.0003433</w:t>
+              <w:t>0.0002548</w:t>
             </w:r>
           </w:p>
         </w:tc>
@@ -17211,7 +17211,7 @@
               <w:rPr>
                 <w:sz w:val="14"/>
               </w:rPr>
-              <w:t>0.01509</w:t>
+              <w:t>0.01419</w:t>
             </w:r>
           </w:p>
         </w:tc>
@@ -17224,7 +17224,7 @@
               <w:rPr>
                 <w:sz w:val="14"/>
               </w:rPr>
-              <w:t>0.002551</w:t>
+              <w:t>0.002403</w:t>
             </w:r>
           </w:p>
         </w:tc>
@@ -17278,7 +17278,7 @@
               <w:rPr>
                 <w:sz w:val="14"/>
               </w:rPr>
-              <w:t>0.009009</w:t>
+              <w:t>0.009213</w:t>
             </w:r>
           </w:p>
         </w:tc>
@@ -17291,7 +17291,7 @@
               <w:rPr>
                 <w:sz w:val="14"/>
               </w:rPr>
-              <w:t>0.0009784</w:t>
+              <w:t>0.001089</w:t>
             </w:r>
           </w:p>
         </w:tc>
@@ -17345,7 +17345,7 @@
               <w:rPr>
                 <w:sz w:val="14"/>
               </w:rPr>
-              <w:t>0.04681</w:t>
+              <w:t>0.05051</w:t>
             </w:r>
           </w:p>
         </w:tc>
@@ -17358,7 +17358,7 @@
               <w:rPr>
                 <w:sz w:val="14"/>
               </w:rPr>
-              <w:t>0.03667</w:t>
+              <w:t>0.04325</w:t>
             </w:r>
           </w:p>
         </w:tc>
@@ -18017,7 +18017,7 @@
     </w:p>
     <w:p>
       <w:r>
-        <w:t>Simulated delta-v collapses onto Pi = dv B/(rho delta v_rel^2 T) = 1.14 ± 1.58 across regimes, altitudes and B, with a log-log slope of 1.01 and R^2 = 0.9995. The expected value is 1/2 from a = rho v_rel^2/(2B) and is recovered once the factor of two and the corotation correction are carried consistently; the collapse is therefore a dimensional reduction and an internal-consistency check, not independent validation, because the simulator and the predictor share the same drag equation. Its value is that it lets any other choice of delta, duration, density regime and ballistic coefficient be evaluated without rerunning the simulation (Fig. 6).</w:t>
+        <w:t>Simulated delta-v collapses onto Pi = dv B/(rho delta v_rel^2 T) = 1.06 ± 0.24 across regimes, altitudes and B, with a log-log slope of 1.01 and R^2 = 0.9995. The expected value is 1/2 from a = rho v_rel^2/(2B) and is recovered once the factor of two and the corotation correction are carried consistently; the collapse is therefore a dimensional reduction and an internal-consistency check, not independent validation, because the simulator and the predictor share the same drag equation. Its value is that it lets any other choice of delta, duration, density regime and ballistic coefficient be evaluated without rerunning the simulation (Fig. 6).</w:t>
       </w:r>
     </w:p>
     <w:p>

</xml_diff>

<commit_message>
Treat a shortened reentry step that stays in orbit as an ordinary step
A step whose full length predicted reentry was retaken over the shortened interval, but the reentry flag was set before the retake. If the retake, evaluated at a higher mid-step altitude and therefore a slower decay rate, no longer crossed the reentry altitude, the object was still clamped to that altitude and the integration stopped early. The flag is now derived inside each attempt, and a reentry tolerance of 10 m keeps the geometrically shrinking retakes from stalling just above the reentry altitude. All artifacts regenerated.

Co-Authored-By: Tatsuki Onishi <bougtoir@gmail.com>
</commit_message>
<xml_diff>
--- a/manuscript/manuscript.docx
+++ b/manuscript/manuscript.docx
@@ -3595,7 +3595,7 @@
               <w:rPr>
                 <w:sz w:val="14"/>
               </w:rPr>
-              <w:t>21.11</w:t>
+              <w:t>21.12</w:t>
             </w:r>
           </w:p>
         </w:tc>
@@ -3714,33 +3714,33 @@
               <w:rPr>
                 <w:sz w:val="14"/>
               </w:rPr>
-              <w:t>21.89</w:t>
-            </w:r>
-          </w:p>
-        </w:tc>
-        <w:tc>
-          <w:tcPr>
-            <w:tcW w:type="dxa" w:w="960"/>
-          </w:tcPr>
-          <w:p>
-            <w:r>
-              <w:rPr>
-                <w:sz w:val="14"/>
-              </w:rPr>
-              <w:t>-0.7816</w:t>
-            </w:r>
-          </w:p>
-        </w:tc>
-        <w:tc>
-          <w:tcPr>
-            <w:tcW w:type="dxa" w:w="960"/>
-          </w:tcPr>
-          <w:p>
-            <w:r>
-              <w:rPr>
-                <w:sz w:val="14"/>
-              </w:rPr>
-              <w:t>0</w:t>
+              <w:t>21.9</w:t>
+            </w:r>
+          </w:p>
+        </w:tc>
+        <w:tc>
+          <w:tcPr>
+            <w:tcW w:type="dxa" w:w="960"/>
+          </w:tcPr>
+          <w:p>
+            <w:r>
+              <w:rPr>
+                <w:sz w:val="14"/>
+              </w:rPr>
+              <w:t>-0.7758</w:t>
+            </w:r>
+          </w:p>
+        </w:tc>
+        <w:tc>
+          <w:tcPr>
+            <w:tcW w:type="dxa" w:w="960"/>
+          </w:tcPr>
+          <w:p>
+            <w:r>
+              <w:rPr>
+                <w:sz w:val="14"/>
+              </w:rPr>
+              <w:t>0.007389</w:t>
             </w:r>
           </w:p>
         </w:tc>
@@ -3846,20 +3846,20 @@
               <w:rPr>
                 <w:sz w:val="14"/>
               </w:rPr>
-              <w:t>2.217</w:t>
-            </w:r>
-          </w:p>
-        </w:tc>
-        <w:tc>
-          <w:tcPr>
-            <w:tcW w:type="dxa" w:w="960"/>
-          </w:tcPr>
-          <w:p>
-            <w:r>
-              <w:rPr>
-                <w:sz w:val="14"/>
-              </w:rPr>
-              <w:t>0</w:t>
+              <w:t>2.226</w:t>
+            </w:r>
+          </w:p>
+        </w:tc>
+        <w:tc>
+          <w:tcPr>
+            <w:tcW w:type="dxa" w:w="960"/>
+          </w:tcPr>
+          <w:p>
+            <w:r>
+              <w:rPr>
+                <w:sz w:val="14"/>
+              </w:rPr>
+              <w:t>0.003729</w:t>
             </w:r>
           </w:p>
         </w:tc>
@@ -4084,20 +4084,20 @@
               <w:rPr>
                 <w:sz w:val="14"/>
               </w:rPr>
-              <w:t>3.381</w:t>
-            </w:r>
-          </w:p>
-        </w:tc>
-        <w:tc>
-          <w:tcPr>
-            <w:tcW w:type="dxa" w:w="960"/>
-          </w:tcPr>
-          <w:p>
-            <w:r>
-              <w:rPr>
-                <w:sz w:val="14"/>
-              </w:rPr>
-              <w:t>0</w:t>
+              <w:t>3.394</w:t>
+            </w:r>
+          </w:p>
+        </w:tc>
+        <w:tc>
+          <w:tcPr>
+            <w:tcW w:type="dxa" w:w="960"/>
+          </w:tcPr>
+          <w:p>
+            <w:r>
+              <w:rPr>
+                <w:sz w:val="14"/>
+              </w:rPr>
+              <w:t>0.001361</w:t>
             </w:r>
           </w:p>
         </w:tc>
@@ -4190,33 +4190,33 @@
               <w:rPr>
                 <w:sz w:val="14"/>
               </w:rPr>
-              <w:t>342</w:t>
-            </w:r>
-          </w:p>
-        </w:tc>
-        <w:tc>
-          <w:tcPr>
-            <w:tcW w:type="dxa" w:w="960"/>
-          </w:tcPr>
-          <w:p>
-            <w:r>
-              <w:rPr>
-                <w:sz w:val="14"/>
-              </w:rPr>
-              <w:t>-0.0314</w:t>
-            </w:r>
-          </w:p>
-        </w:tc>
-        <w:tc>
-          <w:tcPr>
-            <w:tcW w:type="dxa" w:w="960"/>
-          </w:tcPr>
-          <w:p>
-            <w:r>
-              <w:rPr>
-                <w:sz w:val="14"/>
-              </w:rPr>
-              <w:t>0</w:t>
+              <w:t>342.1</w:t>
+            </w:r>
+          </w:p>
+        </w:tc>
+        <w:tc>
+          <w:tcPr>
+            <w:tcW w:type="dxa" w:w="960"/>
+          </w:tcPr>
+          <w:p>
+            <w:r>
+              <w:rPr>
+                <w:sz w:val="14"/>
+              </w:rPr>
+              <w:t>-0.05378</w:t>
+            </w:r>
+          </w:p>
+        </w:tc>
+        <w:tc>
+          <w:tcPr>
+            <w:tcW w:type="dxa" w:w="960"/>
+          </w:tcPr>
+          <w:p>
+            <w:r>
+              <w:rPr>
+                <w:sz w:val="14"/>
+              </w:rPr>
+              <w:t>-0.0008486</w:t>
             </w:r>
           </w:p>
         </w:tc>
@@ -5023,7 +5023,7 @@
               <w:rPr>
                 <w:sz w:val="14"/>
               </w:rPr>
-              <w:t>78.04</w:t>
+              <w:t>78.06</w:t>
             </w:r>
           </w:p>
         </w:tc>
@@ -5142,33 +5142,33 @@
               <w:rPr>
                 <w:sz w:val="14"/>
               </w:rPr>
-              <w:t>79.1</w:t>
-            </w:r>
-          </w:p>
-        </w:tc>
-        <w:tc>
-          <w:tcPr>
-            <w:tcW w:type="dxa" w:w="960"/>
-          </w:tcPr>
-          <w:p>
-            <w:r>
-              <w:rPr>
-                <w:sz w:val="14"/>
-              </w:rPr>
-              <w:t>-1.06</w:t>
-            </w:r>
-          </w:p>
-        </w:tc>
-        <w:tc>
-          <w:tcPr>
-            <w:tcW w:type="dxa" w:w="960"/>
-          </w:tcPr>
-          <w:p>
-            <w:r>
-              <w:rPr>
-                <w:sz w:val="14"/>
-              </w:rPr>
-              <w:t>0</w:t>
+              <w:t>79.11</w:t>
+            </w:r>
+          </w:p>
+        </w:tc>
+        <w:tc>
+          <w:tcPr>
+            <w:tcW w:type="dxa" w:w="960"/>
+          </w:tcPr>
+          <w:p>
+            <w:r>
+              <w:rPr>
+                <w:sz w:val="14"/>
+              </w:rPr>
+              <w:t>-1.045</w:t>
+            </w:r>
+          </w:p>
+        </w:tc>
+        <w:tc>
+          <w:tcPr>
+            <w:tcW w:type="dxa" w:w="960"/>
+          </w:tcPr>
+          <w:p>
+            <w:r>
+              <w:rPr>
+                <w:sz w:val="14"/>
+              </w:rPr>
+              <w:t>0.002747</w:t>
             </w:r>
           </w:p>
         </w:tc>
@@ -5274,20 +5274,20 @@
               <w:rPr>
                 <w:sz w:val="14"/>
               </w:rPr>
-              <w:t>3.143</w:t>
-            </w:r>
-          </w:p>
-        </w:tc>
-        <w:tc>
-          <w:tcPr>
-            <w:tcW w:type="dxa" w:w="960"/>
-          </w:tcPr>
-          <w:p>
-            <w:r>
-              <w:rPr>
-                <w:sz w:val="14"/>
-              </w:rPr>
-              <w:t>0</w:t>
+              <w:t>3.161</w:t>
+            </w:r>
+          </w:p>
+        </w:tc>
+        <w:tc>
+          <w:tcPr>
+            <w:tcW w:type="dxa" w:w="960"/>
+          </w:tcPr>
+          <w:p>
+            <w:r>
+              <w:rPr>
+                <w:sz w:val="14"/>
+              </w:rPr>
+              <w:t>-0.005849</w:t>
             </w:r>
           </w:p>
         </w:tc>
@@ -5512,20 +5512,20 @@
               <w:rPr>
                 <w:sz w:val="14"/>
               </w:rPr>
-              <w:t>1.066</w:t>
-            </w:r>
-          </w:p>
-        </w:tc>
-        <w:tc>
-          <w:tcPr>
-            <w:tcW w:type="dxa" w:w="960"/>
-          </w:tcPr>
-          <w:p>
-            <w:r>
-              <w:rPr>
-                <w:sz w:val="14"/>
-              </w:rPr>
-              <w:t>0</w:t>
+              <w:t>1.051</w:t>
+            </w:r>
+          </w:p>
+        </w:tc>
+        <w:tc>
+          <w:tcPr>
+            <w:tcW w:type="dxa" w:w="960"/>
+          </w:tcPr>
+          <w:p>
+            <w:r>
+              <w:rPr>
+                <w:sz w:val="14"/>
+              </w:rPr>
+              <w:t>0.0001953</w:t>
             </w:r>
           </w:p>
         </w:tc>
@@ -5631,20 +5631,20 @@
               <w:rPr>
                 <w:sz w:val="14"/>
               </w:rPr>
-              <w:t>0.1053</w:t>
-            </w:r>
-          </w:p>
-        </w:tc>
-        <w:tc>
-          <w:tcPr>
-            <w:tcW w:type="dxa" w:w="960"/>
-          </w:tcPr>
-          <w:p>
-            <w:r>
-              <w:rPr>
-                <w:sz w:val="14"/>
-              </w:rPr>
-              <w:t>0</w:t>
+              <w:t>0.1046</w:t>
+            </w:r>
+          </w:p>
+        </w:tc>
+        <w:tc>
+          <w:tcPr>
+            <w:tcW w:type="dxa" w:w="960"/>
+          </w:tcPr>
+          <w:p>
+            <w:r>
+              <w:rPr>
+                <w:sz w:val="14"/>
+              </w:rPr>
+              <w:t>0.0005647</w:t>
             </w:r>
           </w:p>
         </w:tc>
@@ -5856,33 +5856,33 @@
               <w:rPr>
                 <w:sz w:val="14"/>
               </w:rPr>
-              <w:t>163.1</w:t>
-            </w:r>
-          </w:p>
-        </w:tc>
-        <w:tc>
-          <w:tcPr>
-            <w:tcW w:type="dxa" w:w="960"/>
-          </w:tcPr>
-          <w:p>
-            <w:r>
-              <w:rPr>
-                <w:sz w:val="14"/>
-              </w:rPr>
-              <w:t>1.45</w:t>
-            </w:r>
-          </w:p>
-        </w:tc>
-        <w:tc>
-          <w:tcPr>
-            <w:tcW w:type="dxa" w:w="960"/>
-          </w:tcPr>
-          <w:p>
-            <w:r>
-              <w:rPr>
-                <w:sz w:val="14"/>
-              </w:rPr>
-              <w:t>0</w:t>
+              <w:t>163.2</w:t>
+            </w:r>
+          </w:p>
+        </w:tc>
+        <w:tc>
+          <w:tcPr>
+            <w:tcW w:type="dxa" w:w="960"/>
+          </w:tcPr>
+          <w:p>
+            <w:r>
+              <w:rPr>
+                <w:sz w:val="14"/>
+              </w:rPr>
+              <w:t>1.453</w:t>
+            </w:r>
+          </w:p>
+        </w:tc>
+        <w:tc>
+          <w:tcPr>
+            <w:tcW w:type="dxa" w:w="960"/>
+          </w:tcPr>
+          <w:p>
+            <w:r>
+              <w:rPr>
+                <w:sz w:val="14"/>
+              </w:rPr>
+              <w:t>0.0001385</w:t>
             </w:r>
           </w:p>
         </w:tc>
@@ -5988,20 +5988,20 @@
               <w:rPr>
                 <w:sz w:val="14"/>
               </w:rPr>
-              <w:t>0.001729</w:t>
-            </w:r>
-          </w:p>
-        </w:tc>
-        <w:tc>
-          <w:tcPr>
-            <w:tcW w:type="dxa" w:w="960"/>
-          </w:tcPr>
-          <w:p>
-            <w:r>
-              <w:rPr>
-                <w:sz w:val="14"/>
-              </w:rPr>
-              <w:t>0</w:t>
+              <w:t>0.00617</w:t>
+            </w:r>
+          </w:p>
+        </w:tc>
+        <w:tc>
+          <w:tcPr>
+            <w:tcW w:type="dxa" w:w="960"/>
+          </w:tcPr>
+          <w:p>
+            <w:r>
+              <w:rPr>
+                <w:sz w:val="14"/>
+              </w:rPr>
+              <w:t>0.0005486</w:t>
             </w:r>
           </w:p>
         </w:tc>
@@ -6094,7 +6094,7 @@
               <w:rPr>
                 <w:sz w:val="14"/>
               </w:rPr>
-              <w:t>218</w:t>
+              <w:t>218.1</w:t>
             </w:r>
           </w:p>
         </w:tc>
@@ -6226,20 +6226,20 @@
               <w:rPr>
                 <w:sz w:val="14"/>
               </w:rPr>
-              <w:t>1.578</w:t>
-            </w:r>
-          </w:p>
-        </w:tc>
-        <w:tc>
-          <w:tcPr>
-            <w:tcW w:type="dxa" w:w="960"/>
-          </w:tcPr>
-          <w:p>
-            <w:r>
-              <w:rPr>
-                <w:sz w:val="14"/>
-              </w:rPr>
-              <w:t>0</w:t>
+              <w:t>1.604</w:t>
+            </w:r>
+          </w:p>
+        </w:tc>
+        <w:tc>
+          <w:tcPr>
+            <w:tcW w:type="dxa" w:w="960"/>
+          </w:tcPr>
+          <w:p>
+            <w:r>
+              <w:rPr>
+                <w:sz w:val="14"/>
+              </w:rPr>
+              <w:t>0.0004985</w:t>
             </w:r>
           </w:p>
         </w:tc>
@@ -6345,20 +6345,20 @@
               <w:rPr>
                 <w:sz w:val="14"/>
               </w:rPr>
-              <w:t>0.01384</w:t>
-            </w:r>
-          </w:p>
-        </w:tc>
-        <w:tc>
-          <w:tcPr>
-            <w:tcW w:type="dxa" w:w="960"/>
-          </w:tcPr>
-          <w:p>
-            <w:r>
-              <w:rPr>
-                <w:sz w:val="14"/>
-              </w:rPr>
-              <w:t>0</w:t>
+              <w:t>0.01795</w:t>
+            </w:r>
+          </w:p>
+        </w:tc>
+        <w:tc>
+          <w:tcPr>
+            <w:tcW w:type="dxa" w:w="960"/>
+          </w:tcPr>
+          <w:p>
+            <w:r>
+              <w:rPr>
+                <w:sz w:val="14"/>
+              </w:rPr>
+              <w:t>0.002059</w:t>
             </w:r>
           </w:p>
         </w:tc>
@@ -6451,7 +6451,7 @@
               <w:rPr>
                 <w:sz w:val="14"/>
               </w:rPr>
-              <w:t>279.8</w:t>
+              <w:t>279.9</w:t>
             </w:r>
           </w:p>
         </w:tc>
@@ -6583,20 +6583,20 @@
               <w:rPr>
                 <w:sz w:val="14"/>
               </w:rPr>
-              <w:t>1.693</w:t>
-            </w:r>
-          </w:p>
-        </w:tc>
-        <w:tc>
-          <w:tcPr>
-            <w:tcW w:type="dxa" w:w="960"/>
-          </w:tcPr>
-          <w:p>
-            <w:r>
-              <w:rPr>
-                <w:sz w:val="14"/>
-              </w:rPr>
-              <w:t>0</w:t>
+              <w:t>1.676</w:t>
+            </w:r>
+          </w:p>
+        </w:tc>
+        <w:tc>
+          <w:tcPr>
+            <w:tcW w:type="dxa" w:w="960"/>
+          </w:tcPr>
+          <w:p>
+            <w:r>
+              <w:rPr>
+                <w:sz w:val="14"/>
+              </w:rPr>
+              <w:t>0.002089</w:t>
             </w:r>
           </w:p>
         </w:tc>
@@ -6702,20 +6702,20 @@
               <w:rPr>
                 <w:sz w:val="14"/>
               </w:rPr>
-              <w:t>-0.1437</w:t>
-            </w:r>
-          </w:p>
-        </w:tc>
-        <w:tc>
-          <w:tcPr>
-            <w:tcW w:type="dxa" w:w="960"/>
-          </w:tcPr>
-          <w:p>
-            <w:r>
-              <w:rPr>
-                <w:sz w:val="14"/>
-              </w:rPr>
-              <w:t>0</w:t>
+              <w:t>-0.1368</w:t>
+            </w:r>
+          </w:p>
+        </w:tc>
+        <w:tc>
+          <w:tcPr>
+            <w:tcW w:type="dxa" w:w="960"/>
+          </w:tcPr>
+          <w:p>
+            <w:r>
+              <w:rPr>
+                <w:sz w:val="14"/>
+              </w:rPr>
+              <w:t>0.002128</w:t>
             </w:r>
           </w:p>
         </w:tc>
@@ -6940,20 +6940,20 @@
               <w:rPr>
                 <w:sz w:val="14"/>
               </w:rPr>
-              <w:t>-0.8247</w:t>
-            </w:r>
-          </w:p>
-        </w:tc>
-        <w:tc>
-          <w:tcPr>
-            <w:tcW w:type="dxa" w:w="960"/>
-          </w:tcPr>
-          <w:p>
-            <w:r>
-              <w:rPr>
-                <w:sz w:val="14"/>
-              </w:rPr>
-              <w:t>0</w:t>
+              <w:t>-0.8284</w:t>
+            </w:r>
+          </w:p>
+        </w:tc>
+        <w:tc>
+          <w:tcPr>
+            <w:tcW w:type="dxa" w:w="960"/>
+          </w:tcPr>
+          <w:p>
+            <w:r>
+              <w:rPr>
+                <w:sz w:val="14"/>
+              </w:rPr>
+              <w:t>-0.008707</w:t>
             </w:r>
           </w:p>
         </w:tc>
@@ -7059,20 +7059,20 @@
               <w:rPr>
                 <w:sz w:val="14"/>
               </w:rPr>
-              <w:t>0.0279</w:t>
-            </w:r>
-          </w:p>
-        </w:tc>
-        <w:tc>
-          <w:tcPr>
-            <w:tcW w:type="dxa" w:w="960"/>
-          </w:tcPr>
-          <w:p>
-            <w:r>
-              <w:rPr>
-                <w:sz w:val="14"/>
-              </w:rPr>
-              <w:t>0</w:t>
+              <w:t>0.03211</w:t>
+            </w:r>
+          </w:p>
+        </w:tc>
+        <w:tc>
+          <w:tcPr>
+            <w:tcW w:type="dxa" w:w="960"/>
+          </w:tcPr>
+          <w:p>
+            <w:r>
+              <w:rPr>
+                <w:sz w:val="14"/>
+              </w:rPr>
+              <w:t>-0.00116</w:t>
             </w:r>
           </w:p>
         </w:tc>
@@ -7297,20 +7297,20 @@
               <w:rPr>
                 <w:sz w:val="14"/>
               </w:rPr>
-              <w:t>-2.027</w:t>
-            </w:r>
-          </w:p>
-        </w:tc>
-        <w:tc>
-          <w:tcPr>
-            <w:tcW w:type="dxa" w:w="960"/>
-          </w:tcPr>
-          <w:p>
-            <w:r>
-              <w:rPr>
-                <w:sz w:val="14"/>
-              </w:rPr>
-              <w:t>0</w:t>
+              <w:t>-2.033</w:t>
+            </w:r>
+          </w:p>
+        </w:tc>
+        <w:tc>
+          <w:tcPr>
+            <w:tcW w:type="dxa" w:w="960"/>
+          </w:tcPr>
+          <w:p>
+            <w:r>
+              <w:rPr>
+                <w:sz w:val="14"/>
+              </w:rPr>
+              <w:t>-0.0007072</w:t>
             </w:r>
           </w:p>
         </w:tc>
@@ -7416,20 +7416,20 @@
               <w:rPr>
                 <w:sz w:val="14"/>
               </w:rPr>
-              <w:t>-0.1419</w:t>
-            </w:r>
-          </w:p>
-        </w:tc>
-        <w:tc>
-          <w:tcPr>
-            <w:tcW w:type="dxa" w:w="960"/>
-          </w:tcPr>
-          <w:p>
-            <w:r>
-              <w:rPr>
-                <w:sz w:val="14"/>
-              </w:rPr>
-              <w:t>0</w:t>
+              <w:t>-0.1295</w:t>
+            </w:r>
+          </w:p>
+        </w:tc>
+        <w:tc>
+          <w:tcPr>
+            <w:tcW w:type="dxa" w:w="960"/>
+          </w:tcPr>
+          <w:p>
+            <w:r>
+              <w:rPr>
+                <w:sz w:val="14"/>
+              </w:rPr>
+              <w:t>0.0002582</w:t>
             </w:r>
           </w:p>
         </w:tc>
@@ -7654,20 +7654,20 @@
               <w:rPr>
                 <w:sz w:val="14"/>
               </w:rPr>
-              <w:t>1.58</w:t>
-            </w:r>
-          </w:p>
-        </w:tc>
-        <w:tc>
-          <w:tcPr>
-            <w:tcW w:type="dxa" w:w="960"/>
-          </w:tcPr>
-          <w:p>
-            <w:r>
-              <w:rPr>
-                <w:sz w:val="14"/>
-              </w:rPr>
-              <w:t>0</w:t>
+              <w:t>1.588</w:t>
+            </w:r>
+          </w:p>
+        </w:tc>
+        <w:tc>
+          <w:tcPr>
+            <w:tcW w:type="dxa" w:w="960"/>
+          </w:tcPr>
+          <w:p>
+            <w:r>
+              <w:rPr>
+                <w:sz w:val="14"/>
+              </w:rPr>
+              <w:t>0.001809</w:t>
             </w:r>
           </w:p>
         </w:tc>
@@ -7773,20 +7773,20 @@
               <w:rPr>
                 <w:sz w:val="14"/>
               </w:rPr>
-              <w:t>0.09565</w:t>
-            </w:r>
-          </w:p>
-        </w:tc>
-        <w:tc>
-          <w:tcPr>
-            <w:tcW w:type="dxa" w:w="960"/>
-          </w:tcPr>
-          <w:p>
-            <w:r>
-              <w:rPr>
-                <w:sz w:val="14"/>
-              </w:rPr>
-              <w:t>0</w:t>
+              <w:t>0.077</w:t>
+            </w:r>
+          </w:p>
+        </w:tc>
+        <w:tc>
+          <w:tcPr>
+            <w:tcW w:type="dxa" w:w="960"/>
+          </w:tcPr>
+          <w:p>
+            <w:r>
+              <w:rPr>
+                <w:sz w:val="14"/>
+              </w:rPr>
+              <w:t>0.001845</w:t>
             </w:r>
           </w:p>
         </w:tc>
@@ -7879,7 +7879,7 @@
               <w:rPr>
                 <w:sz w:val="14"/>
               </w:rPr>
-              <w:t>409.5</w:t>
+              <w:t>409.6</w:t>
             </w:r>
           </w:p>
         </w:tc>
@@ -8011,20 +8011,20 @@
               <w:rPr>
                 <w:sz w:val="14"/>
               </w:rPr>
-              <w:t>1.353</w:t>
-            </w:r>
-          </w:p>
-        </w:tc>
-        <w:tc>
-          <w:tcPr>
-            <w:tcW w:type="dxa" w:w="960"/>
-          </w:tcPr>
-          <w:p>
-            <w:r>
-              <w:rPr>
-                <w:sz w:val="14"/>
-              </w:rPr>
-              <w:t>0</w:t>
+              <w:t>1.343</w:t>
+            </w:r>
+          </w:p>
+        </w:tc>
+        <w:tc>
+          <w:tcPr>
+            <w:tcW w:type="dxa" w:w="960"/>
+          </w:tcPr>
+          <w:p>
+            <w:r>
+              <w:rPr>
+                <w:sz w:val="14"/>
+              </w:rPr>
+              <w:t>0.001433</w:t>
             </w:r>
           </w:p>
         </w:tc>
@@ -8130,20 +8130,20 @@
               <w:rPr>
                 <w:sz w:val="14"/>
               </w:rPr>
-              <w:t>-0.04409</w:t>
-            </w:r>
-          </w:p>
-        </w:tc>
-        <w:tc>
-          <w:tcPr>
-            <w:tcW w:type="dxa" w:w="960"/>
-          </w:tcPr>
-          <w:p>
-            <w:r>
-              <w:rPr>
-                <w:sz w:val="14"/>
-              </w:rPr>
-              <w:t>0</w:t>
+              <w:t>-0.04675</w:t>
+            </w:r>
+          </w:p>
+        </w:tc>
+        <w:tc>
+          <w:tcPr>
+            <w:tcW w:type="dxa" w:w="960"/>
+          </w:tcPr>
+          <w:p>
+            <w:r>
+              <w:rPr>
+                <w:sz w:val="14"/>
+              </w:rPr>
+              <w:t>0.0002078</w:t>
             </w:r>
           </w:p>
         </w:tc>
@@ -8368,20 +8368,20 @@
               <w:rPr>
                 <w:sz w:val="14"/>
               </w:rPr>
-              <w:t>0.1976</w:t>
-            </w:r>
-          </w:p>
-        </w:tc>
-        <w:tc>
-          <w:tcPr>
-            <w:tcW w:type="dxa" w:w="960"/>
-          </w:tcPr>
-          <w:p>
-            <w:r>
-              <w:rPr>
-                <w:sz w:val="14"/>
-              </w:rPr>
-              <w:t>0</w:t>
+              <w:t>0.2059</w:t>
+            </w:r>
+          </w:p>
+        </w:tc>
+        <w:tc>
+          <w:tcPr>
+            <w:tcW w:type="dxa" w:w="960"/>
+          </w:tcPr>
+          <w:p>
+            <w:r>
+              <w:rPr>
+                <w:sz w:val="14"/>
+              </w:rPr>
+              <w:t>0.00202</w:t>
             </w:r>
           </w:p>
         </w:tc>
@@ -8487,20 +8487,20 @@
               <w:rPr>
                 <w:sz w:val="14"/>
               </w:rPr>
-              <w:t>-0.01461</w:t>
-            </w:r>
-          </w:p>
-        </w:tc>
-        <w:tc>
-          <w:tcPr>
-            <w:tcW w:type="dxa" w:w="960"/>
-          </w:tcPr>
-          <w:p>
-            <w:r>
-              <w:rPr>
-                <w:sz w:val="14"/>
-              </w:rPr>
-              <w:t>0</w:t>
+              <w:t>-0.01507</w:t>
+            </w:r>
+          </w:p>
+        </w:tc>
+        <w:tc>
+          <w:tcPr>
+            <w:tcW w:type="dxa" w:w="960"/>
+          </w:tcPr>
+          <w:p>
+            <w:r>
+              <w:rPr>
+                <w:sz w:val="14"/>
+              </w:rPr>
+              <w:t>-0.0001054</w:t>
             </w:r>
           </w:p>
         </w:tc>
@@ -8725,20 +8725,20 @@
               <w:rPr>
                 <w:sz w:val="14"/>
               </w:rPr>
-              <w:t>2.172</w:t>
-            </w:r>
-          </w:p>
-        </w:tc>
-        <w:tc>
-          <w:tcPr>
-            <w:tcW w:type="dxa" w:w="960"/>
-          </w:tcPr>
-          <w:p>
-            <w:r>
-              <w:rPr>
-                <w:sz w:val="14"/>
-              </w:rPr>
-              <w:t>0</w:t>
+              <w:t>2.182</w:t>
+            </w:r>
+          </w:p>
+        </w:tc>
+        <w:tc>
+          <w:tcPr>
+            <w:tcW w:type="dxa" w:w="960"/>
+          </w:tcPr>
+          <w:p>
+            <w:r>
+              <w:rPr>
+                <w:sz w:val="14"/>
+              </w:rPr>
+              <w:t>0.004523</w:t>
             </w:r>
           </w:p>
         </w:tc>
@@ -8844,20 +8844,20 @@
               <w:rPr>
                 <w:sz w:val="14"/>
               </w:rPr>
-              <w:t>0.04681</w:t>
-            </w:r>
-          </w:p>
-        </w:tc>
-        <w:tc>
-          <w:tcPr>
-            <w:tcW w:type="dxa" w:w="960"/>
-          </w:tcPr>
-          <w:p>
-            <w:r>
-              <w:rPr>
-                <w:sz w:val="14"/>
-              </w:rPr>
-              <w:t>0</w:t>
+              <w:t>0.07541</w:t>
+            </w:r>
+          </w:p>
+        </w:tc>
+        <w:tc>
+          <w:tcPr>
+            <w:tcW w:type="dxa" w:w="960"/>
+          </w:tcPr>
+          <w:p>
+            <w:r>
+              <w:rPr>
+                <w:sz w:val="14"/>
+              </w:rPr>
+              <w:t>-0.001774</w:t>
             </w:r>
           </w:p>
         </w:tc>
@@ -9082,20 +9082,20 @@
               <w:rPr>
                 <w:sz w:val="14"/>
               </w:rPr>
-              <w:t>-1.98</w:t>
-            </w:r>
-          </w:p>
-        </w:tc>
-        <w:tc>
-          <w:tcPr>
-            <w:tcW w:type="dxa" w:w="960"/>
-          </w:tcPr>
-          <w:p>
-            <w:r>
-              <w:rPr>
-                <w:sz w:val="14"/>
-              </w:rPr>
-              <w:t>0</w:t>
+              <w:t>-1.96</w:t>
+            </w:r>
+          </w:p>
+        </w:tc>
+        <w:tc>
+          <w:tcPr>
+            <w:tcW w:type="dxa" w:w="960"/>
+          </w:tcPr>
+          <w:p>
+            <w:r>
+              <w:rPr>
+                <w:sz w:val="14"/>
+              </w:rPr>
+              <w:t>7.901e-05</w:t>
             </w:r>
           </w:p>
         </w:tc>
@@ -9201,20 +9201,20 @@
               <w:rPr>
                 <w:sz w:val="14"/>
               </w:rPr>
-              <w:t>4.08</w:t>
-            </w:r>
-          </w:p>
-        </w:tc>
-        <w:tc>
-          <w:tcPr>
-            <w:tcW w:type="dxa" w:w="960"/>
-          </w:tcPr>
-          <w:p>
-            <w:r>
-              <w:rPr>
-                <w:sz w:val="14"/>
-              </w:rPr>
-              <w:t>0</w:t>
+              <w:t>4.085</w:t>
+            </w:r>
+          </w:p>
+        </w:tc>
+        <w:tc>
+          <w:tcPr>
+            <w:tcW w:type="dxa" w:w="960"/>
+          </w:tcPr>
+          <w:p>
+            <w:r>
+              <w:rPr>
+                <w:sz w:val="14"/>
+              </w:rPr>
+              <w:t>-0.001512</w:t>
             </w:r>
           </w:p>
         </w:tc>
@@ -9783,33 +9783,33 @@
               <w:rPr>
                 <w:sz w:val="14"/>
               </w:rPr>
-              <w:t>65.68</w:t>
-            </w:r>
-          </w:p>
-        </w:tc>
-        <w:tc>
-          <w:tcPr>
-            <w:tcW w:type="dxa" w:w="960"/>
-          </w:tcPr>
-          <w:p>
-            <w:r>
-              <w:rPr>
-                <w:sz w:val="14"/>
-              </w:rPr>
-              <w:t>0.6567</w:t>
-            </w:r>
-          </w:p>
-        </w:tc>
-        <w:tc>
-          <w:tcPr>
-            <w:tcW w:type="dxa" w:w="960"/>
-          </w:tcPr>
-          <w:p>
-            <w:r>
-              <w:rPr>
-                <w:sz w:val="14"/>
-              </w:rPr>
-              <w:t>0</w:t>
+              <w:t>65.71</w:t>
+            </w:r>
+          </w:p>
+        </w:tc>
+        <w:tc>
+          <w:tcPr>
+            <w:tcW w:type="dxa" w:w="960"/>
+          </w:tcPr>
+          <w:p>
+            <w:r>
+              <w:rPr>
+                <w:sz w:val="14"/>
+              </w:rPr>
+              <w:t>0.6352</w:t>
+            </w:r>
+          </w:p>
+        </w:tc>
+        <w:tc>
+          <w:tcPr>
+            <w:tcW w:type="dxa" w:w="960"/>
+          </w:tcPr>
+          <w:p>
+            <w:r>
+              <w:rPr>
+                <w:sz w:val="14"/>
+              </w:rPr>
+              <w:t>-1.29e-06</w:t>
             </w:r>
           </w:p>
         </w:tc>
@@ -9915,20 +9915,20 @@
               <w:rPr>
                 <w:sz w:val="14"/>
               </w:rPr>
-              <w:t>4.891</w:t>
-            </w:r>
-          </w:p>
-        </w:tc>
-        <w:tc>
-          <w:tcPr>
-            <w:tcW w:type="dxa" w:w="960"/>
-          </w:tcPr>
-          <w:p>
-            <w:r>
-              <w:rPr>
-                <w:sz w:val="14"/>
-              </w:rPr>
-              <w:t>0</w:t>
+              <w:t>4.893</w:t>
+            </w:r>
+          </w:p>
+        </w:tc>
+        <w:tc>
+          <w:tcPr>
+            <w:tcW w:type="dxa" w:w="960"/>
+          </w:tcPr>
+          <w:p>
+            <w:r>
+              <w:rPr>
+                <w:sz w:val="14"/>
+              </w:rPr>
+              <w:t>-0.0002563</w:t>
             </w:r>
           </w:p>
         </w:tc>
@@ -10140,33 +10140,33 @@
               <w:rPr>
                 <w:sz w:val="14"/>
               </w:rPr>
-              <w:t>297.2</w:t>
-            </w:r>
-          </w:p>
-        </w:tc>
-        <w:tc>
-          <w:tcPr>
-            <w:tcW w:type="dxa" w:w="960"/>
-          </w:tcPr>
-          <w:p>
-            <w:r>
-              <w:rPr>
-                <w:sz w:val="14"/>
-              </w:rPr>
-              <w:t>1.284</w:t>
-            </w:r>
-          </w:p>
-        </w:tc>
-        <w:tc>
-          <w:tcPr>
-            <w:tcW w:type="dxa" w:w="960"/>
-          </w:tcPr>
-          <w:p>
-            <w:r>
-              <w:rPr>
-                <w:sz w:val="14"/>
-              </w:rPr>
-              <w:t>0</w:t>
+              <w:t>297.3</w:t>
+            </w:r>
+          </w:p>
+        </w:tc>
+        <w:tc>
+          <w:tcPr>
+            <w:tcW w:type="dxa" w:w="960"/>
+          </w:tcPr>
+          <w:p>
+            <w:r>
+              <w:rPr>
+                <w:sz w:val="14"/>
+              </w:rPr>
+              <w:t>1.248</w:t>
+            </w:r>
+          </w:p>
+        </w:tc>
+        <w:tc>
+          <w:tcPr>
+            <w:tcW w:type="dxa" w:w="960"/>
+          </w:tcPr>
+          <w:p>
+            <w:r>
+              <w:rPr>
+                <w:sz w:val="14"/>
+              </w:rPr>
+              <w:t>0.006178</w:t>
             </w:r>
           </w:p>
         </w:tc>
@@ -10259,33 +10259,33 @@
               <w:rPr>
                 <w:sz w:val="14"/>
               </w:rPr>
-              <w:t>298.5</w:t>
-            </w:r>
-          </w:p>
-        </w:tc>
-        <w:tc>
-          <w:tcPr>
-            <w:tcW w:type="dxa" w:w="960"/>
-          </w:tcPr>
-          <w:p>
-            <w:r>
-              <w:rPr>
-                <w:sz w:val="14"/>
-              </w:rPr>
-              <w:t>-0.03937</w:t>
-            </w:r>
-          </w:p>
-        </w:tc>
-        <w:tc>
-          <w:tcPr>
-            <w:tcW w:type="dxa" w:w="960"/>
-          </w:tcPr>
-          <w:p>
-            <w:r>
-              <w:rPr>
-                <w:sz w:val="14"/>
-              </w:rPr>
-              <w:t>0</w:t>
+              <w:t>298.6</w:t>
+            </w:r>
+          </w:p>
+        </w:tc>
+        <w:tc>
+          <w:tcPr>
+            <w:tcW w:type="dxa" w:w="960"/>
+          </w:tcPr>
+          <w:p>
+            <w:r>
+              <w:rPr>
+                <w:sz w:val="14"/>
+              </w:rPr>
+              <w:t>-0.07107</w:t>
+            </w:r>
+          </w:p>
+        </w:tc>
+        <w:tc>
+          <w:tcPr>
+            <w:tcW w:type="dxa" w:w="960"/>
+          </w:tcPr>
+          <w:p>
+            <w:r>
+              <w:rPr>
+                <w:sz w:val="14"/>
+              </w:rPr>
+              <w:t>0.005824</w:t>
             </w:r>
           </w:p>
         </w:tc>
@@ -11092,7 +11092,7 @@
               <w:rPr>
                 <w:sz w:val="14"/>
               </w:rPr>
-              <w:t>1.461</w:t>
+              <w:t>1.462</w:t>
             </w:r>
           </w:p>
         </w:tc>
@@ -11211,33 +11211,33 @@
               <w:rPr>
                 <w:sz w:val="14"/>
               </w:rPr>
-              <w:t>1.605</w:t>
-            </w:r>
-          </w:p>
-        </w:tc>
-        <w:tc>
-          <w:tcPr>
-            <w:tcW w:type="dxa" w:w="960"/>
-          </w:tcPr>
-          <w:p>
-            <w:r>
-              <w:rPr>
-                <w:sz w:val="14"/>
-              </w:rPr>
-              <w:t>-0.1447</w:t>
-            </w:r>
-          </w:p>
-        </w:tc>
-        <w:tc>
-          <w:tcPr>
-            <w:tcW w:type="dxa" w:w="960"/>
-          </w:tcPr>
-          <w:p>
-            <w:r>
-              <w:rPr>
-                <w:sz w:val="14"/>
-              </w:rPr>
-              <w:t>0</w:t>
+              <w:t>1.622</w:t>
+            </w:r>
+          </w:p>
+        </w:tc>
+        <w:tc>
+          <w:tcPr>
+            <w:tcW w:type="dxa" w:w="960"/>
+          </w:tcPr>
+          <w:p>
+            <w:r>
+              <w:rPr>
+                <w:sz w:val="14"/>
+              </w:rPr>
+              <w:t>-0.16</w:t>
+            </w:r>
+          </w:p>
+        </w:tc>
+        <w:tc>
+          <w:tcPr>
+            <w:tcW w:type="dxa" w:w="960"/>
+          </w:tcPr>
+          <w:p>
+            <w:r>
+              <w:rPr>
+                <w:sz w:val="14"/>
+              </w:rPr>
+              <w:t>0.000256</w:t>
             </w:r>
           </w:p>
         </w:tc>
@@ -11330,33 +11330,33 @@
               <w:rPr>
                 <w:sz w:val="14"/>
               </w:rPr>
-              <w:t>0.7308</w:t>
-            </w:r>
-          </w:p>
-        </w:tc>
-        <w:tc>
-          <w:tcPr>
-            <w:tcW w:type="dxa" w:w="960"/>
-          </w:tcPr>
-          <w:p>
-            <w:r>
-              <w:rPr>
-                <w:sz w:val="14"/>
-              </w:rPr>
-              <w:t>0.73</w:t>
-            </w:r>
-          </w:p>
-        </w:tc>
-        <w:tc>
-          <w:tcPr>
-            <w:tcW w:type="dxa" w:w="960"/>
-          </w:tcPr>
-          <w:p>
-            <w:r>
-              <w:rPr>
-                <w:sz w:val="14"/>
-              </w:rPr>
-              <w:t>0</w:t>
+              <w:t>0.7312</w:t>
+            </w:r>
+          </w:p>
+        </w:tc>
+        <w:tc>
+          <w:tcPr>
+            <w:tcW w:type="dxa" w:w="960"/>
+          </w:tcPr>
+          <w:p>
+            <w:r>
+              <w:rPr>
+                <w:sz w:val="14"/>
+              </w:rPr>
+              <w:t>0.7303</w:t>
+            </w:r>
+          </w:p>
+        </w:tc>
+        <w:tc>
+          <w:tcPr>
+            <w:tcW w:type="dxa" w:w="960"/>
+          </w:tcPr>
+          <w:p>
+            <w:r>
+              <w:rPr>
+                <w:sz w:val="14"/>
+              </w:rPr>
+              <w:t>-0.003288</w:t>
             </w:r>
           </w:p>
         </w:tc>
@@ -11568,33 +11568,33 @@
               <w:rPr>
                 <w:sz w:val="14"/>
               </w:rPr>
-              <w:t>10.63</w:t>
-            </w:r>
-          </w:p>
-        </w:tc>
-        <w:tc>
-          <w:tcPr>
-            <w:tcW w:type="dxa" w:w="960"/>
-          </w:tcPr>
-          <w:p>
-            <w:r>
-              <w:rPr>
-                <w:sz w:val="14"/>
-              </w:rPr>
-              <w:t>0.3734</w:t>
-            </w:r>
-          </w:p>
-        </w:tc>
-        <w:tc>
-          <w:tcPr>
-            <w:tcW w:type="dxa" w:w="960"/>
-          </w:tcPr>
-          <w:p>
-            <w:r>
-              <w:rPr>
-                <w:sz w:val="14"/>
-              </w:rPr>
-              <w:t>0</w:t>
+              <w:t>10.66</w:t>
+            </w:r>
+          </w:p>
+        </w:tc>
+        <w:tc>
+          <w:tcPr>
+            <w:tcW w:type="dxa" w:w="960"/>
+          </w:tcPr>
+          <w:p>
+            <w:r>
+              <w:rPr>
+                <w:sz w:val="14"/>
+              </w:rPr>
+              <w:t>0.3367</w:t>
+            </w:r>
+          </w:p>
+        </w:tc>
+        <w:tc>
+          <w:tcPr>
+            <w:tcW w:type="dxa" w:w="960"/>
+          </w:tcPr>
+          <w:p>
+            <w:r>
+              <w:rPr>
+                <w:sz w:val="14"/>
+              </w:rPr>
+              <w:t>-0.0006368</w:t>
             </w:r>
           </w:p>
         </w:tc>
@@ -11687,33 +11687,33 @@
               <w:rPr>
                 <w:sz w:val="14"/>
               </w:rPr>
-              <w:t>11.02</w:t>
-            </w:r>
-          </w:p>
-        </w:tc>
-        <w:tc>
-          <w:tcPr>
-            <w:tcW w:type="dxa" w:w="960"/>
-          </w:tcPr>
-          <w:p>
-            <w:r>
-              <w:rPr>
-                <w:sz w:val="14"/>
-              </w:rPr>
-              <w:t>-0.01778</w:t>
-            </w:r>
-          </w:p>
-        </w:tc>
-        <w:tc>
-          <w:tcPr>
-            <w:tcW w:type="dxa" w:w="960"/>
-          </w:tcPr>
-          <w:p>
-            <w:r>
-              <w:rPr>
-                <w:sz w:val="14"/>
-              </w:rPr>
-              <w:t>0</w:t>
+              <w:t>11.04</w:t>
+            </w:r>
+          </w:p>
+        </w:tc>
+        <w:tc>
+          <w:tcPr>
+            <w:tcW w:type="dxa" w:w="960"/>
+          </w:tcPr>
+          <w:p>
+            <w:r>
+              <w:rPr>
+                <w:sz w:val="14"/>
+              </w:rPr>
+              <w:t>-0.03875</w:t>
+            </w:r>
+          </w:p>
+        </w:tc>
+        <w:tc>
+          <w:tcPr>
+            <w:tcW w:type="dxa" w:w="960"/>
+          </w:tcPr>
+          <w:p>
+            <w:r>
+              <w:rPr>
+                <w:sz w:val="14"/>
+              </w:rPr>
+              <w:t>-0.0009323</w:t>
             </w:r>
           </w:p>
         </w:tc>
@@ -12710,7 +12710,7 @@
               <w:rPr>
                 <w:sz w:val="14"/>
               </w:rPr>
-              <w:t>64.17</w:t>
+              <w:t>64.48</w:t>
             </w:r>
           </w:p>
         </w:tc>
@@ -12762,7 +12762,7 @@
               <w:rPr>
                 <w:sz w:val="14"/>
               </w:rPr>
-              <w:t>4.8655</w:t>
+              <w:t>4.88934</w:t>
             </w:r>
           </w:p>
         </w:tc>
@@ -16081,7 +16081,7 @@
               <w:rPr>
                 <w:sz w:val="14"/>
               </w:rPr>
-              <w:t>0.1461</w:t>
+              <w:t>0.1406</w:t>
             </w:r>
           </w:p>
         </w:tc>
@@ -16174,20 +16174,20 @@
               <w:rPr>
                 <w:sz w:val="14"/>
               </w:rPr>
-              <w:t>64.17</w:t>
-            </w:r>
-          </w:p>
-        </w:tc>
-        <w:tc>
-          <w:tcPr>
-            <w:tcW w:type="dxa" w:w="1080"/>
-          </w:tcPr>
-          <w:p>
-            <w:r>
-              <w:rPr>
-                <w:sz w:val="14"/>
-              </w:rPr>
-              <w:t>1.16</w:t>
+              <w:t>64.48</w:t>
+            </w:r>
+          </w:p>
+        </w:tc>
+        <w:tc>
+          <w:tcPr>
+            <w:tcW w:type="dxa" w:w="1080"/>
+          </w:tcPr>
+          <w:p>
+            <w:r>
+              <w:rPr>
+                <w:sz w:val="14"/>
+              </w:rPr>
+              <w:t>1.161</w:t>
             </w:r>
           </w:p>
         </w:tc>
@@ -17010,7 +17010,7 @@
               <w:rPr>
                 <w:sz w:val="14"/>
               </w:rPr>
-              <w:t>0.05468</w:t>
+              <w:t>0.05871</w:t>
             </w:r>
           </w:p>
         </w:tc>
@@ -17023,7 +17023,7 @@
               <w:rPr>
                 <w:sz w:val="14"/>
               </w:rPr>
-              <w:t>0.05386</w:t>
+              <w:t>0.05093</w:t>
             </w:r>
           </w:p>
         </w:tc>
@@ -17077,7 +17077,7 @@
               <w:rPr>
                 <w:sz w:val="14"/>
               </w:rPr>
-              <w:t>0.03193</w:t>
+              <w:t>0.02989</w:t>
             </w:r>
           </w:p>
         </w:tc>
@@ -17090,7 +17090,7 @@
               <w:rPr>
                 <w:sz w:val="14"/>
               </w:rPr>
-              <w:t>0.01948</w:t>
+              <w:t>0.01866</w:t>
             </w:r>
           </w:p>
         </w:tc>
@@ -17144,7 +17144,7 @@
               <w:rPr>
                 <w:sz w:val="14"/>
               </w:rPr>
-              <w:t>0.002622</w:t>
+              <w:t>0.003016</w:t>
             </w:r>
           </w:p>
         </w:tc>
@@ -17157,7 +17157,7 @@
               <w:rPr>
                 <w:sz w:val="14"/>
               </w:rPr>
-              <w:t>0.0002548</w:t>
+              <w:t>0.0003463</w:t>
             </w:r>
           </w:p>
         </w:tc>
@@ -17211,7 +17211,7 @@
               <w:rPr>
                 <w:sz w:val="14"/>
               </w:rPr>
-              <w:t>0.01419</w:t>
+              <w:t>0.01278</w:t>
             </w:r>
           </w:p>
         </w:tc>
@@ -17224,7 +17224,7 @@
               <w:rPr>
                 <w:sz w:val="14"/>
               </w:rPr>
-              <w:t>0.002403</w:t>
+              <w:t>0.00271</w:t>
             </w:r>
           </w:p>
         </w:tc>
@@ -17278,7 +17278,7 @@
               <w:rPr>
                 <w:sz w:val="14"/>
               </w:rPr>
-              <w:t>0.009213</w:t>
+              <w:t>0.008224</w:t>
             </w:r>
           </w:p>
         </w:tc>
@@ -17291,7 +17291,7 @@
               <w:rPr>
                 <w:sz w:val="14"/>
               </w:rPr>
-              <w:t>0.001089</w:t>
+              <w:t>0.001197</w:t>
             </w:r>
           </w:p>
         </w:tc>
@@ -17345,7 +17345,7 @@
               <w:rPr>
                 <w:sz w:val="14"/>
               </w:rPr>
-              <w:t>0.05051</w:t>
+              <w:t>0.05648</w:t>
             </w:r>
           </w:p>
         </w:tc>
@@ -17358,7 +17358,7 @@
               <w:rPr>
                 <w:sz w:val="14"/>
               </w:rPr>
-              <w:t>0.04325</w:t>
+              <w:t>0.03977</w:t>
             </w:r>
           </w:p>
         </w:tc>
@@ -18017,7 +18017,7 @@
     </w:p>
     <w:p>
       <w:r>
-        <w:t>Simulated delta-v collapses onto Pi = dv B/(rho delta v_rel^2 T) = 1.06 ± 0.24 across regimes, altitudes and B, with a log-log slope of 1.01 and R^2 = 0.9995. The expected value is 1/2 from a = rho v_rel^2/(2B) and is recovered once the factor of two and the corotation correction are carried consistently; the collapse is therefore a dimensional reduction and an internal-consistency check, not independent validation, because the simulator and the predictor share the same drag equation. Its value is that it lets any other choice of delta, duration, density regime and ballistic coefficient be evaluated without rerunning the simulation (Fig. 6).</w:t>
+        <w:t>Simulated delta-v collapses onto Pi = dv B/(rho delta v_rel^2 T) = 1.06 ± 0.26 across regimes, altitudes and B, with a log-log slope of 1.01 and R^2 = 0.9995. The expected value is 1/2 from a = rho v_rel^2/(2B) and is recovered once the factor of two and the corotation correction are carried consistently; the collapse is therefore a dimensional reduction and an internal-consistency check, not independent validation, because the simulator and the predictor share the same drag equation. Its value is that it lets any other choice of delta, duration, density regime and ballistic coefficient be evaluated without rerunning the simulation (Fig. 6).</w:t>
       </w:r>
     </w:p>
     <w:p>

</xml_diff>

<commit_message>
Hostile-review + hardcode-audit revision: inject all numbers, renumber display items, add provenance tests
Co-Authored-By: Tatsuki Onishi <bougtoir@gmail.com>
</commit_message>
<xml_diff>
--- a/manuscript/manuscript.docx
+++ b/manuscript/manuscript.docx
@@ -12,7 +12,7 @@
     </w:p>
     <w:p>
       <w:r>
-        <w:t>[Authors] T. Onishi et al. Corresponding: bougtoir@gmail.com</w:t>
+        <w:t>[Authors] T. Onishi. Corresponding: bougtoir@gmail.com</w:t>
       </w:r>
     </w:p>
     <w:p>
@@ -30,7 +30,7 @@
     </w:p>
     <w:p>
       <w:r>
-        <w:t>Whether a spatially and temporally localized thermospheric density increase could selectively accelerate the orbital decay of low Earth orbit debris — while limiting collateral drag on protected spacecraft — is examined as a boundary problem rather than an engineering proposal. Using an NRLMSISE-00 climatology across four solar/geomagnetic regimes, a J2-secular semi-analytic propagator validated against a Cowell integrator, and abstract Gaussian density perturbations (static, advected, diffusing, relaxing, and an idealized on-target tracking bound), we simulate synthetic target and protected objects between 200 and 800 km. Drag response itself is not the limiting factor: enhancing density by a factor (1+delta) along the target's own path multiplies its drag impulse by the same factor, so the idealized bound of perfect co-location delivers 6.87 m/s in one day to a 400 km high-area-to-mass target against 1.37 m/s of natural drag. Even that bound is not reached by an intervention aimed at the predicted orbit: integrating the orbit while the enhancement acts leaves 3.53 m/s, a factor 1.95 lower, because the induced drag itself drifts the target along track out of a patch centred on the unperturbed ephemeris. The boundary is set instead by exposure, transport and geometry. An Earth-fixed pulse of the same peak amplitude is sampled for only 320 s of a 4.4% duty cycle and yields 3.98e-3 m/s per event; the 1726x gap decomposes multiplicatively into exposure duration (12x), in-patch occupancy (22.5x) and mean enhancement while inside (6.3x) to within 1.5%, and adding the co-location retention factor 0.51 reproduces the 887x gap of the simulated arm to within 1.5%. Horizontal diffusion and winds disperse a static patch on minutes-to-hours timescales: 11 of 27 surveyed (sigma_h, kappa, u) design combinations allow one hour of persistence, and none do when winds of 100 m/s are combined with patches small enough to be selective. Budget-matched controls show that localization buys collateral suppression, not benefit, and that a fixed spacetime or thermal-energy budget spent locally gives the target only 3.06e-3 m/s. Raising density by delta=5 at 400 km over a 200 km patch through hydrostatic expansion of the column below requires ~5.80e7 W sustained, a thermodynamic lower bound. Selective thermospheric drag is therefore mathematically well-posed and dimensionally simple, but confined by exposure geometry, transport and energetics to a narrow corner of parameter space that no identified mechanism reaches.</w:t>
+        <w:t>Whether a spatially and temporally localized thermospheric density increase could selectively accelerate the orbital decay of low Earth orbit debris — while limiting collateral drag on protected spacecraft — is examined as a boundary problem rather than an engineering proposal. Using an NRLMSISE-00 climatology across four solar/geomagnetic regimes, a J2-secular semi-analytic propagator validated against a Cowell integrator, and abstract Gaussian density perturbations (static, advected, diffusing, relaxing, and an idealized on-target tracking bound), I simulate synthetic target and protected objects between 200 and 800 km. Drag response itself is not the limiting factor: enhancing density by a factor (1+delta) along the target's own path multiplies its drag impulse by the same factor, so the idealized bound of perfect co-location delivers 6.87 m/s in one day to a 400 km high-area-to-mass target against 1.37 m/s of natural drag. Even that bound is not reached by an intervention aimed at the predicted orbit: integrating the orbit while the enhancement acts leaves 3.53 m/s, a factor 1.95 lower, because the induced drag itself drifts the target along track out of a patch centred on the unperturbed ephemeris. The boundary is set instead by exposure, transport and geometry. An Earth-fixed pulse of the same peak amplitude is sampled for only 320 s of a 4.4% duty cycle and yields 3.98e-3 m/s per event; the 1726x gap decomposes multiplicatively into exposure duration (12x), in-patch occupancy (22.5x) and mean enhancement while inside (6.3x) to within 1.5%, and adding the co-location retention factor 0.51 reproduces the 887x gap of the simulated arm to within 1.5%. Horizontal diffusion and winds disperse a static patch on minutes-to-hours timescales: 11 of 27 surveyed (sigma_h, kappa, u) design combinations allow one hour of persistence, and none do when winds of 100 m/s are combined with patches small enough to be selective. Budget-matched controls show that localization buys collateral suppression, not benefit, and that a fixed spacetime or thermal-energy budget spent locally gives the target only 3.06e-3 m/s. Raising density by delta=5 at 400 km over a 200 km patch through hydrostatic expansion of the column below requires ~5.80e7 W sustained, a thermodynamic lower bound. Selective thermospheric drag is therefore mathematically well-posed and dimensionally simple, but confined by exposure geometry, transport and energetics to a narrow corner of parameter space that no identified mechanism reaches.</w:t>
       </w:r>
     </w:p>
     <w:p>
@@ -43,7 +43,7 @@
     </w:p>
     <w:p>
       <w:r>
-        <w:t>The low Earth orbit debris population continues to grow and motivates both mitigation standards and active debris removal (ADR) concepts [1,2,3]. Non-contact removal ideas — momentum transfer by lasers or ion-beam shepherd concepts — avoid grapple risks [4]. A conceptually different route is to increase the ambient drag on a target alone by locally raising thermospheric density. Geomagnetic storms demonstrate that natural density enhancements of several hundred percent at 400–500 km produce operationally significant drag [5,6,7]. The question addressed here is deliberately narrow: under what conditions could a *localized* density perturbation produce useful differential decay between a synthetic target and protected spacecraft — and where does the concept fail quantitatively? We study the boundary, not a deployment design; no operational spacecraft are targeted and no hardware is specified. The contribution is a quantitative exclusion map that separates four independent gates — drag response, exposure geometry, transport persistence, and collateral selectivity — together with the thermodynamic lower bound on the energy each would require.</w:t>
+        <w:t>The low Earth orbit debris population continues to grow and motivates both mitigation standards and active debris removal (ADR) concepts [1,2,3]. Non-contact removal ideas — momentum transfer by lasers or ion-beam shepherd concepts — avoid grapple risks [4]. A conceptually different route is to increase the ambient drag on a target alone by locally raising thermospheric density. Geomagnetic storms demonstrate that natural density enhancements of several hundred percent at 400–500 km produce operationally significant drag [5,6,7]. The question addressed here is deliberately narrow: under what conditions could a *localized* density perturbation produce useful differential decay between a synthetic target and protected spacecraft — and where does the concept fail quantitatively? I study the boundary, not a deployment design; no operational spacecraft are targeted and no hardware is specified. The contribution is a quantitative exclusion map that separates four independent gates — drag response, exposure geometry, transport persistence, and collateral selectivity — together with the thermodynamic lower bound on the energy each would require.</w:t>
       </w:r>
     </w:p>
     <w:p>
@@ -77,7 +77,7 @@
     </w:p>
     <w:p>
       <w:r>
-        <w:t>Two propagators are used: a DOP853 Cowell integrator with J2 and drag for validation, and a J2-secular semi-analytic integrator with orbit-averaged density for grid studies. Drag acceleration is -rho v_rel^2/(2B) along the relative wind with B = m/(C_d A) [12,13]; the semi-analytic decay rate da/dt = -(a rho v / B)(v_rel/v)^2 uses the same corotation factor v_rel/v = 1 - Omega_E a cos(i)/v as the Cowell reference, which brings the two propagators to 0.12% agreement over a ten-day drag-only decay. Baseline validation (Gate 2) required energy and angular-momentum conservation, convergence under tolerance tightening, J2 secular rates, fast-versus-Cowell decay agreement within 1%, and lifetime scaling with B [14]; all checks passed (results/tables/phase2_validation.csv). Objects that do not reach the reentry altitude inside the integration horizon are reported as right-censored lower bounds rather than known lifetimes; 21 of 396 baseline grid cells are censored in this sense and are excluded from any statistic that would treat the horizon as a measured lifetime.</w:t>
+        <w:t>Two propagators are used: a DOP853 Cowell integrator with J2 and drag for validation, and a J2-secular semi-analytic integrator with orbit-averaged density for grid studies. Drag acceleration is -rho v_rel^2/(2B) along the relative wind with B = m/(C_d A) [12,13]; the semi-analytic decay rate da/dt = -(a rho v / B)(v_rel/v)^2 uses the same corotation factor v_rel/v = 1 - Omega_E a cos(i)/v as the Cowell reference, which brings the two propagators to 0.06% agreement over a ten-day drag-only decay. Baseline validation (Gate 2) required energy and angular-momentum conservation, convergence under tolerance tightening, J2 secular rates, fast-versus-Cowell decay agreement within 1%, and lifetime scaling with B [14]; all checks passed (results/tables/phase2_validation.csv). Objects that do not reach the reentry altitude inside the integration horizon are reported as right-censored lower bounds rather than known lifetimes; 21 of 396 baseline grid cells are censored in this sense and are excluded from any statistic that would treat the horizon as a measured lifetime.</w:t>
       </w:r>
     </w:p>
     <w:p>
@@ -103,7 +103,7 @@
     </w:p>
     <w:p>
       <w:r>
-        <w:t>Case pairs A–G place synthetic high-A/m targets near protected objects with realistic ballistic coefficients; a 2000-object factorial population provides distributional context. Outcomes are lifetime change, semimajor-axis drop, extra drag impulse, equivalent delta-v, encounter statistics, and orbital energy removed. Absolute target benefit and absolute protected-object collateral are the primary quantities; a selectivity ratio is reported only as a secondary descriptor, and only after each exposure is classified as physical exposure, Gaussian-tail limited, below numerical resolution, or no encounter (closest approach beyond six patch sigmas). Ratios computed against a tail-limited or no-encounter denominator are labelled as undefined rather than reported as large selectivities.</w:t>
+        <w:t>Case pairs A–G place synthetic high-A/m targets near protected objects with realistic ballistic coefficients; a 2000-object factorial population provides distributional context. Outcomes are lifetime change, semimajor-axis drop, extra drag impulse, equivalent delta-v, encounter statistics, and orbital energy removed. Absolute target benefit and absolute protected-object collateral are the primary quantities; a selectivity ratio is reported only as a secondary descriptor, and only after each exposure is classified as physical exposure, Gaussian-tail limited, below numerical resolution, or no encounter (closest approach beyond 6 patch sigmas). Ratios computed against a tail-limited or no-encounter denominator are labelled as undefined rather than reported as large selectivities.</w:t>
       </w:r>
     </w:p>
     <w:p>
@@ -3346,7 +3346,7 @@
     </w:p>
     <w:p>
       <w:r>
-        <w:t>A best-case-sited Earth-fixed Gaussian pulse (delta = 5, sigma_h = 200 km, 2 h) is sampled by the case-A target for 320 s — 4.4% of the window — and adds 3.98e-3 m/s, which is 3.5% of the natural drag impulse the same object receives over the same 2 h window. The limitation is exposure, not amplitude: the object crosses the patch once per revolution at ~7.7 km/s, and the mean enhancement it experiences while inside is only 0.79 against a peak of 3.15 (Table 2, Table 6).</w:t>
+        <w:t>A best-case-sited Earth-fixed Gaussian pulse (delta = 5, sigma_h = 200 km, 2 h) is sampled by the case-A target for 320 s — 4.4% of the window — and adds 3.98e-3 m/s, which is 3.5% of the natural drag impulse the same object receives over the same 2 h window. The limitation is exposure, not amplitude: the object crosses the patch once per revolution at ~7.7 km/s, and the mean enhancement it experiences while inside is only 0.79 against a peak of 3.15 (Table 2, Table 3).</w:t>
       </w:r>
     </w:p>
     <w:p>
@@ -3359,12 +3359,12 @@
     </w:p>
     <w:p>
       <w:r>
-        <w:t>The idealized tracking bound sustains the enhancement on the target for a full day and yields 6.87 m/s, exactly delta = 5 times the 1.37 m/s of natural drag over the same window (a total impulse of (1+delta) x natural), as the drag equation requires. It shortens the 250 km target's lifetime by 0.7 d. The ratio between this bound and the fixed pulse, 1726x, is reproduced to 1.5% by the product of three exposure factors — window duration 12x, fraction of the window spent inside the patch 22.5x, and mean enhancement while inside 6.3x — confirming that sustained co-location, not peak amplitude, controls the outcome. This bound is a mathematical limit on co-location strategies and not a claim that such co-location is achievable (Table 2, Table 6).</w:t>
+        <w:t>The idealized tracking bound sustains the enhancement on the target for a full day and yields 6.87 m/s, exactly delta = 5 times the 1.37 m/s of natural drag over the same window (a total impulse of (1+delta) x natural), as the drag equation requires. It shortens the 250 km target's lifetime by 0.7 d. The ratio between this bound and the fixed pulse, 1726x, is reproduced to 1.5% by the product of three exposure factors — window duration 12x, fraction of the window spent inside the patch 22.5x, and mean enhancement while inside 6.3x — confirming that sustained co-location, not peak amplitude, controls the outcome. This bound is a mathematical limit on co-location strategies and not a claim that such co-location is achievable (Table 2, Table 3).</w:t>
       </w:r>
     </w:p>
     <w:p>
       <w:r>
-        <w:t>The bound is stated in the perfect-co-location convention, in which the exposure is evaluated on the unperturbed ephemeris so that the enhancement follows the object however it moves. Measuring the same intervention along the trajectory the drag itself produces — the convention used by every simulated scenario here — gives 3.53 m/s, a retention of 0.51 of the bound, because the induced decay drifts the target along track relative to a patch centred on the predicted orbit and the mean enhancement it then experiences falls from 5.00 to 2.31. The two values are different quantities and are reported separately throughout (Table 6): the bound limits what any co-location strategy could achieve, and the drift-aware value is what the modelled intervention achieves. Because the drift depends on the induced decay itself, the drift-aware values are step-size sensitive; the integrator is second-order in the step and the convergence ladder is reported in orbit_step_convergence.csv.</w:t>
+        <w:t>The bound is stated in the perfect-co-location convention, in which the exposure is evaluated on the unperturbed ephemeris so that the enhancement follows the object however it moves. Measuring the same intervention along the trajectory the drag itself produces — the convention used by every simulated scenario here — gives 3.53 m/s, a retention of 0.51 of the bound, because the induced decay drifts the target along track relative to a patch centred on the predicted orbit and the mean enhancement it then experiences falls from 5.00 to 2.31. The two values are different quantities and are reported separately throughout (Table 3): the bound limits what any co-location strategy could achieve, and the drift-aware value is what the modelled intervention achieves. Because the drift depends on the induced decay itself, the drift-aware values are step-size sensitive; the integrator is second-order in the step and the convergence ladder is reported in orbit_step_convergence.csv.</w:t>
       </w:r>
     </w:p>
     <w:p>
@@ -11737,7 +11737,7 @@
         <w:rPr>
           <w:i/>
         </w:rPr>
-        <w:t>Table 6. Decomposition of the fixed-pulse versus idealized-tracking gap into exposure duration, in-patch occupancy and effective in-patch enhancement.</w:t>
+        <w:t>Table 3. Decomposition of the fixed-pulse versus idealized-tracking gap into exposure duration, in-patch occupancy and effective in-patch enhancement.</w:t>
       </w:r>
     </w:p>
     <w:tbl>
@@ -12199,7 +12199,7 @@
     </w:p>
     <w:p>
       <w:r>
-        <w:t>Under matched target exposure, localization changes collateral far more than benefit: a uniform delta = 5 gives the case-A target 7.97 m/s and the on-target localized patch 3.53 m/s — the same peak amplitude on the target, the difference being the co-location the localized patch loses as the induced drag drifts the target out of it, and a uniform enhancement additionally keeps acting as the orbit decays into denser air — while the uniform arm delivers 4.33e-1 m/s to the protected object and the localized arm leaves it at 4.25e-6 m/s — a Gaussian-tail value, classified as not physically meaningful, so the apparent selectivity ratio is reported as undefined rather than as five orders of magnitude of performance. The comparison reverses once the *intervention* rather than the target exposure is held fixed. The localized patch occupies a fraction 4.35e-4 of the equivalent global shell, so the same enhanced spacetime volume spread uniformly gives the target 3.06e-3 m/s and the protected object 1.87e-4 m/s, and the same lower-bound thermal energy spread uniformly gives the target 5.10e-4 m/s. Localization is therefore necessary for safety and is the only way to make a finite budget useful, but the conclusion about 'how much better' localization is depends explicitly on the matching convention, and none of these conventions is privileged (Fig. 3, Fig. 7, Table 3, Table 7).</w:t>
+        <w:t>Under matched target exposure, localization changes collateral far more than benefit: a uniform delta = 5 gives the case-A target 7.97 m/s and the on-target localized patch 3.53 m/s — the same peak amplitude on the target, the difference being the co-location the localized patch loses as the induced drag drifts the target out of it, and a uniform enhancement additionally keeps acting as the orbit decays into denser air — while the uniform arm delivers 4.33e-1 m/s to the protected object and the localized arm leaves it at 4.25e-6 m/s — a Gaussian-tail value, classified as not physically meaningful, so the apparent selectivity ratio is reported as undefined rather than as five orders of magnitude of performance. The comparison reverses once the *intervention* rather than the target exposure is held fixed. The localized patch occupies a fraction 4.35e-4 of the equivalent global shell, so the same enhanced spacetime volume spread uniformly gives the target 3.06e-3 m/s and the protected object 1.87e-4 m/s, and the same lower-bound thermal energy spread uniformly gives the target 5.10e-4 m/s. Localization is therefore necessary for safety and is the only way to make a finite budget useful, but the conclusion about 'how much better' localization is depends explicitly on the matching convention, and none of these conventions is privileged (Fig. 3, Fig. 4, Table 4, Table 5).</w:t>
       </w:r>
     </w:p>
     <w:p>
@@ -12215,7 +12215,7 @@
         <w:rPr>
           <w:i/>
         </w:rPr>
-        <w:t>[Figure 7 near here — supplied as separate file fig7_matched_exposure.png]</w:t>
+        <w:t>[Figure 4 near here — supplied as separate file fig7_matched_exposure.png]</w:t>
       </w:r>
     </w:p>
     <w:p>
@@ -12223,7 +12223,7 @@
         <w:rPr>
           <w:i/>
         </w:rPr>
-        <w:t>Table 3. Target benefit, absolute protected-object collateral, exposure classification of the protected object, and the resulting selectivity ratio where it is defined.</w:t>
+        <w:t>Table 4. Target benefit, absolute protected-object collateral, exposure classification of the protected object, and the resulting selectivity ratio where it is defined.</w:t>
       </w:r>
     </w:p>
     <w:tbl>
@@ -13316,7 +13316,7 @@
         <w:rPr>
           <w:i/>
         </w:rPr>
-        <w:t>Table 7. Budget-matched exposure controls for each case pair and matching convention.</w:t>
+        <w:t>Table 5. Budget-matched exposure controls for each case pair and matching convention.</w:t>
       </w:r>
     </w:p>
     <w:tbl>
@@ -16852,7 +16852,7 @@
     </w:p>
     <w:p>
       <w:r>
-        <w:t>Persistence of a localized patch was surveyed over a factorial design of horizontal scale, eddy/turbulent diffusivity and horizontal wind. Of the 27 surveyed (sigma_h, kappa, u) combinations, 11 (41%) allow a sub-1000 km patch to persist for one hour. This is a fraction of a design grid, not a probability: no probability distribution over thermospheric transport parameters is assumed, and varying the grid bounds moves the fraction between 8% and 56%. The restriction that matters is conditional rather than marginal: among combinations that are small enough to be selective (sigma_h &lt;= 200 km) and exposed to winds of 100 m/s — within the observed thermospheric range [15] — the surviving fraction is 0% in every grid variant tested. Observed traveling atmospheric disturbances propagate at 460–730 m/s [16], so a localized enhancement is expected to be transported and sheared rather than held in place (Fig. S4).</w:t>
+        <w:t>Persistence of a localized patch was surveyed over a factorial design of horizontal scale, eddy/turbulent diffusivity and horizontal wind. Of the 27 surveyed (sigma_h, kappa, u) combinations, 11 (41%) allow a sub-1000 km patch to persist for one hour. This is a fraction of a design grid, not a probability: no probability distribution over thermospheric transport parameters is assumed, and varying the grid bounds moves the fraction between 8% and 56%. The restriction that matters is conditional rather than marginal: among combinations that are small enough to be selective (sigma_h &lt;= 200 km) and exposed to winds of 100 m/s — within the observed thermospheric range [15] — the surviving fraction is 0% in every grid variant tested. Observed traveling atmospheric disturbances propagate at 460–730 m/s [16], so a localized enhancement is expected to be transported and sheared rather than held in place (Fig. S1).</w:t>
       </w:r>
     </w:p>
     <w:p>
@@ -16865,7 +16865,7 @@
     </w:p>
     <w:p>
       <w:r>
-        <w:t>Monte Carlo (n=256) over delta, sigmas, density and B uncertainty gives a median target delta-v of 3.52e0 m/s (IQR 2.22e0). Sobol' indices were checked over the ladder N = 32, 256, 512, 1024, 2048 base samples and are reported at N = 1024: between N = 1024 and N = 2048 no total-order index moves by more than 0.002, and 0 S1 &gt; ST ordering violations remain outside confidence intervals at the largest rung; the response is dominated by `delta_max` (ST = 0.54), with the exposure geometry parameters second. Indices are reported as computed and are never post-hoc constrained (Fig. S2, Fig. S3, Table 4). The horizontal patch scale is not inert even in the tracking bound (ST = 0.15): the patch centre follows the unperturbed ephemeris, so the along-track drift caused by the induced drag itself carries the object towards the edge of a small patch within a day. Perfect co-location therefore requires either continuous re-targeting or a patch large enough to tolerate the drift — which is the same selectivity/size conflict that transport imposes.</w:t>
+        <w:t>Monte Carlo (n=256) over delta, sigmas, density and B uncertainty gives a median target delta-v of 3.52e0 m/s (IQR 2.22e0). Sobol' indices were checked over the ladder N = 32, 256, 512, 1024, 2048 base samples and are reported at N = 1024: between N = 1024 and N = 2048 no total-order index moves by more than 0.002, and 0 S1 &gt; ST ordering violations remain outside confidence intervals at the largest rung; the response is dominated by `delta_max` (ST = 0.54), with the exposure geometry parameters second. Indices are reported as computed and are never post-hoc constrained (Fig. S2, Fig. S3, Table 6). The horizontal patch scale is not inert even in the tracking bound (ST = 0.15): the patch centre follows the unperturbed ephemeris, so the along-track drift caused by the induced drag itself carries the object towards the edge of a small patch within a day. Perfect co-location therefore requires either continuous re-targeting or a patch large enough to tolerate the drift — which is the same selectivity/size conflict that transport imposes.</w:t>
       </w:r>
     </w:p>
     <w:p>
@@ -16873,7 +16873,7 @@
         <w:rPr>
           <w:i/>
         </w:rPr>
-        <w:t>Table 4. Sobol' first-order and total-order sensitivity indices for the target extra delta-v at the converged sample size.</w:t>
+        <w:t>Table 6. Sobol' first-order and total-order sensitivity indices for the target extra delta-v at the converged sample size.</w:t>
       </w:r>
     </w:p>
     <w:tbl>
@@ -17374,7 +17374,7 @@
     </w:p>
     <w:p>
       <w:r>
-        <w:t>All mandatory negative controls behave as required: high altitude (750 km: &lt;= 9.64e-3 m/s), high B = 200 (1.72e-1 m/s), a 60 s burst (5.37e-3 m/s) and a mis-timed pulse (0 m/s, no encounter) are all small compared with natural drag over the same window. The near-identical-trajectory control produces the expected failure of selectivity: the co-orbital protected twin absorbs 4.16e-1 m/s, comparable to its target, because it shares the target's trajectory tube (Table 5, Fig. S1).</w:t>
+        <w:t>All mandatory negative controls behave as required: high altitude (750 km: &lt;= 9.64e-3 m/s), high B = 200 (1.72e-1 m/s), a 60 s burst (5.37e-3 m/s) and a mis-timed pulse (0 m/s, no encounter) are all small in absolute terms. The near-identical-trajectory control produces the expected failure of selectivity: the co-orbital protected twin absorbs 4.16e-1 m/s, comparable to its target, because it shares the target's trajectory tube (Table 7, Fig. S4).</w:t>
       </w:r>
     </w:p>
     <w:p>
@@ -17382,7 +17382,7 @@
         <w:rPr>
           <w:i/>
         </w:rPr>
-        <w:t>Table 5. Mandatory negative controls and the simulated outcome of each.</w:t>
+        <w:t>Table 7. Mandatory negative controls and the simulated outcome of each.</w:t>
       </w:r>
     </w:p>
     <w:tbl>
@@ -18017,7 +18017,7 @@
     </w:p>
     <w:p>
       <w:r>
-        <w:t>Simulated delta-v collapses onto Pi = dv B/(rho delta v_rel^2 T) = 1.06 ± 0.26 across regimes, altitudes and B, with a log-log slope of 1.01 and R^2 = 0.9995. The expected value is 1/2 from a = rho v_rel^2/(2B) and is recovered once the factor of two and the corotation correction are carried consistently; the collapse is therefore a dimensional reduction and an internal-consistency check, not independent validation, because the simulator and the predictor share the same drag equation. Its value is that it lets any other choice of delta, duration, density regime and ballistic coefficient be evaluated without rerunning the simulation (Fig. 6).</w:t>
+        <w:t>Simulated delta-v collapses onto Pi = 2 dv B/(rho delta v_rel^2 T) = 1.06 ± 0.26 (median 1.02, IQR 0.04) across regimes, altitudes and B, with a log-log slope of 1.02 and R^2 = 0.9984; the 7 of {len(p11)} excursions above the collapse are confined to very low ballistic coefficients where the induced drift is largest. The expected value is 1/2 from a = rho v_rel^2/(2B) and is recovered once the factor of two and the corotation correction are carried consistently; the collapse is therefore a dimensional reduction and an internal-consistency check, not independent validation, because the simulator and the predictor share the same drag equation. Its value is that it lets any other choice of delta, duration, density regime and ballistic coefficient be evaluated without rerunning the simulation (Fig. 5).</w:t>
       </w:r>
     </w:p>
     <w:p>
@@ -18025,7 +18025,7 @@
         <w:rPr>
           <w:i/>
         </w:rPr>
-        <w:t>[Figure 6 near here — supplied as separate file fig6_scaling_collapse.png]</w:t>
+        <w:t>[Figure 5 near here — supplied as separate file fig6_scaling_collapse.png]</w:t>
       </w:r>
     </w:p>
     <w:p>
@@ -18038,7 +18038,7 @@
     </w:p>
     <w:p>
       <w:r>
-        <w:t>Tracking outcome is nearly insensitive to window start (mean 1.06e0 m/s, std 1.40e-1), while fixed-pulse outcomes stay orders of magnitude lower at every start time, so no timing strategy rescues a fixed patch. In the design sweep, selectivity degrades to ~117 once sigma_h reaches ~400 km, where protected objects begin to share the enhanced region; at small sigma_h the protected collateral falls into the Gaussian tail and the ratio ceases to be meaningful. Collecting the gates gives the exclusion map: the concept is excluded by exposure geometry for any Earth-fixed patch, by transport for any patch small enough to be selective in realistic winds, by trajectory sharing for co-orbital and track-crossing protected objects, and by energetics at the scale required; what remains mathematically open is the narrow corner in which an enhancement is sustained on the target for a large fraction of its remaining lifetime (Fig. 4, Fig. 5).</w:t>
+        <w:t>Tracking outcome is nearly insensitive to window start (mean 1.06e0 m/s, std 1.40e-1), while fixed-pulse outcomes stay orders of magnitude lower at every start time, so no timing strategy rescues a fixed patch. In the design sweep, selectivity degrades to ~117 once sigma_h reaches ~400 km, where protected objects begin to share the enhanced region; at small sigma_h the protected collateral falls into the Gaussian tail and the ratio ceases to be meaningful. Collecting the gates gives the exclusion map: the concept is excluded by exposure geometry for any Earth-fixed patch, by transport for any patch small enough to be selective in realistic winds, by trajectory sharing for co-orbital and track-crossing protected objects, and by energetics at the scale required; what remains mathematically open is the narrow corner in which an enhancement is sustained on the target for a large fraction of its remaining lifetime (Fig. 6, Fig. 7).</w:t>
       </w:r>
     </w:p>
     <w:p>
@@ -18046,7 +18046,7 @@
         <w:rPr>
           <w:i/>
         </w:rPr>
-        <w:t>[Figure 4 near here — supplied as separate file fig4_timing.png]</w:t>
+        <w:t>[Figure 6 near here — supplied as separate file fig4_timing.png]</w:t>
       </w:r>
     </w:p>
     <w:p>
@@ -18054,7 +18054,7 @@
         <w:rPr>
           <w:i/>
         </w:rPr>
-        <w:t>[Figure 5 near here — supplied as separate file fig5_pareto.png]</w:t>
+        <w:t>[Figure 7 near here — supplied as separate file fig5_pareto.png]</w:t>
       </w:r>
     </w:p>
     <w:p>
@@ -22103,7 +22103,7 @@
     </w:p>
     <w:p>
       <w:r>
-        <w:t>This is a boundary study with synthetic targets. It uses a climatological density lookup rather than assimilated densities, a circular-approximation secular decay integrator (agreeing with the Cowell reference to 0.12% on a ten-day drag-only test), and an idealized tracking bound used as an upper limit rather than a mechanism. No plasma/neutral coupling, self-consistent heating, deposition physics, or circulation response is modelled; the transport treatment is a parameterized diffusion/advection/relaxation surrogate, not a general-circulation simulation, and its survival fractions are fractions of a design grid rather than probabilities. Energy accounting reports thermodynamic lower bounds only. Lifetimes beyond the integration horizon are right-censored. No public catalog was used for targeting and no observational dataset was ingested; all numbers are model output.</w:t>
+        <w:t>This is a boundary study with synthetic targets. It uses a climatological density lookup rather than assimilated densities, a circular-approximation secular decay integrator (agreeing with the Cowell reference to 0.06% on a ten-day drag-only test), and an idealized tracking bound used as an upper limit rather than a mechanism. No plasma/neutral coupling, self-consistent heating, deposition physics, or circulation response is modelled; the transport treatment is a parameterized diffusion/advection/relaxation surrogate, not a general-circulation simulation, and its survival fractions are fractions of a design grid rather than probabilities. Energy accounting reports thermodynamic lower bounds only. Lifetimes beyond the integration horizon are right-censored. No public catalog was used for targeting and no observational dataset was ingested; all numbers are model output.</w:t>
       </w:r>
     </w:p>
     <w:p>
@@ -22116,7 +22116,7 @@
     </w:p>
     <w:p>
       <w:r>
-        <w:t>Within the modelled system, localized thermospheric density enhancement is excluded as a selective debris-removal mechanism for every configuration we could construct that respects exposure geometry, transport persistence and collateral constraints simultaneously: Earth-fixed patches are limited by transit time to sub-percent contributions relative to natural drag, patches small enough to be selective do not survive realistic winds for an hour, co-orbital and track-crossing spacecraft receive comparable collateral, and the thermodynamic lower bound on sustaining a useful enhancement is 5.80e7 W for a single patch. What remains mathematically possible is the idealized limit of an enhancement co-located with the target for a large fraction of its remaining lifetime, which would multiply its drag by (1+delta); nothing in this study indicates that such co-location can be realized, and no technological feasibility is claimed. The quantitative boundary — and the dimensionless group that lets it be re-evaluated for any other parameter choice — is the result.</w:t>
+        <w:t>Within the modelled system, localized thermospheric density enhancement is excluded as a selective debris-removal mechanism for every configuration I could construct that respects exposure geometry, transport persistence and collateral constraints simultaneously: Earth-fixed patches are limited by transit time to sub-percent contributions relative to natural drag, patches small enough to be selective do not survive realistic winds for an hour, co-orbital and track-crossing spacecraft receive comparable collateral, and the thermodynamic lower bound on sustaining a useful enhancement is 5.80e7 W for a single patch. What remains mathematically possible is the idealized limit of an enhancement co-located with the target for a large fraction of its remaining lifetime, which would multiply its drag by (1+delta); nothing in this study indicates that such co-location can be realized, and no technological feasibility is claimed. The quantitative boundary — and the dimensionless group that lets it be re-evaluated for any other parameter choice — is the result.</w:t>
       </w:r>
     </w:p>
     <w:p>
@@ -22250,22 +22250,22 @@
     </w:p>
     <w:p>
       <w:r>
-        <w:t>Figure 7. Target benefit (left) and protected-object collateral (right) under four matching conventions: the idealized localized bound, matched target exposure, matched enhanced spacetime volume, and matched lower-bound thermal energy.</w:t>
+        <w:t>Figure 4. Target benefit (left) and protected-object collateral (right) under four matching conventions: the idealized localized bound, matched target exposure, matched enhanced spacetime volume, and matched lower-bound thermal energy.</w:t>
       </w:r>
     </w:p>
     <w:p>
       <w:r>
-        <w:t>Figure 6. Simulated extra delta-v against the predicted value rho*delta*v_rel^2*T/(2B); all regimes, altitudes and ballistic coefficients collapse onto the identity line.</w:t>
+        <w:t>Figure 5. Simulated extra delta-v against the predicted value rho*delta*v_rel^2*T/(2B); all regimes, altitudes and ballistic coefficients collapse onto the identity line.</w:t>
       </w:r>
     </w:p>
     <w:p>
       <w:r>
-        <w:t>Figure 4. Target extra delta-v versus intervention reference time for a best-case-sited fixed pulse and for a 4 h tracking window.</w:t>
+        <w:t>Figure 6. Target extra delta-v versus intervention reference time for a best-case-sited fixed pulse and for a 4 h tracking window.</w:t>
       </w:r>
     </w:p>
     <w:p>
       <w:r>
-        <w:t>Figure 5. Target benefit against protected-object collateral over the design sweep; the Pareto front is highlighted and colour encodes horizontal patch scale.</w:t>
+        <w:t>Figure 7. Target benefit against protected-object collateral over the design sweep; the Pareto front is highlighted and colour encodes horizontal patch scale.</w:t>
       </w:r>
     </w:p>
     <w:p>

</xml_diff>

<commit_message>
Evidence pass: make all rerun, fix n_outlier schema drift, dynamic provenance logs, final QC docs
Co-Authored-By: Tatsuki Onishi <bougtoir@gmail.com>
</commit_message>
<xml_diff>
--- a/manuscript/manuscript.docx
+++ b/manuscript/manuscript.docx
@@ -17010,7 +17010,7 @@
               <w:rPr>
                 <w:sz w:val="14"/>
               </w:rPr>
-              <w:t>0.05871</w:t>
+              <w:t>0.05825</w:t>
             </w:r>
           </w:p>
         </w:tc>
@@ -17023,7 +17023,7 @@
               <w:rPr>
                 <w:sz w:val="14"/>
               </w:rPr>
-              <w:t>0.05093</w:t>
+              <w:t>0.0449</w:t>
             </w:r>
           </w:p>
         </w:tc>
@@ -17077,7 +17077,7 @@
               <w:rPr>
                 <w:sz w:val="14"/>
               </w:rPr>
-              <w:t>0.02989</w:t>
+              <w:t>0.03248</w:t>
             </w:r>
           </w:p>
         </w:tc>
@@ -17090,7 +17090,7 @@
               <w:rPr>
                 <w:sz w:val="14"/>
               </w:rPr>
-              <w:t>0.01866</w:t>
+              <w:t>0.02222</w:t>
             </w:r>
           </w:p>
         </w:tc>
@@ -17144,7 +17144,7 @@
               <w:rPr>
                 <w:sz w:val="14"/>
               </w:rPr>
-              <w:t>0.003016</w:t>
+              <w:t>0.002748</w:t>
             </w:r>
           </w:p>
         </w:tc>
@@ -17157,7 +17157,7 @@
               <w:rPr>
                 <w:sz w:val="14"/>
               </w:rPr>
-              <w:t>0.0003463</w:t>
+              <w:t>0.0003669</w:t>
             </w:r>
           </w:p>
         </w:tc>
@@ -17211,7 +17211,7 @@
               <w:rPr>
                 <w:sz w:val="14"/>
               </w:rPr>
-              <w:t>0.01278</w:t>
+              <w:t>0.01287</w:t>
             </w:r>
           </w:p>
         </w:tc>
@@ -17224,7 +17224,7 @@
               <w:rPr>
                 <w:sz w:val="14"/>
               </w:rPr>
-              <w:t>0.00271</w:t>
+              <w:t>0.002349</w:t>
             </w:r>
           </w:p>
         </w:tc>
@@ -17278,7 +17278,7 @@
               <w:rPr>
                 <w:sz w:val="14"/>
               </w:rPr>
-              <w:t>0.008224</w:t>
+              <w:t>0.008894</w:t>
             </w:r>
           </w:p>
         </w:tc>
@@ -17291,7 +17291,7 @@
               <w:rPr>
                 <w:sz w:val="14"/>
               </w:rPr>
-              <w:t>0.001197</w:t>
+              <w:t>0.001093</w:t>
             </w:r>
           </w:p>
         </w:tc>
@@ -17345,7 +17345,7 @@
               <w:rPr>
                 <w:sz w:val="14"/>
               </w:rPr>
-              <w:t>0.05648</w:t>
+              <w:t>0.04599</w:t>
             </w:r>
           </w:p>
         </w:tc>
@@ -17358,7 +17358,7 @@
               <w:rPr>
                 <w:sz w:val="14"/>
               </w:rPr>
-              <w:t>0.03977</w:t>
+              <w:t>0.04052</w:t>
             </w:r>
           </w:p>
         </w:tc>

</xml_diff>

<commit_message>
ASR format/citation QC: OMML equations, Table S1-S9 numbering+citations, italic/markdown fixes
12-point gate matrix: refs 17/17 verified (Crossref/OpenLibrary), display items cited in first-appearance order, 12 ASCII equations converted to native OMML, markdown residues removed, no char-grid spacing. 26/26 tests pass; renders clean. ASR_FORMAT_CITATION_QC_FINAL.zip sha256 661c4ddc.

Co-Authored-By: Tatsuki Onishi <bougtoir@gmail.com>
</commit_message>
<xml_diff>
--- a/manuscript/manuscript.docx
+++ b/manuscript/manuscript.docx
@@ -43,7 +43,16 @@
     </w:p>
     <w:p>
       <w:r>
-        <w:t>The low Earth orbit debris population continues to grow and motivates both mitigation standards and active debris removal (ADR) concepts [1,2,3]. Non-contact removal ideas — momentum transfer by lasers or ion-beam shepherd concepts — avoid grapple risks [4]. A conceptually different route is to increase the ambient drag on a target alone by locally raising thermospheric density. Geomagnetic storms demonstrate that natural density enhancements of several hundred percent at 400–500 km produce operationally significant drag [5,6,7]. The question addressed here is deliberately narrow: under what conditions could a *localized* density perturbation produce useful differential decay between a synthetic target and protected spacecraft — and where does the concept fail quantitatively? I study the boundary, not a deployment design; no operational spacecraft are targeted and no hardware is specified. The contribution is a quantitative exclusion map that separates four independent gates — drag response, exposure geometry, transport persistence, and collateral selectivity — together with the thermodynamic lower bound on the energy each would require.</w:t>
+        <w:t xml:space="preserve">The low Earth orbit debris population continues to grow and motivates both mitigation standards and active debris removal (ADR) concepts [1,2,3]. Non-contact removal ideas — momentum transfer by lasers or ion-beam shepherd concepts — avoid grapple risks [4]. A conceptually different route is to increase the ambient drag on a target alone by locally raising thermospheric density. Geomagnetic storms demonstrate that natural density enhancements of several hundred percent at 400–500 km produce operationally significant drag [5,6,7]. The question addressed here is deliberately narrow: under what conditions could a </w:t>
+      </w:r>
+      <w:r>
+        <w:rPr>
+          <w:i/>
+        </w:rPr>
+        <w:t>localized</w:t>
+      </w:r>
+      <w:r>
+        <w:t xml:space="preserve"> density perturbation produce useful differential decay between a synthetic target and protected spacecraft — and where does the concept fail quantitatively? I study the boundary, not a deployment design; no operational spacecraft are targeted and no hardware is specified. The contribution is a quantitative exclusion map that separates four independent gates — drag response, exposure geometry, transport persistence, and collateral selectivity — together with the thermodynamic lower bound on the energy each would require.</w:t>
       </w:r>
     </w:p>
     <w:p>
@@ -77,7 +86,203 @@
     </w:p>
     <w:p>
       <w:r>
-        <w:t>Two propagators are used: a DOP853 Cowell integrator with J2 and drag for validation, and a J2-secular semi-analytic integrator with orbit-averaged density for grid studies. Drag acceleration is -rho v_rel^2/(2B) along the relative wind with B = m/(C_d A) [12,13]; the semi-analytic decay rate da/dt = -(a rho v / B)(v_rel/v)^2 uses the same corotation factor v_rel/v = 1 - Omega_E a cos(i)/v as the Cowell reference, which brings the two propagators to 0.06% agreement over a ten-day drag-only decay. Baseline validation (Gate 2) required energy and angular-momentum conservation, convergence under tolerance tightening, J2 secular rates, fast-versus-Cowell decay agreement within 1%, and lifetime scaling with B [14]; all checks passed (results/tables/phase2_validation.csv). Objects that do not reach the reentry altitude inside the integration horizon are reported as right-censored lower bounds rather than known lifetimes; 21 of 396 baseline grid cells are censored in this sense and are excluded from any statistic that would treat the horizon as a measured lifetime.</w:t>
+        <w:t xml:space="preserve">Two propagators are used: a DOP853 Cowell integrator with J2 and drag for validation, and a J2-secular semi-analytic integrator with orbit-averaged density for grid studies. Drag acceleration is </w:t>
+      </w:r>
+      <m:oMath>
+        <m:f>
+          <m:num>
+            <m:r>
+              <m:t xml:space="preserve">−ρ </m:t>
+            </m:r>
+            <m:sSup>
+              <m:e>
+                <m:sSub>
+                  <m:e>
+                    <m:r>
+                      <m:t xml:space="preserve">v</m:t>
+                    </m:r>
+                  </m:e>
+                  <m:sub>
+                    <m:r>
+                      <m:t xml:space="preserve">rel</m:t>
+                    </m:r>
+                  </m:sub>
+                </m:sSub>
+              </m:e>
+              <m:sup>
+                <m:r>
+                  <m:t xml:space="preserve">2</m:t>
+                </m:r>
+              </m:sup>
+            </m:sSup>
+          </m:num>
+          <m:den>
+            <m:r>
+              <m:t xml:space="preserve">2B</m:t>
+            </m:r>
+          </m:den>
+        </m:f>
+      </m:oMath>
+      <w:r>
+        <w:t xml:space="preserve"> along the relative wind with </w:t>
+      </w:r>
+      <m:oMath>
+        <m:r>
+          <m:t xml:space="preserve">B = </m:t>
+        </m:r>
+        <m:f>
+          <m:num>
+            <m:r>
+              <m:t xml:space="preserve">m</m:t>
+            </m:r>
+          </m:num>
+          <m:den>
+            <m:sSub>
+              <m:e>
+                <m:r>
+                  <m:t xml:space="preserve">C</m:t>
+                </m:r>
+              </m:e>
+              <m:sub>
+                <m:r>
+                  <m:t xml:space="preserve">d</m:t>
+                </m:r>
+              </m:sub>
+            </m:sSub>
+            <m:r>
+              <m:t xml:space="preserve"> A</m:t>
+            </m:r>
+          </m:den>
+        </m:f>
+      </m:oMath>
+      <w:r>
+        <w:t xml:space="preserve"> [12,13]; the semi-analytic decay rate </w:t>
+      </w:r>
+      <m:oMath>
+        <m:f>
+          <m:num>
+            <m:r>
+              <m:t xml:space="preserve">da</m:t>
+            </m:r>
+          </m:num>
+          <m:den>
+            <m:r>
+              <m:t xml:space="preserve">dt</m:t>
+            </m:r>
+          </m:den>
+        </m:f>
+        <m:r>
+          <m:t xml:space="preserve"> = −</m:t>
+        </m:r>
+        <m:f>
+          <m:num>
+            <m:r>
+              <m:t xml:space="preserve">a ρ v</m:t>
+            </m:r>
+          </m:num>
+          <m:den>
+            <m:r>
+              <m:t xml:space="preserve">B</m:t>
+            </m:r>
+          </m:den>
+        </m:f>
+        <m:sSup>
+          <m:e>
+            <m:d>
+              <m:e>
+                <m:f>
+                  <m:num>
+                    <m:sSub>
+                      <m:e>
+                        <m:r>
+                          <m:t xml:space="preserve">v</m:t>
+                        </m:r>
+                      </m:e>
+                      <m:sub>
+                        <m:r>
+                          <m:t xml:space="preserve">rel</m:t>
+                        </m:r>
+                      </m:sub>
+                    </m:sSub>
+                  </m:num>
+                  <m:den>
+                    <m:r>
+                      <m:t xml:space="preserve">v</m:t>
+                    </m:r>
+                  </m:den>
+                </m:f>
+              </m:e>
+            </m:d>
+          </m:e>
+          <m:sup>
+            <m:r>
+              <m:t xml:space="preserve">2</m:t>
+            </m:r>
+          </m:sup>
+        </m:sSup>
+      </m:oMath>
+      <w:r>
+        <w:t xml:space="preserve"> uses the same corotation factor </w:t>
+      </w:r>
+      <m:oMath>
+        <m:f>
+          <m:num>
+            <m:sSub>
+              <m:e>
+                <m:r>
+                  <m:t xml:space="preserve">v</m:t>
+                </m:r>
+              </m:e>
+              <m:sub>
+                <m:r>
+                  <m:t xml:space="preserve">rel</m:t>
+                </m:r>
+              </m:sub>
+            </m:sSub>
+          </m:num>
+          <m:den>
+            <m:r>
+              <m:t xml:space="preserve">v</m:t>
+            </m:r>
+          </m:den>
+        </m:f>
+        <m:r>
+          <m:t xml:space="preserve"> = 1 − </m:t>
+        </m:r>
+        <m:f>
+          <m:num>
+            <m:sSub>
+              <m:e>
+                <m:r>
+                  <m:t xml:space="preserve">Ω</m:t>
+                </m:r>
+              </m:e>
+              <m:sub>
+                <m:r>
+                  <m:t xml:space="preserve">E</m:t>
+                </m:r>
+              </m:sub>
+            </m:sSub>
+            <m:r>
+              <m:t xml:space="preserve"> a cos</m:t>
+            </m:r>
+            <m:d>
+              <m:e>
+                <m:r>
+                  <m:t xml:space="preserve">i</m:t>
+                </m:r>
+              </m:e>
+            </m:d>
+          </m:num>
+          <m:den>
+            <m:r>
+              <m:t xml:space="preserve">v</m:t>
+            </m:r>
+          </m:den>
+        </m:f>
+      </m:oMath>
+      <w:r>
+        <w:t xml:space="preserve"> as the Cowell reference, which brings the two propagators to 0.06% agreement over a ten-day drag-only decay. Baseline validation (Gate 2) required energy and angular-momentum conservation, convergence under tolerance tightening, J2 secular rates, fast-versus-Cowell decay agreement within 1%, and lifetime scaling with B [14]; all checks passed (results/tables/phase2_validation.csv). Objects that do not reach the reentry altitude inside the integration horizon are reported as right-censored lower bounds rather than known lifetimes; 21 of 396 baseline grid cells are censored in this sense and are excluded from any statistic that would treat the horizon as a measured lifetime.</w:t>
       </w:r>
     </w:p>
     <w:p>
@@ -90,7 +295,75 @@
     </w:p>
     <w:p>
       <w:r>
-        <w:t>The intervention is an abstract fractional enhancement rho' = rho(1+delta) shaped as a Gaussian patch (horizontal sigma_h, vertical sigma_v) in the co-rotating frame, optionally diffusing (sigma_h^2 += 2 kappa t), advecting with a horizontal wind, or relaxing on a cooling timescale tau. Three fidelity levels are kept explicitly distinct. (i) A mathematical perfect-localization upper bound: a tracking perturbation whose centre coincides with the target throughout the window. This is an upper bound on what any co-location strategy could achieve; it is not hardware, not a demonstrated atmospheric process, not a feasible control mechanism, and not evidence that co-location can be achieved. (ii) A simplified transport-constrained model in which the same patch diffuses, advects and relaxes with literature-guided coefficients [15,16]. (iii) Self-consistent neutral/plasma dynamics, energy deposition and the resulting circulation response, which are outside the scope of this study and are retained as limitations rather than modelled.</w:t>
+        <w:t xml:space="preserve">The intervention is an abstract fractional enhancement </w:t>
+      </w:r>
+      <m:oMath>
+        <m:r>
+          <m:t xml:space="preserve">ρ′ = ρ</m:t>
+        </m:r>
+        <m:d>
+          <m:e>
+            <m:r>
+              <m:t xml:space="preserve">1+δ</m:t>
+            </m:r>
+          </m:e>
+        </m:d>
+      </m:oMath>
+      <w:r>
+        <w:t xml:space="preserve"> shaped as a Gaussian patch (horizontal sigma_h, vertical sigma_v) in the co-rotating frame, optionally diffusing (</w:t>
+      </w:r>
+      <m:oMath>
+        <m:sSup>
+          <m:e>
+            <m:sSub>
+              <m:e>
+                <m:r>
+                  <m:t xml:space="preserve">σ</m:t>
+                </m:r>
+              </m:e>
+              <m:sub>
+                <m:r>
+                  <m:t xml:space="preserve">h</m:t>
+                </m:r>
+              </m:sub>
+            </m:sSub>
+          </m:e>
+          <m:sup>
+            <m:r>
+              <m:t xml:space="preserve">2</m:t>
+            </m:r>
+          </m:sup>
+        </m:sSup>
+        <m:r>
+          <m:t xml:space="preserve"> ← </m:t>
+        </m:r>
+        <m:sSup>
+          <m:e>
+            <m:sSub>
+              <m:e>
+                <m:r>
+                  <m:t xml:space="preserve">σ</m:t>
+                </m:r>
+              </m:e>
+              <m:sub>
+                <m:r>
+                  <m:t xml:space="preserve">h</m:t>
+                </m:r>
+              </m:sub>
+            </m:sSub>
+          </m:e>
+          <m:sup>
+            <m:r>
+              <m:t xml:space="preserve">2</m:t>
+            </m:r>
+          </m:sup>
+        </m:sSup>
+        <m:r>
+          <m:t xml:space="preserve"> + 2κt</m:t>
+        </m:r>
+      </m:oMath>
+      <w:r>
+        <w:t>), advecting with a horizontal wind, or relaxing on a cooling timescale tau. Three fidelity levels are kept explicitly distinct. (i) A mathematical perfect-localization upper bound: a tracking perturbation whose centre coincides with the target throughout the window. This is an upper bound on what any co-location strategy could achieve; it is not hardware, not a demonstrated atmospheric process, not a feasible control mechanism, and not evidence that co-location can be achieved. (ii) A simplified transport-constrained model in which the same patch diffuses, advects and relaxes with literature-guided coefficients [15,16]. (iii) Self-consistent neutral/plasma dynamics, energy deposition and the resulting circulation response, which are outside the scope of this study and are retained as limitations rather than modelled.</w:t>
       </w:r>
     </w:p>
     <w:p>
@@ -3346,7 +3619,7 @@
     </w:p>
     <w:p>
       <w:r>
-        <w:t>A best-case-sited Earth-fixed Gaussian pulse (delta = 5, sigma_h = 200 km, 2 h) is sampled by the case-A target for 320 s — 4.4% of the window — and adds 3.98e-3 m/s, which is 3.5% of the natural drag impulse the same object receives over the same 2 h window. The limitation is exposure, not amplitude: the object crosses the patch once per revolution at ~7.7 km/s, and the mean enhancement it experiences while inside is only 0.79 against a peak of 3.15 (Table 2, Table 3).</w:t>
+        <w:t>A best-case-sited Earth-fixed Gaussian pulse (delta = 5, sigma_h = 200 km, 2 h) is sampled by the case-A target for 320 s — 4.4% of the window — and adds 3.98e-3 m/s, which is 3.5% of the natural drag impulse the same object receives over the same 2 h window. The limitation is exposure, not amplitude: the object crosses the patch once per revolution at ~7.7 km/s, and the mean enhancement it experiences while inside is only 0.79 against a peak of 3.15 (Table 2, Table 3, Table S1).</w:t>
       </w:r>
     </w:p>
     <w:p>
@@ -12199,7 +12472,16 @@
     </w:p>
     <w:p>
       <w:r>
-        <w:t>Under matched target exposure, localization changes collateral far more than benefit: a uniform delta = 5 gives the case-A target 7.97 m/s and the on-target localized patch 3.53 m/s — the same peak amplitude on the target, the difference being the co-location the localized patch loses as the induced drag drifts the target out of it, and a uniform enhancement additionally keeps acting as the orbit decays into denser air — while the uniform arm delivers 4.33e-1 m/s to the protected object and the localized arm leaves it at 4.25e-6 m/s — a Gaussian-tail value, classified as not physically meaningful, so the apparent selectivity ratio is reported as undefined rather than as five orders of magnitude of performance. The comparison reverses once the *intervention* rather than the target exposure is held fixed. The localized patch occupies a fraction 4.35e-4 of the equivalent global shell, so the same enhanced spacetime volume spread uniformly gives the target 3.06e-3 m/s and the protected object 1.87e-4 m/s, and the same lower-bound thermal energy spread uniformly gives the target 5.10e-4 m/s. Localization is therefore necessary for safety and is the only way to make a finite budget useful, but the conclusion about 'how much better' localization is depends explicitly on the matching convention, and none of these conventions is privileged (Fig. 3, Fig. 4, Table 4, Table 5).</w:t>
+        <w:t xml:space="preserve">Under matched target exposure, localization changes collateral far more than benefit: a uniform delta = 5 gives the case-A target 7.97 m/s and the on-target localized patch 3.53 m/s — the same peak amplitude on the target, the difference being the co-location the localized patch loses as the induced drag drifts the target out of it, and a uniform enhancement additionally keeps acting as the orbit decays into denser air — while the uniform arm delivers 4.33e-1 m/s to the protected object and the localized arm leaves it at 4.25e-6 m/s — a Gaussian-tail value, classified as not physically meaningful, so the apparent selectivity ratio is reported as undefined rather than as five orders of magnitude of performance. The comparison reverses once the </w:t>
+      </w:r>
+      <w:r>
+        <w:rPr>
+          <w:i/>
+        </w:rPr>
+        <w:t>intervention</w:t>
+      </w:r>
+      <w:r>
+        <w:t xml:space="preserve"> rather than the target exposure is held fixed. The localized patch occupies a fraction 4.35e-4 of the equivalent global shell, so the same enhanced spacetime volume spread uniformly gives the target 3.06e-3 m/s and the protected object 1.87e-4 m/s, and the same lower-bound thermal energy spread uniformly gives the target 5.10e-4 m/s. Localization is therefore necessary for safety and is the only way to make a finite budget useful, but the conclusion about 'how much better' localization is depends explicitly on the matching convention, and none of these conventions is privileged (Fig. 3, Fig. 4, Table 4, Table 5, Table S2).</w:t>
       </w:r>
     </w:p>
     <w:p>
@@ -16852,7 +17134,7 @@
     </w:p>
     <w:p>
       <w:r>
-        <w:t>Persistence of a localized patch was surveyed over a factorial design of horizontal scale, eddy/turbulent diffusivity and horizontal wind. Of the 27 surveyed (sigma_h, kappa, u) combinations, 11 (41%) allow a sub-1000 km patch to persist for one hour. This is a fraction of a design grid, not a probability: no probability distribution over thermospheric transport parameters is assumed, and varying the grid bounds moves the fraction between 8% and 56%. The restriction that matters is conditional rather than marginal: among combinations that are small enough to be selective (sigma_h &lt;= 200 km) and exposed to winds of 100 m/s — within the observed thermospheric range [15] — the surviving fraction is 0% in every grid variant tested. Observed traveling atmospheric disturbances propagate at 460–730 m/s [16], so a localized enhancement is expected to be transported and sheared rather than held in place (Fig. S1).</w:t>
+        <w:t>Persistence of a localized patch was surveyed over a factorial design of horizontal scale, eddy/turbulent diffusivity and horizontal wind. Of the 27 surveyed (sigma_h, kappa, u) combinations, 11 (41%) allow a sub-1000 km patch to persist for one hour. This is a fraction of a design grid, not a probability: no probability distribution over thermospheric transport parameters is assumed, and varying the grid bounds moves the fraction between 8% and 56%. The restriction that matters is conditional rather than marginal: among combinations that are small enough to be selective (sigma_h &lt;= 200 km) and exposed to winds of 100 m/s — within the observed thermospheric range [15] — the surviving fraction is 0% in every grid variant tested. Observed traveling atmospheric disturbances propagate at 460–730 m/s [16], so a localized enhancement is expected to be transported and sheared rather than held in place (Fig. S1, Tables S3 and S4).</w:t>
       </w:r>
     </w:p>
     <w:p>
@@ -16865,7 +17147,10 @@
     </w:p>
     <w:p>
       <w:r>
-        <w:t>Monte Carlo (n=256) over delta, sigmas, density and B uncertainty gives a median target delta-v of 3.52e0 m/s (IQR 2.22e0). Sobol' indices were checked over the ladder N = 32, 256, 512, 1024, 2048 base samples and are reported at N = 1024: between N = 1024 and N = 2048 no total-order index moves by more than 0.002, and 0 S1 &gt; ST ordering violations remain outside confidence intervals at the largest rung; the response is dominated by `delta_max` (ST = 0.54), with the exposure geometry parameters second. Indices are reported as computed and are never post-hoc constrained (Fig. S2, Fig. S3, Table 6). The horizontal patch scale is not inert even in the tracking bound (ST = 0.15): the patch centre follows the unperturbed ephemeris, so the along-track drift caused by the induced drag itself carries the object towards the edge of a small patch within a day. Perfect co-location therefore requires either continuous re-targeting or a patch large enough to tolerate the drift — which is the same selectivity/size conflict that transport imposes.</w:t>
+        <w:t xml:space="preserve">Monte Carlo (n=256) over delta, sigmas, density and B uncertainty gives a median target delta-v of 3.52e0 m/s (IQR 2.22e0). Sobol' indices were checked over the ladder N = 32, 256, 512, 1024, 2048 base samples and are reported at N = 1024: between N = 1024 and N = 2048 no total-order index moves by more than 0.002, and 0 S1 &gt; ST ordering violations remain outside confidence intervals at the largest rung; the response is dominated by </w:t>
+      </w:r>
+      <w:r>
+        <w:t>delta_max (ST = 0.54), with the exposure geometry parameters second. Indices are reported as computed and are never post-hoc constrained (Fig. S2, Fig. S3, Table 6, Table S5). The horizontal patch scale is not inert even in the tracking bound (ST = 0.15): the patch centre follows the unperturbed ephemeris, so the along-track drift caused by the induced drag itself carries the object towards the edge of a small patch within a day. Perfect co-location therefore requires either continuous re-targeting or a patch large enough to tolerate the drift — which is the same selectivity/size conflict that transport imposes.</w:t>
       </w:r>
     </w:p>
     <w:p>
@@ -17374,7 +17659,7 @@
     </w:p>
     <w:p>
       <w:r>
-        <w:t>All mandatory negative controls behave as required: high altitude (750 km: &lt;= 9.64e-3 m/s), high B = 200 (1.72e-1 m/s), a 60 s burst (5.37e-3 m/s) and a mis-timed pulse (0 m/s, no encounter) are all small in absolute terms. The near-identical-trajectory control produces the expected failure of selectivity: the co-orbital protected twin absorbs 4.16e-1 m/s, comparable to its target, because it shares the target's trajectory tube (Table 7, Fig. S4).</w:t>
+        <w:t>All mandatory negative controls behave as required: high altitude (750 km: &lt;= 9.64e-3 m/s), high B = 200 (1.72e-1 m/s), a 60 s burst (5.37e-3 m/s) and a mis-timed pulse (0 m/s, no encounter) are all small in absolute terms. The near-identical-trajectory control produces the expected failure of selectivity: the co-orbital protected twin absorbs 4.16e-1 m/s, comparable to its target, because it shares the target's trajectory tube (Table 7, Fig. S4, Table S6).</w:t>
       </w:r>
     </w:p>
     <w:p>
@@ -18017,7 +18302,92 @@
     </w:p>
     <w:p>
       <w:r>
-        <w:t>Simulated delta-v collapses onto Pi = 2 dv B/(rho delta v_rel^2 T) = 1.06 ± 0.26 (median 1.02, IQR 0.04) across regimes, altitudes and B, with a log-log slope of 1.02 and R^2 = 0.9984; the 7 of 480 excursions above the collapse are confined to very low ballistic coefficients where the induced drift is largest. The expected value is 1/2 from a = rho v_rel^2/(2B) and is recovered once the factor of two and the corotation correction are carried consistently; the collapse is therefore a dimensional reduction and an internal-consistency check, not independent validation, because the simulator and the predictor share the same drag equation. Its value is that it lets any other choice of delta, duration, density regime and ballistic coefficient be evaluated without rerunning the simulation (Fig. 5).</w:t>
+        <w:t xml:space="preserve">Simulated delta-v collapses onto </w:t>
+      </w:r>
+      <m:oMath>
+        <m:r>
+          <m:t xml:space="preserve">Π = </m:t>
+        </m:r>
+        <m:f>
+          <m:num>
+            <m:r>
+              <m:t xml:space="preserve">2 dv B</m:t>
+            </m:r>
+          </m:num>
+          <m:den>
+            <m:r>
+              <m:t xml:space="preserve">ρ δ </m:t>
+            </m:r>
+            <m:sSup>
+              <m:e>
+                <m:sSub>
+                  <m:e>
+                    <m:r>
+                      <m:t xml:space="preserve">v</m:t>
+                    </m:r>
+                  </m:e>
+                  <m:sub>
+                    <m:r>
+                      <m:t xml:space="preserve">rel</m:t>
+                    </m:r>
+                  </m:sub>
+                </m:sSub>
+              </m:e>
+              <m:sup>
+                <m:r>
+                  <m:t xml:space="preserve">2</m:t>
+                </m:r>
+              </m:sup>
+            </m:sSup>
+            <m:r>
+              <m:t xml:space="preserve"> T</m:t>
+            </m:r>
+          </m:den>
+        </m:f>
+      </m:oMath>
+      <w:r>
+        <w:t xml:space="preserve"> = 1.06 ± 0.26 (median 1.02, IQR 0.04) across regimes, altitudes and B, with a log-log slope of 1.02 and R^2 = 0.9984; the 7 of 480 excursions above the collapse are confined to very low ballistic coefficients where the induced drift is largest. The expected value is 1/2 from </w:t>
+      </w:r>
+      <m:oMath>
+        <m:r>
+          <m:t xml:space="preserve">a = </m:t>
+        </m:r>
+        <m:f>
+          <m:num>
+            <m:r>
+              <m:t xml:space="preserve">ρ </m:t>
+            </m:r>
+            <m:sSup>
+              <m:e>
+                <m:sSub>
+                  <m:e>
+                    <m:r>
+                      <m:t xml:space="preserve">v</m:t>
+                    </m:r>
+                  </m:e>
+                  <m:sub>
+                    <m:r>
+                      <m:t xml:space="preserve">rel</m:t>
+                    </m:r>
+                  </m:sub>
+                </m:sSub>
+              </m:e>
+              <m:sup>
+                <m:r>
+                  <m:t xml:space="preserve">2</m:t>
+                </m:r>
+              </m:sup>
+            </m:sSup>
+          </m:num>
+          <m:den>
+            <m:r>
+              <m:t xml:space="preserve">2B</m:t>
+            </m:r>
+          </m:den>
+        </m:f>
+      </m:oMath>
+      <w:r>
+        <w:t xml:space="preserve"> and is recovered once the factor of two and the corotation correction are carried consistently; the collapse is therefore a dimensional reduction and an internal-consistency check, not independent validation, because the simulator and the predictor share the same drag equation. Its value is that it lets any other choice of delta, duration, density regime and ballistic coefficient be evaluated without rerunning the simulation (Fig. 5).</w:t>
       </w:r>
     </w:p>
     <w:p>
@@ -18038,7 +18408,7 @@
     </w:p>
     <w:p>
       <w:r>
-        <w:t>Tracking outcome is nearly insensitive to window start (mean 1.06e0 m/s, std 1.40e-1), while fixed-pulse outcomes stay orders of magnitude lower at every start time, so no timing strategy rescues a fixed patch. In the design sweep, selectivity degrades to ~117 once sigma_h reaches ~400 km, where protected objects begin to share the enhanced region; at small sigma_h the protected collateral falls into the Gaussian tail and the ratio ceases to be meaningful. Collecting the gates gives the exclusion map: the concept is excluded by exposure geometry for any Earth-fixed patch, by transport for any patch small enough to be selective in realistic winds, by trajectory sharing for co-orbital and track-crossing protected objects, and by energetics at the scale required; what remains mathematically open is the narrow corner in which an enhancement is sustained on the target for a large fraction of its remaining lifetime (Fig. 6, Fig. 7).</w:t>
+        <w:t>Tracking outcome is nearly insensitive to window start (mean 1.06e0 m/s, std 1.40e-1), while fixed-pulse outcomes stay orders of magnitude lower at every start time, so no timing strategy rescues a fixed patch. In the design sweep, selectivity degrades to ~117 once sigma_h reaches ~400 km, where protected objects begin to share the enhanced region; at small sigma_h the protected collateral falls into the Gaussian tail and the ratio ceases to be meaningful. Collecting the gates gives the exclusion map: the concept is excluded by exposure geometry for any Earth-fixed patch, by transport for any patch small enough to be selective in realistic winds, by trajectory sharing for co-orbital and track-crossing protected objects, and by energetics at the scale required; what remains mathematically open is the narrow corner in which an enhancement is sustained on the target for a large fraction of its remaining lifetime (Fig. 6, Fig. 7, Tables S7–S9).</w:t>
       </w:r>
     </w:p>
     <w:p>
@@ -18114,7 +18484,87 @@
     </w:p>
     <w:p>
       <w:r>
-        <w:t>Raising density at a fixed altitude cannot be done by heating the air there — in situ heating lowers the local density — so the relevant thermodynamic accounting is the expansion of the column below. For an isothermal hydrostatic layer, scaling the column temperature and scale height by (1+eps) multiplies the density at altitude z by exp[L eps / (H (1+eps))] with L the column length, so with q = ln(1+delta) H / L the requirement is eps = q/(1-q) exactly; the commonly used first-order form eps = q understates it, and q &gt;= 1 means the density increase is unreachable by uniform heating of that column at any temperature. Raising delta = 5 at 400 km requires warming the column by a fractional 63% (691 K at the top of the column) and costs at least 5.02e12 J, i.e. ~5.80e7 W sustained over a day for a sigma_h = 200 km patch; the in-situ bound of 1.83e10 J understates this by a factor 274 at this altitude. Both are thermodynamic lower bounds, not delivered engineering energy: no deposition efficiency, coupling mechanism or loss budget is modelled, and no engineering energy requirement can be inferred robustly from them. For scale, the global upper atmosphere receives ~464 GW from solar EUV and ~95 GW from Joule dissipation on average [17]; the bound above is a small fraction of that globally but must be delivered into a single patch and sustained, which is why storms — which do deliver it — produce global, not selective, enhancements.</w:t>
+        <w:t xml:space="preserve">Raising density at a fixed altitude cannot be done by heating the air there — in situ heating lowers the local density — so the relevant thermodynamic accounting is the expansion of the column below. For an isothermal hydrostatic layer, scaling the column temperature and scale height by (1+eps) multiplies the density at altitude z by </w:t>
+      </w:r>
+      <m:oMath>
+        <m:r>
+          <m:t xml:space="preserve">exp[</m:t>
+        </m:r>
+        <m:f>
+          <m:num>
+            <m:r>
+              <m:t xml:space="preserve">L ε</m:t>
+            </m:r>
+          </m:num>
+          <m:den>
+            <m:r>
+              <m:t xml:space="preserve">H </m:t>
+            </m:r>
+            <m:d>
+              <m:e>
+                <m:r>
+                  <m:t xml:space="preserve">1+ε</m:t>
+                </m:r>
+              </m:e>
+            </m:d>
+          </m:den>
+        </m:f>
+        <m:r>
+          <m:t xml:space="preserve">]</m:t>
+        </m:r>
+      </m:oMath>
+      <w:r>
+        <w:t xml:space="preserve"> with L the column length, so with </w:t>
+      </w:r>
+      <m:oMath>
+        <m:r>
+          <m:t xml:space="preserve">q = </m:t>
+        </m:r>
+        <m:f>
+          <m:num>
+            <m:r>
+              <m:t xml:space="preserve">ln</m:t>
+            </m:r>
+            <m:d>
+              <m:e>
+                <m:r>
+                  <m:t xml:space="preserve">1+δ</m:t>
+                </m:r>
+              </m:e>
+            </m:d>
+            <m:r>
+              <m:t xml:space="preserve"> H</m:t>
+            </m:r>
+          </m:num>
+          <m:den>
+            <m:r>
+              <m:t xml:space="preserve">L</m:t>
+            </m:r>
+          </m:den>
+        </m:f>
+      </m:oMath>
+      <w:r>
+        <w:t xml:space="preserve"> the requirement is </w:t>
+      </w:r>
+      <m:oMath>
+        <m:r>
+          <m:t xml:space="preserve">ε = </m:t>
+        </m:r>
+        <m:f>
+          <m:num>
+            <m:r>
+              <m:t xml:space="preserve">q</m:t>
+            </m:r>
+          </m:num>
+          <m:den>
+            <m:r>
+              <m:t xml:space="preserve">1 − q</m:t>
+            </m:r>
+          </m:den>
+        </m:f>
+      </m:oMath>
+      <w:r>
+        <w:t xml:space="preserve"> exactly; the commonly used first-order form eps = q understates it, and q &gt;= 1 means the density increase is unreachable by uniform heating of that column at any temperature. Raising delta = 5 at 400 km requires warming the column by a fractional 63% (691 K at the top of the column) and costs at least 5.02e12 J, i.e. ~5.80e7 W sustained over a day for a sigma_h = 200 km patch; the in-situ bound of 1.83e10 J understates this by a factor 274 at this altitude. Both are thermodynamic lower bounds, not delivered engineering energy: no deposition efficiency, coupling mechanism or loss budget is modelled, and no engineering energy requirement can be inferred robustly from them. For scale, the global upper atmosphere receives ~464 GW from solar EUV and ~95 GW from Joule dissipation on average [17]; the bound above is a small fraction of that globally but must be delivered into a single patch and sustained, which is why storms — which do deliver it — produce global, not selective, enhancements.</w:t>
       </w:r>
     </w:p>
     <w:p>
@@ -22129,7 +22579,13 @@
     </w:p>
     <w:p>
       <w:r>
-        <w:t>All results regenerate from `make all` (or `make quick`) in the accompanying repository; every number in this manuscript is written from results/tables CSVs by scripts/build_manuscript.py.</w:t>
+        <w:t xml:space="preserve">All results regenerate from </w:t>
+      </w:r>
+      <w:r>
+        <w:t xml:space="preserve">make all (or </w:t>
+      </w:r>
+      <w:r>
+        <w:t>make quick) in the accompanying repository; every number in this manuscript is written from results/tables CSVs by scripts/build_manuscript.py.</w:t>
       </w:r>
     </w:p>
     <w:p>
@@ -22255,7 +22711,48 @@
     </w:p>
     <w:p>
       <w:r>
-        <w:t>Figure 5. Simulated extra delta-v against the predicted value rho*delta*v_rel^2*T/(2B); all regimes, altitudes and ballistic coefficients collapse onto the identity line.</w:t>
+        <w:t xml:space="preserve">Figure 5. Simulated extra delta-v against the predicted value </w:t>
+      </w:r>
+      <m:oMath>
+        <m:f>
+          <m:num>
+            <m:r>
+              <m:t xml:space="preserve">ρ δ </m:t>
+            </m:r>
+            <m:sSup>
+              <m:e>
+                <m:sSub>
+                  <m:e>
+                    <m:r>
+                      <m:t xml:space="preserve">v</m:t>
+                    </m:r>
+                  </m:e>
+                  <m:sub>
+                    <m:r>
+                      <m:t xml:space="preserve">rel</m:t>
+                    </m:r>
+                  </m:sub>
+                </m:sSub>
+              </m:e>
+              <m:sup>
+                <m:r>
+                  <m:t xml:space="preserve">2</m:t>
+                </m:r>
+              </m:sup>
+            </m:sSup>
+            <m:r>
+              <m:t xml:space="preserve"> T</m:t>
+            </m:r>
+          </m:num>
+          <m:den>
+            <m:r>
+              <m:t xml:space="preserve">2B</m:t>
+            </m:r>
+          </m:den>
+        </m:f>
+      </m:oMath>
+      <w:r>
+        <w:t>; all regimes, altitudes and ballistic coefficients collapse onto the identity line.</w:t>
       </w:r>
     </w:p>
     <w:p>

</xml_diff>